<commit_message>
Design v1.2: second review, v2 re-measurement, handoff prompt
- Selection option 2 only: remove in-graph re-selection (human_review), 27 state keys, 4 bounded loops
- Fairness wording: same application point (inference/serving), different system layers
- v2 retrieval eval at implementation setting (max_seq_length 2048, no truncation); all metrics labeled
  development metrics; ranking and final config unchanged (lower bound, 5 unjudged pairs in top-5)
- origin_group source independence, heuristic thresholds with +-0.5 sensitivity, agent vs node definition
- docs/HANDOFF_PROMPT.md: continuation prompt for development, report, README, reproducibility
</commit_message>
<xml_diff>
--- a/deliverables/RAG-Design_판교-9반_김정인+김지수+김진수+전진만+정원준.docx
+++ b/deliverables/RAG-Design_판교-9반_김정인+김지수+김진수+전진만+정원준.docx
@@ -925,7 +925,7 @@
                 <w:sz w:val="19"/>
                 <w:szCs w:val="19"/>
               </w:rPr>
-              <w:t xml:space="preserve">v1.1 (설계 개정)</w:t>
+              <w:t xml:space="preserve">v1.2 (설계 개정)</w:t>
             </w:r>
           </w:p>
         </w:tc>
@@ -1025,7 +1025,7 @@
           <w:b w:val="0"/>
           <w:sz w:val="20"/>
         </w:rPr>
-        <w:t xml:space="preserve"> 조가 직접 선정(2안)했다. 후보 6개를 가중 기준표로 채점한 결과 TurboQuant 4.35, ITME 4.50이었다. 두 기술은 </w:t>
+        <w:t xml:space="preserve"> 조가 직접 선정(2안)했고, 에이전트는 검증 결과만 기록한다(그래프 안에 재선정 분기 없음). 후보 6개를 가중 기준표로 채점한 결과 TurboQuant 4.35, ITME 4.50이었다. 두 기술은 </w:t>
       </w:r>
       <w:r>
         <w:rPr>
@@ -1042,7 +1042,7 @@
           <w:b w:val="0"/>
           <w:sz w:val="20"/>
         </w:rPr>
-        <w:t xml:space="preserve"> 해결하므로 공정하게 비교할 수 있다. 에이전트는 선정을 사후 검증만 한다.</w:t>
+        <w:t xml:space="preserve"> 해결하므로 공정하게 비교할 수 있다.</w:t>
       </w:r>
     </w:p>
     <w:p>
@@ -1074,7 +1074,41 @@
           <w:b w:val="0"/>
           <w:sz w:val="20"/>
         </w:rPr>
-        <w:t xml:space="preserve"> 논문 6편(136p)을 절 인식 청크 159개로 인덱싱했다. 임베딩은 한국어→영어 42문항 자체 평가로 골랐다. 사전 적합성(다국어·모델 한계 900토큰 이상·오픈소스)을 통과한 후보 중 bge-m3를 선정했다(MRR 0.703, min(SW, HW) 0.659). 최종 검색 구성은 3중 RRF + reranker이며 Hit@5 0.976, MRR 0.863이다.</w:t>
+        <w:t xml:space="preserve"> 논문 6편(136p)을 절 인식 청크 159개로 인덱싱했다. 임베딩은 한국어→영어 42문항 자체 평가로 골랐다. 사전 적합성(다국어·모델 한계 900토큰 이상·오픈소스)을 통과한 후보 중 bge-m3를 선정했다(MRR 0.703, min(SW, HW) 0.659). 최종 검색 구성(3중 RRF + reranker)은 구현 조건(</w:t>
+      </w:r>
+      <w:r>
+        <w:rPr>
+          <w:rFonts w:ascii="D2Coding" w:hAnsi="D2Coding" w:eastAsia="맑은 고딕" w:cs="D2Coding"/>
+          <w:b w:val="0"/>
+          <w:color w:val="5B3FA0"/>
+          <w:sz w:val="19"/>
+        </w:rPr>
+        <w:t>max_seq_length</w:t>
+      </w:r>
+      <w:r>
+        <w:rPr>
+          <w:rFonts w:ascii="맑은 고딕" w:hAnsi="맑은 고딕" w:eastAsia="맑은 고딕" w:cs="맑은 고딕"/>
+          <w:b w:val="0"/>
+          <w:sz w:val="20"/>
+        </w:rPr>
+        <w:t xml:space="preserve"> 2,048)으로 다시 측정해 Hit@5 0.976, MRR 0.863이다. 모두 구성 선택에 쓴 42문항 기준의 </w:t>
+      </w:r>
+      <w:r>
+        <w:rPr>
+          <w:rFonts w:ascii="맑은 고딕" w:hAnsi="맑은 고딕" w:eastAsia="맑은 고딕" w:cs="맑은 고딕"/>
+          <w:b/>
+          <w:color w:val="161A58"/>
+          <w:sz w:val="20"/>
+        </w:rPr>
+        <w:t>개발 지표</w:t>
+      </w:r>
+      <w:r>
+        <w:rPr>
+          <w:rFonts w:ascii="맑은 고딕" w:hAnsi="맑은 고딕" w:eastAsia="맑은 고딕" w:cs="맑은 고딕"/>
+          <w:b w:val="0"/>
+          <w:sz w:val="20"/>
+        </w:rPr>
+        <w:t>이다.</w:t>
       </w:r>
     </w:p>
     <w:p>
@@ -1106,7 +1140,7 @@
           <w:b w:val="0"/>
           <w:sz w:val="20"/>
         </w:rPr>
-        <w:t xml:space="preserve"> 에이전트 7개(Notion 6개 + Judge), State 키 29개로 구성한다. 선정·공통 검색·관점 내부·관점 재실행·보고서 검수의 5개 루프에 모두 횟수 한도가 있다. Judge가 미달로 판정한 관점만 </w:t>
+        <w:t xml:space="preserve"> 에이전트 7개(Notion 6개 + Judge), State 키 27개로 구성한다. 공통 검색·관점 내부·관점 재실행·보고서 검수의 4개 루프에 모두 횟수 한도가 있다. Judge가 미달로 판정한 관점만 </w:t>
       </w:r>
       <w:r>
         <w:rPr>
@@ -1172,7 +1206,7 @@
           <w:b w:val="0"/>
           <w:sz w:val="20"/>
         </w:rPr>
-        <w:t xml:space="preserve"> 찬반 양면 검색(기술 고유 근거만 할당량으로 인정), 벤더 출처군 50% 상한, 인용 필수, 우열 어휘 검사, 상위 모델 Judge를 적용한다.</w:t>
+        <w:t xml:space="preserve"> 찬반 양면 검색(기술 고유 근거만 할당량으로 인정), 원 출처 계열 기준 50% 상한, 인용 필수, 우열 어휘 검사, 상위 모델 Judge를 적용한다.</w:t>
       </w:r>
     </w:p>
     <w:p>
@@ -1204,7 +1238,7 @@
           <w:b w:val="0"/>
           <w:sz w:val="20"/>
         </w:rPr>
-        <w:t xml:space="preserve"> 평가셋의 개발/테스트 미분리(42문항, 1문항 = 2.4%p), 평가 시 일부 청크 잘림(bge-m3 17/159), 같은 계열 Judge, ITME 공개 후 약 3개월, 평가 주체(SK 교육과정)의 소속 편향 가능성.</w:t>
+        <w:t xml:space="preserve"> 평가셋의 개발/테스트 미분리(42문항, 1문항 = 2.4%p), 같은 계열 Judge, ITME 공개 후 약 3개월, 평가 주체(SK 교육과정)의 소속 편향 가능성.</w:t>
       </w:r>
     </w:p>
     <w:p>
@@ -2304,7 +2338,7 @@
                 <w:b w:val="0"/>
                 <w:sz w:val="17"/>
               </w:rPr>
-              <w:t xml:space="preserve">두 기술 모두 모델 학습 이후의 </w:t>
+              <w:t xml:space="preserve">두 기술 모두 모델 학습 이후 </w:t>
             </w:r>
             <w:r>
               <w:rPr>
@@ -2313,15 +2347,15 @@
                 <w:color w:val="161A58"/>
                 <w:sz w:val="17"/>
               </w:rPr>
-              <w:t>추론·서빙 단계</w:t>
-            </w:r>
-            <w:r>
-              <w:rPr>
-                <w:rFonts w:ascii="맑은 고딕" w:hAnsi="맑은 고딕" w:eastAsia="맑은 고딕" w:cs="맑은 고딕"/>
-                <w:b w:val="0"/>
-                <w:sz w:val="17"/>
-              </w:rPr>
-              <w:t>에서 KV cache 병목을 직접 다루는가? (같은 적용 계층)</w:t>
+              <w:t>동일한 적용 시점(추론·서빙 단계)</w:t>
+            </w:r>
+            <w:r>
+              <w:rPr>
+                <w:rFonts w:ascii="맑은 고딕" w:hAnsi="맑은 고딕" w:eastAsia="맑은 고딕" w:cs="맑은 고딕"/>
+                <w:b w:val="0"/>
+                <w:sz w:val="17"/>
+              </w:rPr>
+              <w:t>에서 KV cache 용량 병목을 직접 다루는가?</w:t>
             </w:r>
           </w:p>
         </w:tc>
@@ -6368,7 +6402,7 @@
           <w:b w:val="0"/>
           <w:sz w:val="20"/>
         </w:rPr>
-        <w:t xml:space="preserve">가 원문을 근거로 세 가지를 다시 검증한다. ① 같은 문제를 다루는가 ② 적용 계층을 비교할 수 있는가 ③ 공개 근거가 충분한가. 하나라도 미충족이면 사유와 대체 후보를 </w:t>
+        <w:t xml:space="preserve">가 원문을 근거로 세 가지를 다시 검증한다. ① 같은 문제를 다루는가 ② 적용 시점이 같은가 ③ 공개 근거가 충분한가. 하나라도 미충족이면 사유와 대체 후보를 </w:t>
       </w:r>
       <w:r>
         <w:rPr>
@@ -6385,7 +6419,7 @@
           <w:b w:val="0"/>
           <w:sz w:val="20"/>
         </w:rPr>
-        <w:t xml:space="preserve">에 기록한다. </w:t>
+        <w:t xml:space="preserve">과 </w:t>
       </w:r>
       <w:r>
         <w:rPr>
@@ -6394,15 +6428,32 @@
           <w:color w:val="5B3FA0"/>
           <w:sz w:val="19"/>
         </w:rPr>
-        <w:t>--interactive</w:t>
-      </w:r>
-      <w:r>
-        <w:rPr>
-          <w:rFonts w:ascii="맑은 고딕" w:hAnsi="맑은 고딕" w:eastAsia="맑은 고딕" w:cs="맑은 고딕"/>
-          <w:b w:val="0"/>
-          <w:sz w:val="20"/>
-        </w:rPr>
-        <w:t xml:space="preserve"> 모드에서는 사람의 확인을 받는다(최대 1회). 기본 실행에서는 기존 선정을 유지하고, 검증 결과(통과 여부·약점·대체 후보)를 보고서 2.4절에 그대로 싣는다.</w:t>
+        <w:t>warnings</w:t>
+      </w:r>
+      <w:r>
+        <w:rPr>
+          <w:rFonts w:ascii="맑은 고딕" w:hAnsi="맑은 고딕" w:eastAsia="맑은 고딕" w:cs="맑은 고딕"/>
+          <w:b w:val="0"/>
+          <w:sz w:val="20"/>
+        </w:rPr>
+        <w:t xml:space="preserve">에 기록하고 실행은 계속한다. 2안(Human 선정)이므로 그래프 안에서 기술을 바꾸지 않는다. 선정을 바꿀지는 팀이 실행 밖에서 결정하고 </w:t>
+      </w:r>
+      <w:r>
+        <w:rPr>
+          <w:rFonts w:ascii="D2Coding" w:hAnsi="D2Coding" w:eastAsia="맑은 고딕" w:cs="D2Coding"/>
+          <w:b w:val="0"/>
+          <w:color w:val="5B3FA0"/>
+          <w:sz w:val="19"/>
+        </w:rPr>
+        <w:t>--tech</w:t>
+      </w:r>
+      <w:r>
+        <w:rPr>
+          <w:rFonts w:ascii="맑은 고딕" w:hAnsi="맑은 고딕" w:eastAsia="맑은 고딕" w:cs="맑은 고딕"/>
+          <w:b w:val="0"/>
+          <w:sz w:val="20"/>
+        </w:rPr>
+        <w:t>로 다시 실행한다. 검증 결과(통과 여부·약점·대체 후보)는 보고서 2.4절에 그대로 싣는다.</w:t>
       </w:r>
     </w:p>
     <w:p>
@@ -6523,6 +6574,14 @@
           <w:sz w:val="20"/>
         </w:rPr>
         <w:t>다시 고르지 않고 검증만 한다.</w:t>
+      </w:r>
+      <w:r>
+        <w:rPr>
+          <w:rFonts w:ascii="맑은 고딕" w:hAnsi="맑은 고딕" w:eastAsia="맑은 고딕" w:cs="맑은 고딕"/>
+          <w:b w:val="0"/>
+          <w:sz w:val="20"/>
+        </w:rPr>
+        <w:t xml:space="preserve"> 그래서 그래프에는 1안(에이전트 선정)이나 재선정 분기를 두지 않는다.</w:t>
       </w:r>
     </w:p>
     <w:p>
@@ -11357,6 +11416,51 @@
     </w:p>
     <w:p>
       <w:pPr>
+        <w:spacing w:after="80" w:line="324" w:lineRule="auto"/>
+        <w:ind w:left="113"/>
+        <w:pBdr>
+          <w:left w:val="single" w:sz="18" w:space="6" w:color="7F4ACB"/>
+        </w:pBdr>
+      </w:pPr>
+      <w:r>
+        <w:rPr>
+          <w:rFonts w:ascii="맑은 고딕" w:hAnsi="맑은 고딕" w:eastAsia="맑은 고딕" w:cs="맑은 고딕"/>
+          <w:b/>
+          <w:color w:val="555A6E"/>
+          <w:sz w:val="18"/>
+        </w:rPr>
+        <w:t>수치의 성격:</w:t>
+      </w:r>
+      <w:r>
+        <w:rPr>
+          <w:rFonts w:ascii="맑은 고딕" w:hAnsi="맑은 고딕" w:eastAsia="맑은 고딕" w:cs="맑은 고딕"/>
+          <w:b w:val="0"/>
+          <w:color w:val="555A6E"/>
+          <w:sz w:val="18"/>
+        </w:rPr>
+        <w:t xml:space="preserve"> 아래의 모든 Hit@K와 MRR은 모델·프롬프트·검색 구성을 고르는 데 쓴 </w:t>
+      </w:r>
+      <w:r>
+        <w:rPr>
+          <w:rFonts w:ascii="맑은 고딕" w:hAnsi="맑은 고딕" w:eastAsia="맑은 고딕" w:cs="맑은 고딕"/>
+          <w:b/>
+          <w:color w:val="555A6E"/>
+          <w:sz w:val="18"/>
+        </w:rPr>
+        <w:t>같은 42문항(구성 선택용 셋)으로 잰 개발 지표(development metric)</w:t>
+      </w:r>
+      <w:r>
+        <w:rPr>
+          <w:rFonts w:ascii="맑은 고딕" w:hAnsi="맑은 고딕" w:eastAsia="맑은 고딕" w:cs="맑은 고딕"/>
+          <w:b w:val="0"/>
+          <w:color w:val="555A6E"/>
+          <w:sz w:val="18"/>
+        </w:rPr>
+        <w:t>이다. 독립 테스트셋 성능이 아니다.</w:t>
+      </w:r>
+    </w:p>
+    <w:p>
+      <w:pPr>
         <w:keepNext/>
         <w:spacing w:after="80" w:line="324" w:lineRule="auto"/>
       </w:pPr>
@@ -11367,7 +11471,7 @@
           <w:color w:val="161A58"/>
           <w:sz w:val="20"/>
         </w:rPr>
-        <w:t>② 과제 전용 실험. 결과 1: 임베딩 후보 (dense only, 한국어 질의)</w:t>
+        <w:t>② 과제 전용 실험. 결과 1: 임베딩 후보 (dense only, 한국어 질의, v1 측정: `max_seq_length` 1,024)</w:t>
       </w:r>
     </w:p>
     <w:tbl>
@@ -12584,7 +12688,7 @@
           <w:color w:val="161A58"/>
           <w:sz w:val="20"/>
         </w:rPr>
-        <w:t>결과 2: 검색 구성 (bge-m3 기준, 같은 평가셋)</w:t>
+        <w:t>결과 2: 검색 구성 (bge-m3 기준, 같은 평가셋, v1 측정)</w:t>
       </w:r>
     </w:p>
     <w:tbl>
@@ -13149,7 +13253,7 @@
                 <w:b w:val="0"/>
                 <w:sz w:val="17"/>
               </w:rPr>
-              <w:t>하이브리드 RRF: Dense(KO) + BM25(EN)</w:t>
+              <w:t>2중 하이브리드 RRF: Dense(KO) + BM25(EN)</w:t>
             </w:r>
           </w:p>
         </w:tc>
@@ -13396,11 +13500,136 @@
             <w:r>
               <w:rPr>
                 <w:rFonts w:ascii="맑은 고딕" w:hAnsi="맑은 고딕" w:eastAsia="맑은 고딕" w:cs="맑은 고딕"/>
+                <w:b w:val="0"/>
+                <w:sz w:val="17"/>
+              </w:rPr>
+              <w:t>2중 하이브리드 RRF + reranker (참고)</w:t>
+            </w:r>
+          </w:p>
+        </w:tc>
+        <w:tc>
+          <w:tcPr>
+            <w:tcW w:type="dxa" w:w="1077"/>
+            <w:tcMar>
+              <w:top w:w="70" w:type="dxa"/>
+              <w:left w:w="90" w:type="dxa"/>
+              <w:bottom w:w="70" w:type="dxa"/>
+              <w:right w:w="90" w:type="dxa"/>
+            </w:tcMar>
+          </w:tcPr>
+          <w:p>
+            <w:pPr>
+              <w:spacing w:after="0" w:line="276" w:lineRule="auto"/>
+            </w:pPr>
+            <w:r>
+              <w:rPr>
+                <w:rFonts w:ascii="맑은 고딕" w:hAnsi="맑은 고딕" w:eastAsia="맑은 고딕" w:cs="맑은 고딕"/>
+                <w:b w:val="0"/>
+                <w:sz w:val="17"/>
+              </w:rPr>
+              <w:t>0.786</w:t>
+            </w:r>
+          </w:p>
+        </w:tc>
+        <w:tc>
+          <w:tcPr>
+            <w:tcW w:type="dxa" w:w="1077"/>
+            <w:tcMar>
+              <w:top w:w="70" w:type="dxa"/>
+              <w:left w:w="90" w:type="dxa"/>
+              <w:bottom w:w="70" w:type="dxa"/>
+              <w:right w:w="90" w:type="dxa"/>
+            </w:tcMar>
+          </w:tcPr>
+          <w:p>
+            <w:pPr>
+              <w:spacing w:after="0" w:line="276" w:lineRule="auto"/>
+            </w:pPr>
+            <w:r>
+              <w:rPr>
+                <w:rFonts w:ascii="맑은 고딕" w:hAnsi="맑은 고딕" w:eastAsia="맑은 고딕" w:cs="맑은 고딕"/>
+                <w:b w:val="0"/>
+                <w:sz w:val="17"/>
+              </w:rPr>
+              <w:t>0.952</w:t>
+            </w:r>
+          </w:p>
+        </w:tc>
+        <w:tc>
+          <w:tcPr>
+            <w:tcW w:type="dxa" w:w="1077"/>
+            <w:tcMar>
+              <w:top w:w="70" w:type="dxa"/>
+              <w:left w:w="90" w:type="dxa"/>
+              <w:bottom w:w="70" w:type="dxa"/>
+              <w:right w:w="90" w:type="dxa"/>
+            </w:tcMar>
+          </w:tcPr>
+          <w:p>
+            <w:pPr>
+              <w:spacing w:after="0" w:line="276" w:lineRule="auto"/>
+            </w:pPr>
+            <w:r>
+              <w:rPr>
+                <w:rFonts w:ascii="맑은 고딕" w:hAnsi="맑은 고딕" w:eastAsia="맑은 고딕" w:cs="맑은 고딕"/>
+                <w:b w:val="0"/>
+                <w:sz w:val="17"/>
+              </w:rPr>
+              <w:t>0.976</w:t>
+            </w:r>
+          </w:p>
+        </w:tc>
+        <w:tc>
+          <w:tcPr>
+            <w:tcW w:type="dxa" w:w="1077"/>
+            <w:tcMar>
+              <w:top w:w="70" w:type="dxa"/>
+              <w:left w:w="90" w:type="dxa"/>
+              <w:bottom w:w="70" w:type="dxa"/>
+              <w:right w:w="90" w:type="dxa"/>
+            </w:tcMar>
+          </w:tcPr>
+          <w:p>
+            <w:pPr>
+              <w:spacing w:after="0" w:line="276" w:lineRule="auto"/>
+            </w:pPr>
+            <w:r>
+              <w:rPr>
+                <w:rFonts w:ascii="맑은 고딕" w:hAnsi="맑은 고딕" w:eastAsia="맑은 고딕" w:cs="맑은 고딕"/>
+                <w:b w:val="0"/>
+                <w:sz w:val="17"/>
+              </w:rPr>
+              <w:t>0.863</w:t>
+            </w:r>
+          </w:p>
+        </w:tc>
+      </w:tr>
+      <w:tr>
+        <w:trPr>
+          <w:cantSplit/>
+        </w:trPr>
+        <w:tc>
+          <w:tcPr>
+            <w:tcW w:type="dxa" w:w="4762"/>
+            <w:tcMar>
+              <w:top w:w="70" w:type="dxa"/>
+              <w:left w:w="90" w:type="dxa"/>
+              <w:bottom w:w="70" w:type="dxa"/>
+              <w:right w:w="90" w:type="dxa"/>
+            </w:tcMar>
+          </w:tcPr>
+          <w:p>
+            <w:pPr>
+              <w:spacing w:after="0" w:line="276" w:lineRule="auto"/>
+            </w:pPr>
+            <w:r>
+              <w:rPr>
+                <w:rFonts w:ascii="맑은 고딕" w:hAnsi="맑은 고딕" w:eastAsia="맑은 고딕" w:cs="맑은 고딕"/>
                 <w:b/>
                 <w:color w:val="161A58"/>
                 <w:sz w:val="17"/>
               </w:rPr>
-              <w:t>3중 하이브리드 RRF + reranker (bge-reranker-v2-m3) ← 채택</w:t>
+              <w:t>3중 하이브리드 RRF + reranker ← 채택(v1에서 고정)</w:t>
             </w:r>
           </w:p>
         </w:tc>
@@ -14700,7 +14929,7 @@
           <w:color w:val="555A6E"/>
           <w:sz w:val="18"/>
         </w:rPr>
-        <w:t xml:space="preserve">은 bge-m3 0.659, Qwen3 0.493이었다. Qwen3는 SW 질문 MRR이 조금 더 높았지만(0.770 vs 0.748) HW 질문에서 0.493으로 크게 떨어졌다. ②의 확인 결과로, bge-m3는 전체 Hit@1·3·5와 MRR이 모두 가장 높았다. 설계 초안에서는 Qwen3-Embedding-0.6B를 가정했지만, 측정 결과 교차언어 정확도가 낮아 </w:t>
+        <w:t xml:space="preserve">은 bge-m3 0.659, Qwen3 0.493이었다. Qwen3는 SW 질문 MRR이 조금 더 높았지만(0.770 vs 0.748) HW 질문에서 0.493으로 크게 떨어졌다. ②의 확인 결과로, bge-m3는 전체 Hit@1·3·5와 MRR이 모두 가장 높았다. 구현 조건(2,048)으로 다시 측정해도 순위와 채택 구성의 수치는 같았다(④). 설계 초안에서는 Qwen3-Embedding-0.6B를 가정했지만, 측정 결과 교차언어 정확도가 낮아 </w:t>
       </w:r>
       <w:r>
         <w:rPr>
@@ -14718,7 +14947,7 @@
           <w:color w:val="555A6E"/>
           <w:sz w:val="18"/>
         </w:rPr>
-        <w:t xml:space="preserve"> reranker는 질의당 약 4.7초가 더 들지만, 보고서 생성은 대화형이 아닌 배치 작업이므로 비용 대비 정확도 개선(MRR +0.073)이 크다고 판단해 채택했다. 시간이 부족할 때는 </w:t>
+        <w:t xml:space="preserve"> reranker는 질의당 약 4.5초가 더 들지만, 보고서 생성은 대화형이 아닌 배치 작업이므로 비용 대비 정확도 개선(MRR +0.073)이 크다고 판단해 채택했다. 시간이 부족할 때는 </w:t>
       </w:r>
       <w:r>
         <w:rPr>
@@ -14751,6 +14980,1951 @@
           <w:color w:val="161A58"/>
           <w:sz w:val="20"/>
         </w:rPr>
+        <w:t>④ 구현 조건 재측정 (v2: `max_seq_length` 2,048, 잘린 청크 0건)</w:t>
+      </w:r>
+    </w:p>
+    <w:p>
+      <w:pPr>
+        <w:spacing w:after="80" w:line="324" w:lineRule="auto"/>
+      </w:pPr>
+      <w:r>
+        <w:rPr>
+          <w:rFonts w:ascii="맑은 고딕" w:hAnsi="맑은 고딕" w:eastAsia="맑은 고딕" w:cs="맑은 고딕"/>
+          <w:b w:val="0"/>
+          <w:sz w:val="20"/>
+        </w:rPr>
+        <w:t xml:space="preserve">v1 수치는 바꾸지 않고, 구현 설정으로 같은 42문항을 다시 측정했다. bge-m3·Qwen3는 2,048로, e5·MiniLM은 모델 한계 그대로 두었다. 새 순위에서 판정 이력이 없는 (질문, 청크) 쌍은 오답으로 처리했으므로 아래 값은 </w:t>
+      </w:r>
+      <w:r>
+        <w:rPr>
+          <w:rFonts w:ascii="맑은 고딕" w:hAnsi="맑은 고딕" w:eastAsia="맑은 고딕" w:cs="맑은 고딕"/>
+          <w:b/>
+          <w:color w:val="161A58"/>
+          <w:sz w:val="20"/>
+        </w:rPr>
+        <w:t>하한값</w:t>
+      </w:r>
+      <w:r>
+        <w:rPr>
+          <w:rFonts w:ascii="맑은 고딕" w:hAnsi="맑은 고딕" w:eastAsia="맑은 고딕" w:cs="맑은 고딕"/>
+          <w:b w:val="0"/>
+          <w:sz w:val="20"/>
+        </w:rPr>
+        <w:t>이다. 보고 지표 top-5 안에 판정 이력이 없는 쌍은 dense bge-m3에서 0건, 채택 구성에서 5건이다(</w:t>
+      </w:r>
+      <w:r>
+        <w:rPr>
+          <w:rFonts w:ascii="D2Coding" w:hAnsi="D2Coding" w:eastAsia="맑은 고딕" w:cs="D2Coding"/>
+          <w:b w:val="0"/>
+          <w:color w:val="5B3FA0"/>
+          <w:sz w:val="19"/>
+        </w:rPr>
+        <w:t>outputs/eval/v2_maxlen2048/</w:t>
+      </w:r>
+      <w:r>
+        <w:rPr>
+          <w:rFonts w:ascii="맑은 고딕" w:hAnsi="맑은 고딕" w:eastAsia="맑은 고딕" w:cs="맑은 고딕"/>
+          <w:b w:val="0"/>
+          <w:sz w:val="20"/>
+        </w:rPr>
+        <w:t>).</w:t>
+      </w:r>
+    </w:p>
+    <w:tbl>
+      <w:tblPr>
+        <w:jc w:val="center"/>
+        <w:tblLook w:firstColumn="1" w:firstRow="1" w:lastColumn="0" w:lastRow="0" w:noHBand="0" w:noVBand="1" w:val="04A0"/>
+        <w:tblBorders>
+          <w:top w:val="single" w:color="161A58" w:sz="8"/>
+          <w:left w:val="none" w:color="FFFFFF" w:sz="0"/>
+          <w:bottom w:val="single" w:color="161A58" w:sz="8"/>
+          <w:right w:val="none" w:color="FFFFFF" w:sz="0"/>
+          <w:insideH w:val="single" w:color="D8DAE5" w:sz="2"/>
+          <w:insideV w:val="single" w:color="D8DAE5" w:sz="2"/>
+        </w:tblBorders>
+        <w:tblW w:w="9072" w:type="dxa"/>
+        <w:tblLayout w:type="fixed"/>
+      </w:tblPr>
+      <w:tblGrid>
+        <w:gridCol w:w="2608"/>
+        <w:gridCol w:w="850"/>
+        <w:gridCol w:w="850"/>
+        <w:gridCol w:w="1701"/>
+        <w:gridCol w:w="1757"/>
+        <w:gridCol w:w="1304"/>
+      </w:tblGrid>
+      <w:tr>
+        <w:trPr>
+          <w:cantSplit/>
+          <w:tblHeader w:val="true"/>
+        </w:trPr>
+        <w:tc>
+          <w:tcPr>
+            <w:tcW w:type="dxa" w:w="2608"/>
+            <w:tcMar>
+              <w:top w:w="70" w:type="dxa"/>
+              <w:left w:w="90" w:type="dxa"/>
+              <w:bottom w:w="70" w:type="dxa"/>
+              <w:right w:w="90" w:type="dxa"/>
+            </w:tcMar>
+            <w:shd w:val="clear" w:color="auto" w:fill="F2F3F8"/>
+          </w:tcPr>
+          <w:p>
+            <w:pPr>
+              <w:spacing w:after="0" w:line="276" w:lineRule="auto"/>
+              <w:jc w:val="center"/>
+            </w:pPr>
+            <w:r>
+              <w:rPr>
+                <w:rFonts w:ascii="맑은 고딕" w:hAnsi="맑은 고딕" w:eastAsia="맑은 고딕" w:cs="맑은 고딕"/>
+                <w:b/>
+                <w:color w:val="161A58"/>
+                <w:sz w:val="17"/>
+              </w:rPr>
+              <w:t>모델 (평가 설정 길이)</w:t>
+            </w:r>
+          </w:p>
+        </w:tc>
+        <w:tc>
+          <w:tcPr>
+            <w:tcW w:type="dxa" w:w="850"/>
+            <w:tcMar>
+              <w:top w:w="70" w:type="dxa"/>
+              <w:left w:w="90" w:type="dxa"/>
+              <w:bottom w:w="70" w:type="dxa"/>
+              <w:right w:w="90" w:type="dxa"/>
+            </w:tcMar>
+            <w:shd w:val="clear" w:color="auto" w:fill="F2F3F8"/>
+          </w:tcPr>
+          <w:p>
+            <w:pPr>
+              <w:spacing w:after="0" w:line="276" w:lineRule="auto"/>
+              <w:jc w:val="center"/>
+            </w:pPr>
+            <w:r>
+              <w:rPr>
+                <w:rFonts w:ascii="맑은 고딕" w:hAnsi="맑은 고딕" w:eastAsia="맑은 고딕" w:cs="맑은 고딕"/>
+                <w:b/>
+                <w:color w:val="161A58"/>
+                <w:sz w:val="17"/>
+              </w:rPr>
+              <w:t>Hit@1</w:t>
+            </w:r>
+          </w:p>
+        </w:tc>
+        <w:tc>
+          <w:tcPr>
+            <w:tcW w:type="dxa" w:w="850"/>
+            <w:tcMar>
+              <w:top w:w="70" w:type="dxa"/>
+              <w:left w:w="90" w:type="dxa"/>
+              <w:bottom w:w="70" w:type="dxa"/>
+              <w:right w:w="90" w:type="dxa"/>
+            </w:tcMar>
+            <w:shd w:val="clear" w:color="auto" w:fill="F2F3F8"/>
+          </w:tcPr>
+          <w:p>
+            <w:pPr>
+              <w:spacing w:after="0" w:line="276" w:lineRule="auto"/>
+              <w:jc w:val="center"/>
+            </w:pPr>
+            <w:r>
+              <w:rPr>
+                <w:rFonts w:ascii="맑은 고딕" w:hAnsi="맑은 고딕" w:eastAsia="맑은 고딕" w:cs="맑은 고딕"/>
+                <w:b/>
+                <w:color w:val="161A58"/>
+                <w:sz w:val="17"/>
+              </w:rPr>
+              <w:t>Hit@5</w:t>
+            </w:r>
+          </w:p>
+        </w:tc>
+        <w:tc>
+          <w:tcPr>
+            <w:tcW w:type="dxa" w:w="1701"/>
+            <w:tcMar>
+              <w:top w:w="70" w:type="dxa"/>
+              <w:left w:w="90" w:type="dxa"/>
+              <w:bottom w:w="70" w:type="dxa"/>
+              <w:right w:w="90" w:type="dxa"/>
+            </w:tcMar>
+            <w:shd w:val="clear" w:color="auto" w:fill="F2F3F8"/>
+          </w:tcPr>
+          <w:p>
+            <w:pPr>
+              <w:spacing w:after="0" w:line="276" w:lineRule="auto"/>
+              <w:jc w:val="center"/>
+            </w:pPr>
+            <w:r>
+              <w:rPr>
+                <w:rFonts w:ascii="맑은 고딕" w:hAnsi="맑은 고딕" w:eastAsia="맑은 고딕" w:cs="맑은 고딕"/>
+                <w:b/>
+                <w:color w:val="161A58"/>
+                <w:sz w:val="17"/>
+              </w:rPr>
+              <w:t>MRR@10 (v1 → v2)</w:t>
+            </w:r>
+          </w:p>
+        </w:tc>
+        <w:tc>
+          <w:tcPr>
+            <w:tcW w:type="dxa" w:w="1757"/>
+            <w:tcMar>
+              <w:top w:w="70" w:type="dxa"/>
+              <w:left w:w="90" w:type="dxa"/>
+              <w:bottom w:w="70" w:type="dxa"/>
+              <w:right w:w="90" w:type="dxa"/>
+            </w:tcMar>
+            <w:shd w:val="clear" w:color="auto" w:fill="F2F3F8"/>
+          </w:tcPr>
+          <w:p>
+            <w:pPr>
+              <w:spacing w:after="0" w:line="276" w:lineRule="auto"/>
+              <w:jc w:val="center"/>
+            </w:pPr>
+            <w:r>
+              <w:rPr>
+                <w:rFonts w:ascii="맑은 고딕" w:hAnsi="맑은 고딕" w:eastAsia="맑은 고딕" w:cs="맑은 고딕"/>
+                <w:b/>
+                <w:color w:val="161A58"/>
+                <w:sz w:val="17"/>
+              </w:rPr>
+              <w:t>SW / HW MRR</w:t>
+            </w:r>
+          </w:p>
+        </w:tc>
+        <w:tc>
+          <w:tcPr>
+            <w:tcW w:type="dxa" w:w="1304"/>
+            <w:tcMar>
+              <w:top w:w="70" w:type="dxa"/>
+              <w:left w:w="90" w:type="dxa"/>
+              <w:bottom w:w="70" w:type="dxa"/>
+              <w:right w:w="90" w:type="dxa"/>
+            </w:tcMar>
+            <w:shd w:val="clear" w:color="auto" w:fill="F2F3F8"/>
+          </w:tcPr>
+          <w:p>
+            <w:pPr>
+              <w:spacing w:after="0" w:line="276" w:lineRule="auto"/>
+              <w:jc w:val="center"/>
+            </w:pPr>
+            <w:r>
+              <w:rPr>
+                <w:rFonts w:ascii="맑은 고딕" w:hAnsi="맑은 고딕" w:eastAsia="맑은 고딕" w:cs="맑은 고딕"/>
+                <w:b/>
+                <w:color w:val="161A58"/>
+                <w:sz w:val="17"/>
+              </w:rPr>
+              <w:t>min(SW, HW)</w:t>
+            </w:r>
+          </w:p>
+        </w:tc>
+      </w:tr>
+      <w:tr>
+        <w:trPr>
+          <w:cantSplit/>
+        </w:trPr>
+        <w:tc>
+          <w:tcPr>
+            <w:tcW w:type="dxa" w:w="2608"/>
+            <w:tcMar>
+              <w:top w:w="70" w:type="dxa"/>
+              <w:left w:w="90" w:type="dxa"/>
+              <w:bottom w:w="70" w:type="dxa"/>
+              <w:right w:w="90" w:type="dxa"/>
+            </w:tcMar>
+          </w:tcPr>
+          <w:p>
+            <w:pPr>
+              <w:spacing w:after="0" w:line="276" w:lineRule="auto"/>
+            </w:pPr>
+            <w:r>
+              <w:rPr>
+                <w:rFonts w:ascii="맑은 고딕" w:hAnsi="맑은 고딕" w:eastAsia="맑은 고딕" w:cs="맑은 고딕"/>
+                <w:b w:val="0"/>
+                <w:sz w:val="17"/>
+              </w:rPr>
+              <w:t>bge-m3 (2,048)</w:t>
+            </w:r>
+          </w:p>
+        </w:tc>
+        <w:tc>
+          <w:tcPr>
+            <w:tcW w:type="dxa" w:w="850"/>
+            <w:tcMar>
+              <w:top w:w="70" w:type="dxa"/>
+              <w:left w:w="90" w:type="dxa"/>
+              <w:bottom w:w="70" w:type="dxa"/>
+              <w:right w:w="90" w:type="dxa"/>
+            </w:tcMar>
+          </w:tcPr>
+          <w:p>
+            <w:pPr>
+              <w:spacing w:after="0" w:line="276" w:lineRule="auto"/>
+            </w:pPr>
+            <w:r>
+              <w:rPr>
+                <w:rFonts w:ascii="맑은 고딕" w:hAnsi="맑은 고딕" w:eastAsia="맑은 고딕" w:cs="맑은 고딕"/>
+                <w:b w:val="0"/>
+                <w:sz w:val="17"/>
+              </w:rPr>
+              <w:t>0.524</w:t>
+            </w:r>
+          </w:p>
+        </w:tc>
+        <w:tc>
+          <w:tcPr>
+            <w:tcW w:type="dxa" w:w="850"/>
+            <w:tcMar>
+              <w:top w:w="70" w:type="dxa"/>
+              <w:left w:w="90" w:type="dxa"/>
+              <w:bottom w:w="70" w:type="dxa"/>
+              <w:right w:w="90" w:type="dxa"/>
+            </w:tcMar>
+          </w:tcPr>
+          <w:p>
+            <w:pPr>
+              <w:spacing w:after="0" w:line="276" w:lineRule="auto"/>
+            </w:pPr>
+            <w:r>
+              <w:rPr>
+                <w:rFonts w:ascii="맑은 고딕" w:hAnsi="맑은 고딕" w:eastAsia="맑은 고딕" w:cs="맑은 고딕"/>
+                <w:b w:val="0"/>
+                <w:sz w:val="17"/>
+              </w:rPr>
+              <w:t>0.905</w:t>
+            </w:r>
+          </w:p>
+        </w:tc>
+        <w:tc>
+          <w:tcPr>
+            <w:tcW w:type="dxa" w:w="1701"/>
+            <w:tcMar>
+              <w:top w:w="70" w:type="dxa"/>
+              <w:left w:w="90" w:type="dxa"/>
+              <w:bottom w:w="70" w:type="dxa"/>
+              <w:right w:w="90" w:type="dxa"/>
+            </w:tcMar>
+          </w:tcPr>
+          <w:p>
+            <w:pPr>
+              <w:spacing w:after="0" w:line="276" w:lineRule="auto"/>
+            </w:pPr>
+            <w:r>
+              <w:rPr>
+                <w:rFonts w:ascii="맑은 고딕" w:hAnsi="맑은 고딕" w:eastAsia="맑은 고딕" w:cs="맑은 고딕"/>
+                <w:b w:val="0"/>
+                <w:sz w:val="17"/>
+              </w:rPr>
+              <w:t>0.703 → 0.691</w:t>
+            </w:r>
+          </w:p>
+        </w:tc>
+        <w:tc>
+          <w:tcPr>
+            <w:tcW w:type="dxa" w:w="1757"/>
+            <w:tcMar>
+              <w:top w:w="70" w:type="dxa"/>
+              <w:left w:w="90" w:type="dxa"/>
+              <w:bottom w:w="70" w:type="dxa"/>
+              <w:right w:w="90" w:type="dxa"/>
+            </w:tcMar>
+          </w:tcPr>
+          <w:p>
+            <w:pPr>
+              <w:spacing w:after="0" w:line="276" w:lineRule="auto"/>
+            </w:pPr>
+            <w:r>
+              <w:rPr>
+                <w:rFonts w:ascii="맑은 고딕" w:hAnsi="맑은 고딕" w:eastAsia="맑은 고딕" w:cs="맑은 고딕"/>
+                <w:b w:val="0"/>
+                <w:sz w:val="17"/>
+              </w:rPr>
+              <w:t>0.748 / 0.635</w:t>
+            </w:r>
+          </w:p>
+        </w:tc>
+        <w:tc>
+          <w:tcPr>
+            <w:tcW w:type="dxa" w:w="1304"/>
+            <w:tcMar>
+              <w:top w:w="70" w:type="dxa"/>
+              <w:left w:w="90" w:type="dxa"/>
+              <w:bottom w:w="70" w:type="dxa"/>
+              <w:right w:w="90" w:type="dxa"/>
+            </w:tcMar>
+          </w:tcPr>
+          <w:p>
+            <w:pPr>
+              <w:spacing w:after="0" w:line="276" w:lineRule="auto"/>
+            </w:pPr>
+            <w:r>
+              <w:rPr>
+                <w:rFonts w:ascii="맑은 고딕" w:hAnsi="맑은 고딕" w:eastAsia="맑은 고딕" w:cs="맑은 고딕"/>
+                <w:b w:val="0"/>
+                <w:sz w:val="17"/>
+              </w:rPr>
+              <w:t>0.635</w:t>
+            </w:r>
+          </w:p>
+        </w:tc>
+      </w:tr>
+      <w:tr>
+        <w:trPr>
+          <w:cantSplit/>
+        </w:trPr>
+        <w:tc>
+          <w:tcPr>
+            <w:tcW w:type="dxa" w:w="2608"/>
+            <w:tcMar>
+              <w:top w:w="70" w:type="dxa"/>
+              <w:left w:w="90" w:type="dxa"/>
+              <w:bottom w:w="70" w:type="dxa"/>
+              <w:right w:w="90" w:type="dxa"/>
+            </w:tcMar>
+          </w:tcPr>
+          <w:p>
+            <w:pPr>
+              <w:spacing w:after="0" w:line="276" w:lineRule="auto"/>
+            </w:pPr>
+            <w:r>
+              <w:rPr>
+                <w:rFonts w:ascii="맑은 고딕" w:hAnsi="맑은 고딕" w:eastAsia="맑은 고딕" w:cs="맑은 고딕"/>
+                <w:b w:val="0"/>
+                <w:sz w:val="17"/>
+              </w:rPr>
+              <w:t>qwen3-embedding-0.6b (2,048)</w:t>
+            </w:r>
+          </w:p>
+        </w:tc>
+        <w:tc>
+          <w:tcPr>
+            <w:tcW w:type="dxa" w:w="850"/>
+            <w:tcMar>
+              <w:top w:w="70" w:type="dxa"/>
+              <w:left w:w="90" w:type="dxa"/>
+              <w:bottom w:w="70" w:type="dxa"/>
+              <w:right w:w="90" w:type="dxa"/>
+            </w:tcMar>
+          </w:tcPr>
+          <w:p>
+            <w:pPr>
+              <w:spacing w:after="0" w:line="276" w:lineRule="auto"/>
+            </w:pPr>
+            <w:r>
+              <w:rPr>
+                <w:rFonts w:ascii="맑은 고딕" w:hAnsi="맑은 고딕" w:eastAsia="맑은 고딕" w:cs="맑은 고딕"/>
+                <w:b w:val="0"/>
+                <w:sz w:val="17"/>
+              </w:rPr>
+              <w:t>0.500</w:t>
+            </w:r>
+          </w:p>
+        </w:tc>
+        <w:tc>
+          <w:tcPr>
+            <w:tcW w:type="dxa" w:w="850"/>
+            <w:tcMar>
+              <w:top w:w="70" w:type="dxa"/>
+              <w:left w:w="90" w:type="dxa"/>
+              <w:bottom w:w="70" w:type="dxa"/>
+              <w:right w:w="90" w:type="dxa"/>
+            </w:tcMar>
+          </w:tcPr>
+          <w:p>
+            <w:pPr>
+              <w:spacing w:after="0" w:line="276" w:lineRule="auto"/>
+            </w:pPr>
+            <w:r>
+              <w:rPr>
+                <w:rFonts w:ascii="맑은 고딕" w:hAnsi="맑은 고딕" w:eastAsia="맑은 고딕" w:cs="맑은 고딕"/>
+                <w:b w:val="0"/>
+                <w:sz w:val="17"/>
+              </w:rPr>
+              <w:t>0.810</w:t>
+            </w:r>
+          </w:p>
+        </w:tc>
+        <w:tc>
+          <w:tcPr>
+            <w:tcW w:type="dxa" w:w="1701"/>
+            <w:tcMar>
+              <w:top w:w="70" w:type="dxa"/>
+              <w:left w:w="90" w:type="dxa"/>
+              <w:bottom w:w="70" w:type="dxa"/>
+              <w:right w:w="90" w:type="dxa"/>
+            </w:tcMar>
+          </w:tcPr>
+          <w:p>
+            <w:pPr>
+              <w:spacing w:after="0" w:line="276" w:lineRule="auto"/>
+            </w:pPr>
+            <w:r>
+              <w:rPr>
+                <w:rFonts w:ascii="맑은 고딕" w:hAnsi="맑은 고딕" w:eastAsia="맑은 고딕" w:cs="맑은 고딕"/>
+                <w:b w:val="0"/>
+                <w:sz w:val="17"/>
+              </w:rPr>
+              <w:t>0.631 → 0.631</w:t>
+            </w:r>
+          </w:p>
+        </w:tc>
+        <w:tc>
+          <w:tcPr>
+            <w:tcW w:type="dxa" w:w="1757"/>
+            <w:tcMar>
+              <w:top w:w="70" w:type="dxa"/>
+              <w:left w:w="90" w:type="dxa"/>
+              <w:bottom w:w="70" w:type="dxa"/>
+              <w:right w:w="90" w:type="dxa"/>
+            </w:tcMar>
+          </w:tcPr>
+          <w:p>
+            <w:pPr>
+              <w:spacing w:after="0" w:line="276" w:lineRule="auto"/>
+            </w:pPr>
+            <w:r>
+              <w:rPr>
+                <w:rFonts w:ascii="맑은 고딕" w:hAnsi="맑은 고딕" w:eastAsia="맑은 고딕" w:cs="맑은 고딕"/>
+                <w:b w:val="0"/>
+                <w:sz w:val="17"/>
+              </w:rPr>
+              <w:t>0.770 / 0.493</w:t>
+            </w:r>
+          </w:p>
+        </w:tc>
+        <w:tc>
+          <w:tcPr>
+            <w:tcW w:type="dxa" w:w="1304"/>
+            <w:tcMar>
+              <w:top w:w="70" w:type="dxa"/>
+              <w:left w:w="90" w:type="dxa"/>
+              <w:bottom w:w="70" w:type="dxa"/>
+              <w:right w:w="90" w:type="dxa"/>
+            </w:tcMar>
+          </w:tcPr>
+          <w:p>
+            <w:pPr>
+              <w:spacing w:after="0" w:line="276" w:lineRule="auto"/>
+            </w:pPr>
+            <w:r>
+              <w:rPr>
+                <w:rFonts w:ascii="맑은 고딕" w:hAnsi="맑은 고딕" w:eastAsia="맑은 고딕" w:cs="맑은 고딕"/>
+                <w:b w:val="0"/>
+                <w:sz w:val="17"/>
+              </w:rPr>
+              <w:t>0.493</w:t>
+            </w:r>
+          </w:p>
+        </w:tc>
+      </w:tr>
+      <w:tr>
+        <w:trPr>
+          <w:cantSplit/>
+        </w:trPr>
+        <w:tc>
+          <w:tcPr>
+            <w:tcW w:type="dxa" w:w="2608"/>
+            <w:tcMar>
+              <w:top w:w="70" w:type="dxa"/>
+              <w:left w:w="90" w:type="dxa"/>
+              <w:bottom w:w="70" w:type="dxa"/>
+              <w:right w:w="90" w:type="dxa"/>
+            </w:tcMar>
+          </w:tcPr>
+          <w:p>
+            <w:pPr>
+              <w:spacing w:after="0" w:line="276" w:lineRule="auto"/>
+            </w:pPr>
+            <w:r>
+              <w:rPr>
+                <w:rFonts w:ascii="맑은 고딕" w:hAnsi="맑은 고딕" w:eastAsia="맑은 고딕" w:cs="맑은 고딕"/>
+                <w:b w:val="0"/>
+                <w:sz w:val="17"/>
+              </w:rPr>
+              <w:t>multilingual-e5-large (512)</w:t>
+            </w:r>
+          </w:p>
+        </w:tc>
+        <w:tc>
+          <w:tcPr>
+            <w:tcW w:type="dxa" w:w="850"/>
+            <w:tcMar>
+              <w:top w:w="70" w:type="dxa"/>
+              <w:left w:w="90" w:type="dxa"/>
+              <w:bottom w:w="70" w:type="dxa"/>
+              <w:right w:w="90" w:type="dxa"/>
+            </w:tcMar>
+          </w:tcPr>
+          <w:p>
+            <w:pPr>
+              <w:spacing w:after="0" w:line="276" w:lineRule="auto"/>
+            </w:pPr>
+            <w:r>
+              <w:rPr>
+                <w:rFonts w:ascii="맑은 고딕" w:hAnsi="맑은 고딕" w:eastAsia="맑은 고딕" w:cs="맑은 고딕"/>
+                <w:b w:val="0"/>
+                <w:sz w:val="17"/>
+              </w:rPr>
+              <w:t>0.476</w:t>
+            </w:r>
+          </w:p>
+        </w:tc>
+        <w:tc>
+          <w:tcPr>
+            <w:tcW w:type="dxa" w:w="850"/>
+            <w:tcMar>
+              <w:top w:w="70" w:type="dxa"/>
+              <w:left w:w="90" w:type="dxa"/>
+              <w:bottom w:w="70" w:type="dxa"/>
+              <w:right w:w="90" w:type="dxa"/>
+            </w:tcMar>
+          </w:tcPr>
+          <w:p>
+            <w:pPr>
+              <w:spacing w:after="0" w:line="276" w:lineRule="auto"/>
+            </w:pPr>
+            <w:r>
+              <w:rPr>
+                <w:rFonts w:ascii="맑은 고딕" w:hAnsi="맑은 고딕" w:eastAsia="맑은 고딕" w:cs="맑은 고딕"/>
+                <w:b w:val="0"/>
+                <w:sz w:val="17"/>
+              </w:rPr>
+              <w:t>0.857</w:t>
+            </w:r>
+          </w:p>
+        </w:tc>
+        <w:tc>
+          <w:tcPr>
+            <w:tcW w:type="dxa" w:w="1701"/>
+            <w:tcMar>
+              <w:top w:w="70" w:type="dxa"/>
+              <w:left w:w="90" w:type="dxa"/>
+              <w:bottom w:w="70" w:type="dxa"/>
+              <w:right w:w="90" w:type="dxa"/>
+            </w:tcMar>
+          </w:tcPr>
+          <w:p>
+            <w:pPr>
+              <w:spacing w:after="0" w:line="276" w:lineRule="auto"/>
+            </w:pPr>
+            <w:r>
+              <w:rPr>
+                <w:rFonts w:ascii="맑은 고딕" w:hAnsi="맑은 고딕" w:eastAsia="맑은 고딕" w:cs="맑은 고딕"/>
+                <w:b w:val="0"/>
+                <w:sz w:val="17"/>
+              </w:rPr>
+              <w:t>0.626 → 0.626</w:t>
+            </w:r>
+          </w:p>
+        </w:tc>
+        <w:tc>
+          <w:tcPr>
+            <w:tcW w:type="dxa" w:w="1757"/>
+            <w:tcMar>
+              <w:top w:w="70" w:type="dxa"/>
+              <w:left w:w="90" w:type="dxa"/>
+              <w:bottom w:w="70" w:type="dxa"/>
+              <w:right w:w="90" w:type="dxa"/>
+            </w:tcMar>
+          </w:tcPr>
+          <w:p>
+            <w:pPr>
+              <w:spacing w:after="0" w:line="276" w:lineRule="auto"/>
+            </w:pPr>
+            <w:r>
+              <w:rPr>
+                <w:rFonts w:ascii="맑은 고딕" w:hAnsi="맑은 고딕" w:eastAsia="맑은 고딕" w:cs="맑은 고딕"/>
+                <w:b w:val="0"/>
+                <w:sz w:val="17"/>
+              </w:rPr>
+              <w:t>0.662 / 0.589</w:t>
+            </w:r>
+          </w:p>
+        </w:tc>
+        <w:tc>
+          <w:tcPr>
+            <w:tcW w:type="dxa" w:w="1304"/>
+            <w:tcMar>
+              <w:top w:w="70" w:type="dxa"/>
+              <w:left w:w="90" w:type="dxa"/>
+              <w:bottom w:w="70" w:type="dxa"/>
+              <w:right w:w="90" w:type="dxa"/>
+            </w:tcMar>
+          </w:tcPr>
+          <w:p>
+            <w:pPr>
+              <w:spacing w:after="0" w:line="276" w:lineRule="auto"/>
+            </w:pPr>
+            <w:r>
+              <w:rPr>
+                <w:rFonts w:ascii="맑은 고딕" w:hAnsi="맑은 고딕" w:eastAsia="맑은 고딕" w:cs="맑은 고딕"/>
+                <w:b w:val="0"/>
+                <w:sz w:val="17"/>
+              </w:rPr>
+              <w:t>0.589</w:t>
+            </w:r>
+          </w:p>
+        </w:tc>
+      </w:tr>
+      <w:tr>
+        <w:trPr>
+          <w:cantSplit/>
+        </w:trPr>
+        <w:tc>
+          <w:tcPr>
+            <w:tcW w:type="dxa" w:w="2608"/>
+            <w:tcMar>
+              <w:top w:w="70" w:type="dxa"/>
+              <w:left w:w="90" w:type="dxa"/>
+              <w:bottom w:w="70" w:type="dxa"/>
+              <w:right w:w="90" w:type="dxa"/>
+            </w:tcMar>
+          </w:tcPr>
+          <w:p>
+            <w:pPr>
+              <w:spacing w:after="0" w:line="276" w:lineRule="auto"/>
+            </w:pPr>
+            <w:r>
+              <w:rPr>
+                <w:rFonts w:ascii="맑은 고딕" w:hAnsi="맑은 고딕" w:eastAsia="맑은 고딕" w:cs="맑은 고딕"/>
+                <w:b w:val="0"/>
+                <w:sz w:val="17"/>
+              </w:rPr>
+              <w:t>multilingual-minilm-l12 (128)</w:t>
+            </w:r>
+          </w:p>
+        </w:tc>
+        <w:tc>
+          <w:tcPr>
+            <w:tcW w:type="dxa" w:w="850"/>
+            <w:tcMar>
+              <w:top w:w="70" w:type="dxa"/>
+              <w:left w:w="90" w:type="dxa"/>
+              <w:bottom w:w="70" w:type="dxa"/>
+              <w:right w:w="90" w:type="dxa"/>
+            </w:tcMar>
+          </w:tcPr>
+          <w:p>
+            <w:pPr>
+              <w:spacing w:after="0" w:line="276" w:lineRule="auto"/>
+            </w:pPr>
+            <w:r>
+              <w:rPr>
+                <w:rFonts w:ascii="맑은 고딕" w:hAnsi="맑은 고딕" w:eastAsia="맑은 고딕" w:cs="맑은 고딕"/>
+                <w:b w:val="0"/>
+                <w:sz w:val="17"/>
+              </w:rPr>
+              <w:t>0.262</w:t>
+            </w:r>
+          </w:p>
+        </w:tc>
+        <w:tc>
+          <w:tcPr>
+            <w:tcW w:type="dxa" w:w="850"/>
+            <w:tcMar>
+              <w:top w:w="70" w:type="dxa"/>
+              <w:left w:w="90" w:type="dxa"/>
+              <w:bottom w:w="70" w:type="dxa"/>
+              <w:right w:w="90" w:type="dxa"/>
+            </w:tcMar>
+          </w:tcPr>
+          <w:p>
+            <w:pPr>
+              <w:spacing w:after="0" w:line="276" w:lineRule="auto"/>
+            </w:pPr>
+            <w:r>
+              <w:rPr>
+                <w:rFonts w:ascii="맑은 고딕" w:hAnsi="맑은 고딕" w:eastAsia="맑은 고딕" w:cs="맑은 고딕"/>
+                <w:b w:val="0"/>
+                <w:sz w:val="17"/>
+              </w:rPr>
+              <w:t>0.500</w:t>
+            </w:r>
+          </w:p>
+        </w:tc>
+        <w:tc>
+          <w:tcPr>
+            <w:tcW w:type="dxa" w:w="1701"/>
+            <w:tcMar>
+              <w:top w:w="70" w:type="dxa"/>
+              <w:left w:w="90" w:type="dxa"/>
+              <w:bottom w:w="70" w:type="dxa"/>
+              <w:right w:w="90" w:type="dxa"/>
+            </w:tcMar>
+          </w:tcPr>
+          <w:p>
+            <w:pPr>
+              <w:spacing w:after="0" w:line="276" w:lineRule="auto"/>
+            </w:pPr>
+            <w:r>
+              <w:rPr>
+                <w:rFonts w:ascii="맑은 고딕" w:hAnsi="맑은 고딕" w:eastAsia="맑은 고딕" w:cs="맑은 고딕"/>
+                <w:b w:val="0"/>
+                <w:sz w:val="17"/>
+              </w:rPr>
+              <w:t>0.377 → 0.377</w:t>
+            </w:r>
+          </w:p>
+        </w:tc>
+        <w:tc>
+          <w:tcPr>
+            <w:tcW w:type="dxa" w:w="1757"/>
+            <w:tcMar>
+              <w:top w:w="70" w:type="dxa"/>
+              <w:left w:w="90" w:type="dxa"/>
+              <w:bottom w:w="70" w:type="dxa"/>
+              <w:right w:w="90" w:type="dxa"/>
+            </w:tcMar>
+          </w:tcPr>
+          <w:p>
+            <w:pPr>
+              <w:spacing w:after="0" w:line="276" w:lineRule="auto"/>
+            </w:pPr>
+            <w:r>
+              <w:rPr>
+                <w:rFonts w:ascii="맑은 고딕" w:hAnsi="맑은 고딕" w:eastAsia="맑은 고딕" w:cs="맑은 고딕"/>
+                <w:b w:val="0"/>
+                <w:sz w:val="17"/>
+              </w:rPr>
+              <w:t>0.378 / 0.375</w:t>
+            </w:r>
+          </w:p>
+        </w:tc>
+        <w:tc>
+          <w:tcPr>
+            <w:tcW w:type="dxa" w:w="1304"/>
+            <w:tcMar>
+              <w:top w:w="70" w:type="dxa"/>
+              <w:left w:w="90" w:type="dxa"/>
+              <w:bottom w:w="70" w:type="dxa"/>
+              <w:right w:w="90" w:type="dxa"/>
+            </w:tcMar>
+          </w:tcPr>
+          <w:p>
+            <w:pPr>
+              <w:spacing w:after="0" w:line="276" w:lineRule="auto"/>
+            </w:pPr>
+            <w:r>
+              <w:rPr>
+                <w:rFonts w:ascii="맑은 고딕" w:hAnsi="맑은 고딕" w:eastAsia="맑은 고딕" w:cs="맑은 고딕"/>
+                <w:b w:val="0"/>
+                <w:sz w:val="17"/>
+              </w:rPr>
+              <w:t>0.375</w:t>
+            </w:r>
+          </w:p>
+        </w:tc>
+      </w:tr>
+    </w:tbl>
+    <w:p>
+      <w:pPr>
+        <w:spacing w:after="80" w:line="324" w:lineRule="auto"/>
+      </w:pPr>
+    </w:p>
+    <w:tbl>
+      <w:tblPr>
+        <w:jc w:val="center"/>
+        <w:tblLook w:firstColumn="1" w:firstRow="1" w:lastColumn="0" w:lastRow="0" w:noHBand="0" w:noVBand="1" w:val="04A0"/>
+        <w:tblBorders>
+          <w:top w:val="single" w:color="161A58" w:sz="8"/>
+          <w:left w:val="none" w:color="FFFFFF" w:sz="0"/>
+          <w:bottom w:val="single" w:color="161A58" w:sz="8"/>
+          <w:right w:val="none" w:color="FFFFFF" w:sz="0"/>
+          <w:insideH w:val="single" w:color="D8DAE5" w:sz="2"/>
+          <w:insideV w:val="single" w:color="D8DAE5" w:sz="2"/>
+        </w:tblBorders>
+        <w:tblW w:w="9072" w:type="dxa"/>
+        <w:tblLayout w:type="fixed"/>
+      </w:tblPr>
+      <w:tblGrid>
+        <w:gridCol w:w="4762"/>
+        <w:gridCol w:w="1077"/>
+        <w:gridCol w:w="1077"/>
+        <w:gridCol w:w="1077"/>
+        <w:gridCol w:w="1077"/>
+      </w:tblGrid>
+      <w:tr>
+        <w:trPr>
+          <w:cantSplit/>
+          <w:tblHeader w:val="true"/>
+        </w:trPr>
+        <w:tc>
+          <w:tcPr>
+            <w:tcW w:type="dxa" w:w="4762"/>
+            <w:tcMar>
+              <w:top w:w="70" w:type="dxa"/>
+              <w:left w:w="90" w:type="dxa"/>
+              <w:bottom w:w="70" w:type="dxa"/>
+              <w:right w:w="90" w:type="dxa"/>
+            </w:tcMar>
+            <w:shd w:val="clear" w:color="auto" w:fill="F2F3F8"/>
+          </w:tcPr>
+          <w:p>
+            <w:pPr>
+              <w:spacing w:after="0" w:line="276" w:lineRule="auto"/>
+              <w:jc w:val="center"/>
+            </w:pPr>
+            <w:r>
+              <w:rPr>
+                <w:rFonts w:ascii="맑은 고딕" w:hAnsi="맑은 고딕" w:eastAsia="맑은 고딕" w:cs="맑은 고딕"/>
+                <w:b/>
+                <w:color w:val="161A58"/>
+                <w:sz w:val="17"/>
+              </w:rPr>
+              <w:t>검색 구성</w:t>
+            </w:r>
+          </w:p>
+        </w:tc>
+        <w:tc>
+          <w:tcPr>
+            <w:tcW w:type="dxa" w:w="1077"/>
+            <w:tcMar>
+              <w:top w:w="70" w:type="dxa"/>
+              <w:left w:w="90" w:type="dxa"/>
+              <w:bottom w:w="70" w:type="dxa"/>
+              <w:right w:w="90" w:type="dxa"/>
+            </w:tcMar>
+            <w:shd w:val="clear" w:color="auto" w:fill="F2F3F8"/>
+          </w:tcPr>
+          <w:p>
+            <w:pPr>
+              <w:spacing w:after="0" w:line="276" w:lineRule="auto"/>
+              <w:jc w:val="center"/>
+            </w:pPr>
+            <w:r>
+              <w:rPr>
+                <w:rFonts w:ascii="맑은 고딕" w:hAnsi="맑은 고딕" w:eastAsia="맑은 고딕" w:cs="맑은 고딕"/>
+                <w:b/>
+                <w:color w:val="161A58"/>
+                <w:sz w:val="17"/>
+              </w:rPr>
+              <w:t>Hit@1</w:t>
+            </w:r>
+          </w:p>
+        </w:tc>
+        <w:tc>
+          <w:tcPr>
+            <w:tcW w:type="dxa" w:w="1077"/>
+            <w:tcMar>
+              <w:top w:w="70" w:type="dxa"/>
+              <w:left w:w="90" w:type="dxa"/>
+              <w:bottom w:w="70" w:type="dxa"/>
+              <w:right w:w="90" w:type="dxa"/>
+            </w:tcMar>
+            <w:shd w:val="clear" w:color="auto" w:fill="F2F3F8"/>
+          </w:tcPr>
+          <w:p>
+            <w:pPr>
+              <w:spacing w:after="0" w:line="276" w:lineRule="auto"/>
+              <w:jc w:val="center"/>
+            </w:pPr>
+            <w:r>
+              <w:rPr>
+                <w:rFonts w:ascii="맑은 고딕" w:hAnsi="맑은 고딕" w:eastAsia="맑은 고딕" w:cs="맑은 고딕"/>
+                <w:b/>
+                <w:color w:val="161A58"/>
+                <w:sz w:val="17"/>
+              </w:rPr>
+              <w:t>Hit@3</w:t>
+            </w:r>
+          </w:p>
+        </w:tc>
+        <w:tc>
+          <w:tcPr>
+            <w:tcW w:type="dxa" w:w="1077"/>
+            <w:tcMar>
+              <w:top w:w="70" w:type="dxa"/>
+              <w:left w:w="90" w:type="dxa"/>
+              <w:bottom w:w="70" w:type="dxa"/>
+              <w:right w:w="90" w:type="dxa"/>
+            </w:tcMar>
+            <w:shd w:val="clear" w:color="auto" w:fill="F2F3F8"/>
+          </w:tcPr>
+          <w:p>
+            <w:pPr>
+              <w:spacing w:after="0" w:line="276" w:lineRule="auto"/>
+              <w:jc w:val="center"/>
+            </w:pPr>
+            <w:r>
+              <w:rPr>
+                <w:rFonts w:ascii="맑은 고딕" w:hAnsi="맑은 고딕" w:eastAsia="맑은 고딕" w:cs="맑은 고딕"/>
+                <w:b/>
+                <w:color w:val="161A58"/>
+                <w:sz w:val="17"/>
+              </w:rPr>
+              <w:t>Hit@5</w:t>
+            </w:r>
+          </w:p>
+        </w:tc>
+        <w:tc>
+          <w:tcPr>
+            <w:tcW w:type="dxa" w:w="1077"/>
+            <w:tcMar>
+              <w:top w:w="70" w:type="dxa"/>
+              <w:left w:w="90" w:type="dxa"/>
+              <w:bottom w:w="70" w:type="dxa"/>
+              <w:right w:w="90" w:type="dxa"/>
+            </w:tcMar>
+            <w:shd w:val="clear" w:color="auto" w:fill="F2F3F8"/>
+          </w:tcPr>
+          <w:p>
+            <w:pPr>
+              <w:spacing w:after="0" w:line="276" w:lineRule="auto"/>
+              <w:jc w:val="center"/>
+            </w:pPr>
+            <w:r>
+              <w:rPr>
+                <w:rFonts w:ascii="맑은 고딕" w:hAnsi="맑은 고딕" w:eastAsia="맑은 고딕" w:cs="맑은 고딕"/>
+                <w:b/>
+                <w:color w:val="161A58"/>
+                <w:sz w:val="17"/>
+              </w:rPr>
+              <w:t>MRR@10</w:t>
+            </w:r>
+          </w:p>
+        </w:tc>
+      </w:tr>
+      <w:tr>
+        <w:trPr>
+          <w:cantSplit/>
+        </w:trPr>
+        <w:tc>
+          <w:tcPr>
+            <w:tcW w:type="dxa" w:w="4762"/>
+            <w:tcMar>
+              <w:top w:w="70" w:type="dxa"/>
+              <w:left w:w="90" w:type="dxa"/>
+              <w:bottom w:w="70" w:type="dxa"/>
+              <w:right w:w="90" w:type="dxa"/>
+            </w:tcMar>
+          </w:tcPr>
+          <w:p>
+            <w:pPr>
+              <w:spacing w:after="0" w:line="276" w:lineRule="auto"/>
+            </w:pPr>
+            <w:r>
+              <w:rPr>
+                <w:rFonts w:ascii="맑은 고딕" w:hAnsi="맑은 고딕" w:eastAsia="맑은 고딕" w:cs="맑은 고딕"/>
+                <w:b w:val="0"/>
+                <w:sz w:val="17"/>
+              </w:rPr>
+              <w:t>Dense (한국어 질의)</w:t>
+            </w:r>
+          </w:p>
+        </w:tc>
+        <w:tc>
+          <w:tcPr>
+            <w:tcW w:type="dxa" w:w="1077"/>
+            <w:tcMar>
+              <w:top w:w="70" w:type="dxa"/>
+              <w:left w:w="90" w:type="dxa"/>
+              <w:bottom w:w="70" w:type="dxa"/>
+              <w:right w:w="90" w:type="dxa"/>
+            </w:tcMar>
+          </w:tcPr>
+          <w:p>
+            <w:pPr>
+              <w:spacing w:after="0" w:line="276" w:lineRule="auto"/>
+            </w:pPr>
+            <w:r>
+              <w:rPr>
+                <w:rFonts w:ascii="맑은 고딕" w:hAnsi="맑은 고딕" w:eastAsia="맑은 고딕" w:cs="맑은 고딕"/>
+                <w:b w:val="0"/>
+                <w:sz w:val="17"/>
+              </w:rPr>
+              <w:t>0.524</w:t>
+            </w:r>
+          </w:p>
+        </w:tc>
+        <w:tc>
+          <w:tcPr>
+            <w:tcW w:type="dxa" w:w="1077"/>
+            <w:tcMar>
+              <w:top w:w="70" w:type="dxa"/>
+              <w:left w:w="90" w:type="dxa"/>
+              <w:bottom w:w="70" w:type="dxa"/>
+              <w:right w:w="90" w:type="dxa"/>
+            </w:tcMar>
+          </w:tcPr>
+          <w:p>
+            <w:pPr>
+              <w:spacing w:after="0" w:line="276" w:lineRule="auto"/>
+            </w:pPr>
+            <w:r>
+              <w:rPr>
+                <w:rFonts w:ascii="맑은 고딕" w:hAnsi="맑은 고딕" w:eastAsia="맑은 고딕" w:cs="맑은 고딕"/>
+                <w:b w:val="0"/>
+                <w:sz w:val="17"/>
+              </w:rPr>
+              <w:t>0.857</w:t>
+            </w:r>
+          </w:p>
+        </w:tc>
+        <w:tc>
+          <w:tcPr>
+            <w:tcW w:type="dxa" w:w="1077"/>
+            <w:tcMar>
+              <w:top w:w="70" w:type="dxa"/>
+              <w:left w:w="90" w:type="dxa"/>
+              <w:bottom w:w="70" w:type="dxa"/>
+              <w:right w:w="90" w:type="dxa"/>
+            </w:tcMar>
+          </w:tcPr>
+          <w:p>
+            <w:pPr>
+              <w:spacing w:after="0" w:line="276" w:lineRule="auto"/>
+            </w:pPr>
+            <w:r>
+              <w:rPr>
+                <w:rFonts w:ascii="맑은 고딕" w:hAnsi="맑은 고딕" w:eastAsia="맑은 고딕" w:cs="맑은 고딕"/>
+                <w:b w:val="0"/>
+                <w:sz w:val="17"/>
+              </w:rPr>
+              <w:t>0.905</w:t>
+            </w:r>
+          </w:p>
+        </w:tc>
+        <w:tc>
+          <w:tcPr>
+            <w:tcW w:type="dxa" w:w="1077"/>
+            <w:tcMar>
+              <w:top w:w="70" w:type="dxa"/>
+              <w:left w:w="90" w:type="dxa"/>
+              <w:bottom w:w="70" w:type="dxa"/>
+              <w:right w:w="90" w:type="dxa"/>
+            </w:tcMar>
+          </w:tcPr>
+          <w:p>
+            <w:pPr>
+              <w:spacing w:after="0" w:line="276" w:lineRule="auto"/>
+            </w:pPr>
+            <w:r>
+              <w:rPr>
+                <w:rFonts w:ascii="맑은 고딕" w:hAnsi="맑은 고딕" w:eastAsia="맑은 고딕" w:cs="맑은 고딕"/>
+                <w:b w:val="0"/>
+                <w:sz w:val="17"/>
+              </w:rPr>
+              <w:t>0.691</w:t>
+            </w:r>
+          </w:p>
+        </w:tc>
+      </w:tr>
+      <w:tr>
+        <w:trPr>
+          <w:cantSplit/>
+        </w:trPr>
+        <w:tc>
+          <w:tcPr>
+            <w:tcW w:type="dxa" w:w="4762"/>
+            <w:tcMar>
+              <w:top w:w="70" w:type="dxa"/>
+              <w:left w:w="90" w:type="dxa"/>
+              <w:bottom w:w="70" w:type="dxa"/>
+              <w:right w:w="90" w:type="dxa"/>
+            </w:tcMar>
+          </w:tcPr>
+          <w:p>
+            <w:pPr>
+              <w:spacing w:after="0" w:line="276" w:lineRule="auto"/>
+            </w:pPr>
+            <w:r>
+              <w:rPr>
+                <w:rFonts w:ascii="맑은 고딕" w:hAnsi="맑은 고딕" w:eastAsia="맑은 고딕" w:cs="맑은 고딕"/>
+                <w:b w:val="0"/>
+                <w:sz w:val="17"/>
+              </w:rPr>
+              <w:t>BM25 (한국어 질의)</w:t>
+            </w:r>
+          </w:p>
+        </w:tc>
+        <w:tc>
+          <w:tcPr>
+            <w:tcW w:type="dxa" w:w="1077"/>
+            <w:tcMar>
+              <w:top w:w="70" w:type="dxa"/>
+              <w:left w:w="90" w:type="dxa"/>
+              <w:bottom w:w="70" w:type="dxa"/>
+              <w:right w:w="90" w:type="dxa"/>
+            </w:tcMar>
+          </w:tcPr>
+          <w:p>
+            <w:pPr>
+              <w:spacing w:after="0" w:line="276" w:lineRule="auto"/>
+            </w:pPr>
+            <w:r>
+              <w:rPr>
+                <w:rFonts w:ascii="맑은 고딕" w:hAnsi="맑은 고딕" w:eastAsia="맑은 고딕" w:cs="맑은 고딕"/>
+                <w:b w:val="0"/>
+                <w:sz w:val="17"/>
+              </w:rPr>
+              <w:t>0.548</w:t>
+            </w:r>
+          </w:p>
+        </w:tc>
+        <w:tc>
+          <w:tcPr>
+            <w:tcW w:type="dxa" w:w="1077"/>
+            <w:tcMar>
+              <w:top w:w="70" w:type="dxa"/>
+              <w:left w:w="90" w:type="dxa"/>
+              <w:bottom w:w="70" w:type="dxa"/>
+              <w:right w:w="90" w:type="dxa"/>
+            </w:tcMar>
+          </w:tcPr>
+          <w:p>
+            <w:pPr>
+              <w:spacing w:after="0" w:line="276" w:lineRule="auto"/>
+            </w:pPr>
+            <w:r>
+              <w:rPr>
+                <w:rFonts w:ascii="맑은 고딕" w:hAnsi="맑은 고딕" w:eastAsia="맑은 고딕" w:cs="맑은 고딕"/>
+                <w:b w:val="0"/>
+                <w:sz w:val="17"/>
+              </w:rPr>
+              <w:t>0.810</w:t>
+            </w:r>
+          </w:p>
+        </w:tc>
+        <w:tc>
+          <w:tcPr>
+            <w:tcW w:type="dxa" w:w="1077"/>
+            <w:tcMar>
+              <w:top w:w="70" w:type="dxa"/>
+              <w:left w:w="90" w:type="dxa"/>
+              <w:bottom w:w="70" w:type="dxa"/>
+              <w:right w:w="90" w:type="dxa"/>
+            </w:tcMar>
+          </w:tcPr>
+          <w:p>
+            <w:pPr>
+              <w:spacing w:after="0" w:line="276" w:lineRule="auto"/>
+            </w:pPr>
+            <w:r>
+              <w:rPr>
+                <w:rFonts w:ascii="맑은 고딕" w:hAnsi="맑은 고딕" w:eastAsia="맑은 고딕" w:cs="맑은 고딕"/>
+                <w:b w:val="0"/>
+                <w:sz w:val="17"/>
+              </w:rPr>
+              <w:t>0.881</w:t>
+            </w:r>
+          </w:p>
+        </w:tc>
+        <w:tc>
+          <w:tcPr>
+            <w:tcW w:type="dxa" w:w="1077"/>
+            <w:tcMar>
+              <w:top w:w="70" w:type="dxa"/>
+              <w:left w:w="90" w:type="dxa"/>
+              <w:bottom w:w="70" w:type="dxa"/>
+              <w:right w:w="90" w:type="dxa"/>
+            </w:tcMar>
+          </w:tcPr>
+          <w:p>
+            <w:pPr>
+              <w:spacing w:after="0" w:line="276" w:lineRule="auto"/>
+            </w:pPr>
+            <w:r>
+              <w:rPr>
+                <w:rFonts w:ascii="맑은 고딕" w:hAnsi="맑은 고딕" w:eastAsia="맑은 고딕" w:cs="맑은 고딕"/>
+                <w:b w:val="0"/>
+                <w:sz w:val="17"/>
+              </w:rPr>
+              <w:t>0.697</w:t>
+            </w:r>
+          </w:p>
+        </w:tc>
+      </w:tr>
+      <w:tr>
+        <w:trPr>
+          <w:cantSplit/>
+        </w:trPr>
+        <w:tc>
+          <w:tcPr>
+            <w:tcW w:type="dxa" w:w="4762"/>
+            <w:tcMar>
+              <w:top w:w="70" w:type="dxa"/>
+              <w:left w:w="90" w:type="dxa"/>
+              <w:bottom w:w="70" w:type="dxa"/>
+              <w:right w:w="90" w:type="dxa"/>
+            </w:tcMar>
+          </w:tcPr>
+          <w:p>
+            <w:pPr>
+              <w:spacing w:after="0" w:line="276" w:lineRule="auto"/>
+            </w:pPr>
+            <w:r>
+              <w:rPr>
+                <w:rFonts w:ascii="맑은 고딕" w:hAnsi="맑은 고딕" w:eastAsia="맑은 고딕" w:cs="맑은 고딕"/>
+                <w:b w:val="0"/>
+                <w:sz w:val="17"/>
+              </w:rPr>
+              <w:t>BM25 (영어 재작성 질의)</w:t>
+            </w:r>
+          </w:p>
+        </w:tc>
+        <w:tc>
+          <w:tcPr>
+            <w:tcW w:type="dxa" w:w="1077"/>
+            <w:tcMar>
+              <w:top w:w="70" w:type="dxa"/>
+              <w:left w:w="90" w:type="dxa"/>
+              <w:bottom w:w="70" w:type="dxa"/>
+              <w:right w:w="90" w:type="dxa"/>
+            </w:tcMar>
+          </w:tcPr>
+          <w:p>
+            <w:pPr>
+              <w:spacing w:after="0" w:line="276" w:lineRule="auto"/>
+            </w:pPr>
+            <w:r>
+              <w:rPr>
+                <w:rFonts w:ascii="맑은 고딕" w:hAnsi="맑은 고딕" w:eastAsia="맑은 고딕" w:cs="맑은 고딕"/>
+                <w:b w:val="0"/>
+                <w:sz w:val="17"/>
+              </w:rPr>
+              <w:t>0.643</w:t>
+            </w:r>
+          </w:p>
+        </w:tc>
+        <w:tc>
+          <w:tcPr>
+            <w:tcW w:type="dxa" w:w="1077"/>
+            <w:tcMar>
+              <w:top w:w="70" w:type="dxa"/>
+              <w:left w:w="90" w:type="dxa"/>
+              <w:bottom w:w="70" w:type="dxa"/>
+              <w:right w:w="90" w:type="dxa"/>
+            </w:tcMar>
+          </w:tcPr>
+          <w:p>
+            <w:pPr>
+              <w:spacing w:after="0" w:line="276" w:lineRule="auto"/>
+            </w:pPr>
+            <w:r>
+              <w:rPr>
+                <w:rFonts w:ascii="맑은 고딕" w:hAnsi="맑은 고딕" w:eastAsia="맑은 고딕" w:cs="맑은 고딕"/>
+                <w:b w:val="0"/>
+                <w:sz w:val="17"/>
+              </w:rPr>
+              <w:t>0.905</w:t>
+            </w:r>
+          </w:p>
+        </w:tc>
+        <w:tc>
+          <w:tcPr>
+            <w:tcW w:type="dxa" w:w="1077"/>
+            <w:tcMar>
+              <w:top w:w="70" w:type="dxa"/>
+              <w:left w:w="90" w:type="dxa"/>
+              <w:bottom w:w="70" w:type="dxa"/>
+              <w:right w:w="90" w:type="dxa"/>
+            </w:tcMar>
+          </w:tcPr>
+          <w:p>
+            <w:pPr>
+              <w:spacing w:after="0" w:line="276" w:lineRule="auto"/>
+            </w:pPr>
+            <w:r>
+              <w:rPr>
+                <w:rFonts w:ascii="맑은 고딕" w:hAnsi="맑은 고딕" w:eastAsia="맑은 고딕" w:cs="맑은 고딕"/>
+                <w:b w:val="0"/>
+                <w:sz w:val="17"/>
+              </w:rPr>
+              <w:t>0.929</w:t>
+            </w:r>
+          </w:p>
+        </w:tc>
+        <w:tc>
+          <w:tcPr>
+            <w:tcW w:type="dxa" w:w="1077"/>
+            <w:tcMar>
+              <w:top w:w="70" w:type="dxa"/>
+              <w:left w:w="90" w:type="dxa"/>
+              <w:bottom w:w="70" w:type="dxa"/>
+              <w:right w:w="90" w:type="dxa"/>
+            </w:tcMar>
+          </w:tcPr>
+          <w:p>
+            <w:pPr>
+              <w:spacing w:after="0" w:line="276" w:lineRule="auto"/>
+            </w:pPr>
+            <w:r>
+              <w:rPr>
+                <w:rFonts w:ascii="맑은 고딕" w:hAnsi="맑은 고딕" w:eastAsia="맑은 고딕" w:cs="맑은 고딕"/>
+                <w:b w:val="0"/>
+                <w:sz w:val="17"/>
+              </w:rPr>
+              <w:t>0.770</w:t>
+            </w:r>
+          </w:p>
+        </w:tc>
+      </w:tr>
+      <w:tr>
+        <w:trPr>
+          <w:cantSplit/>
+        </w:trPr>
+        <w:tc>
+          <w:tcPr>
+            <w:tcW w:type="dxa" w:w="4762"/>
+            <w:tcMar>
+              <w:top w:w="70" w:type="dxa"/>
+              <w:left w:w="90" w:type="dxa"/>
+              <w:bottom w:w="70" w:type="dxa"/>
+              <w:right w:w="90" w:type="dxa"/>
+            </w:tcMar>
+          </w:tcPr>
+          <w:p>
+            <w:pPr>
+              <w:spacing w:after="0" w:line="276" w:lineRule="auto"/>
+            </w:pPr>
+            <w:r>
+              <w:rPr>
+                <w:rFonts w:ascii="맑은 고딕" w:hAnsi="맑은 고딕" w:eastAsia="맑은 고딕" w:cs="맑은 고딕"/>
+                <w:b w:val="0"/>
+                <w:sz w:val="17"/>
+              </w:rPr>
+              <w:t>2중 하이브리드 RRF: Dense(KO) + BM25(EN)</w:t>
+            </w:r>
+          </w:p>
+        </w:tc>
+        <w:tc>
+          <w:tcPr>
+            <w:tcW w:type="dxa" w:w="1077"/>
+            <w:tcMar>
+              <w:top w:w="70" w:type="dxa"/>
+              <w:left w:w="90" w:type="dxa"/>
+              <w:bottom w:w="70" w:type="dxa"/>
+              <w:right w:w="90" w:type="dxa"/>
+            </w:tcMar>
+          </w:tcPr>
+          <w:p>
+            <w:pPr>
+              <w:spacing w:after="0" w:line="276" w:lineRule="auto"/>
+            </w:pPr>
+            <w:r>
+              <w:rPr>
+                <w:rFonts w:ascii="맑은 고딕" w:hAnsi="맑은 고딕" w:eastAsia="맑은 고딕" w:cs="맑은 고딕"/>
+                <w:b w:val="0"/>
+                <w:sz w:val="17"/>
+              </w:rPr>
+              <w:t>0.643</w:t>
+            </w:r>
+          </w:p>
+        </w:tc>
+        <w:tc>
+          <w:tcPr>
+            <w:tcW w:type="dxa" w:w="1077"/>
+            <w:tcMar>
+              <w:top w:w="70" w:type="dxa"/>
+              <w:left w:w="90" w:type="dxa"/>
+              <w:bottom w:w="70" w:type="dxa"/>
+              <w:right w:w="90" w:type="dxa"/>
+            </w:tcMar>
+          </w:tcPr>
+          <w:p>
+            <w:pPr>
+              <w:spacing w:after="0" w:line="276" w:lineRule="auto"/>
+            </w:pPr>
+            <w:r>
+              <w:rPr>
+                <w:rFonts w:ascii="맑은 고딕" w:hAnsi="맑은 고딕" w:eastAsia="맑은 고딕" w:cs="맑은 고딕"/>
+                <w:b w:val="0"/>
+                <w:sz w:val="17"/>
+              </w:rPr>
+              <w:t>0.929</w:t>
+            </w:r>
+          </w:p>
+        </w:tc>
+        <w:tc>
+          <w:tcPr>
+            <w:tcW w:type="dxa" w:w="1077"/>
+            <w:tcMar>
+              <w:top w:w="70" w:type="dxa"/>
+              <w:left w:w="90" w:type="dxa"/>
+              <w:bottom w:w="70" w:type="dxa"/>
+              <w:right w:w="90" w:type="dxa"/>
+            </w:tcMar>
+          </w:tcPr>
+          <w:p>
+            <w:pPr>
+              <w:spacing w:after="0" w:line="276" w:lineRule="auto"/>
+            </w:pPr>
+            <w:r>
+              <w:rPr>
+                <w:rFonts w:ascii="맑은 고딕" w:hAnsi="맑은 고딕" w:eastAsia="맑은 고딕" w:cs="맑은 고딕"/>
+                <w:b w:val="0"/>
+                <w:sz w:val="17"/>
+              </w:rPr>
+              <w:t>0.929</w:t>
+            </w:r>
+          </w:p>
+        </w:tc>
+        <w:tc>
+          <w:tcPr>
+            <w:tcW w:type="dxa" w:w="1077"/>
+            <w:tcMar>
+              <w:top w:w="70" w:type="dxa"/>
+              <w:left w:w="90" w:type="dxa"/>
+              <w:bottom w:w="70" w:type="dxa"/>
+              <w:right w:w="90" w:type="dxa"/>
+            </w:tcMar>
+          </w:tcPr>
+          <w:p>
+            <w:pPr>
+              <w:spacing w:after="0" w:line="276" w:lineRule="auto"/>
+            </w:pPr>
+            <w:r>
+              <w:rPr>
+                <w:rFonts w:ascii="맑은 고딕" w:hAnsi="맑은 고딕" w:eastAsia="맑은 고딕" w:cs="맑은 고딕"/>
+                <w:b w:val="0"/>
+                <w:sz w:val="17"/>
+              </w:rPr>
+              <w:t>0.786</w:t>
+            </w:r>
+          </w:p>
+        </w:tc>
+      </w:tr>
+      <w:tr>
+        <w:trPr>
+          <w:cantSplit/>
+        </w:trPr>
+        <w:tc>
+          <w:tcPr>
+            <w:tcW w:type="dxa" w:w="4762"/>
+            <w:tcMar>
+              <w:top w:w="70" w:type="dxa"/>
+              <w:left w:w="90" w:type="dxa"/>
+              <w:bottom w:w="70" w:type="dxa"/>
+              <w:right w:w="90" w:type="dxa"/>
+            </w:tcMar>
+          </w:tcPr>
+          <w:p>
+            <w:pPr>
+              <w:spacing w:after="0" w:line="276" w:lineRule="auto"/>
+            </w:pPr>
+            <w:r>
+              <w:rPr>
+                <w:rFonts w:ascii="맑은 고딕" w:hAnsi="맑은 고딕" w:eastAsia="맑은 고딕" w:cs="맑은 고딕"/>
+                <w:b w:val="0"/>
+                <w:sz w:val="17"/>
+              </w:rPr>
+              <w:t>3중 하이브리드 RRF: Dense(KO) + Dense(EN) + BM25(EN)</w:t>
+            </w:r>
+          </w:p>
+        </w:tc>
+        <w:tc>
+          <w:tcPr>
+            <w:tcW w:type="dxa" w:w="1077"/>
+            <w:tcMar>
+              <w:top w:w="70" w:type="dxa"/>
+              <w:left w:w="90" w:type="dxa"/>
+              <w:bottom w:w="70" w:type="dxa"/>
+              <w:right w:w="90" w:type="dxa"/>
+            </w:tcMar>
+          </w:tcPr>
+          <w:p>
+            <w:pPr>
+              <w:spacing w:after="0" w:line="276" w:lineRule="auto"/>
+            </w:pPr>
+            <w:r>
+              <w:rPr>
+                <w:rFonts w:ascii="맑은 고딕" w:hAnsi="맑은 고딕" w:eastAsia="맑은 고딕" w:cs="맑은 고딕"/>
+                <w:b w:val="0"/>
+                <w:sz w:val="17"/>
+              </w:rPr>
+              <w:t>0.643</w:t>
+            </w:r>
+          </w:p>
+        </w:tc>
+        <w:tc>
+          <w:tcPr>
+            <w:tcW w:type="dxa" w:w="1077"/>
+            <w:tcMar>
+              <w:top w:w="70" w:type="dxa"/>
+              <w:left w:w="90" w:type="dxa"/>
+              <w:bottom w:w="70" w:type="dxa"/>
+              <w:right w:w="90" w:type="dxa"/>
+            </w:tcMar>
+          </w:tcPr>
+          <w:p>
+            <w:pPr>
+              <w:spacing w:after="0" w:line="276" w:lineRule="auto"/>
+            </w:pPr>
+            <w:r>
+              <w:rPr>
+                <w:rFonts w:ascii="맑은 고딕" w:hAnsi="맑은 고딕" w:eastAsia="맑은 고딕" w:cs="맑은 고딕"/>
+                <w:b w:val="0"/>
+                <w:sz w:val="17"/>
+              </w:rPr>
+              <w:t>0.881</w:t>
+            </w:r>
+          </w:p>
+        </w:tc>
+        <w:tc>
+          <w:tcPr>
+            <w:tcW w:type="dxa" w:w="1077"/>
+            <w:tcMar>
+              <w:top w:w="70" w:type="dxa"/>
+              <w:left w:w="90" w:type="dxa"/>
+              <w:bottom w:w="70" w:type="dxa"/>
+              <w:right w:w="90" w:type="dxa"/>
+            </w:tcMar>
+          </w:tcPr>
+          <w:p>
+            <w:pPr>
+              <w:spacing w:after="0" w:line="276" w:lineRule="auto"/>
+            </w:pPr>
+            <w:r>
+              <w:rPr>
+                <w:rFonts w:ascii="맑은 고딕" w:hAnsi="맑은 고딕" w:eastAsia="맑은 고딕" w:cs="맑은 고딕"/>
+                <w:b w:val="0"/>
+                <w:sz w:val="17"/>
+              </w:rPr>
+              <w:t>0.952</w:t>
+            </w:r>
+          </w:p>
+        </w:tc>
+        <w:tc>
+          <w:tcPr>
+            <w:tcW w:type="dxa" w:w="1077"/>
+            <w:tcMar>
+              <w:top w:w="70" w:type="dxa"/>
+              <w:left w:w="90" w:type="dxa"/>
+              <w:bottom w:w="70" w:type="dxa"/>
+              <w:right w:w="90" w:type="dxa"/>
+            </w:tcMar>
+          </w:tcPr>
+          <w:p>
+            <w:pPr>
+              <w:spacing w:after="0" w:line="276" w:lineRule="auto"/>
+            </w:pPr>
+            <w:r>
+              <w:rPr>
+                <w:rFonts w:ascii="맑은 고딕" w:hAnsi="맑은 고딕" w:eastAsia="맑은 고딕" w:cs="맑은 고딕"/>
+                <w:b w:val="0"/>
+                <w:sz w:val="17"/>
+              </w:rPr>
+              <w:t>0.778</w:t>
+            </w:r>
+          </w:p>
+        </w:tc>
+      </w:tr>
+      <w:tr>
+        <w:trPr>
+          <w:cantSplit/>
+        </w:trPr>
+        <w:tc>
+          <w:tcPr>
+            <w:tcW w:type="dxa" w:w="4762"/>
+            <w:tcMar>
+              <w:top w:w="70" w:type="dxa"/>
+              <w:left w:w="90" w:type="dxa"/>
+              <w:bottom w:w="70" w:type="dxa"/>
+              <w:right w:w="90" w:type="dxa"/>
+            </w:tcMar>
+          </w:tcPr>
+          <w:p>
+            <w:pPr>
+              <w:spacing w:after="0" w:line="276" w:lineRule="auto"/>
+            </w:pPr>
+            <w:r>
+              <w:rPr>
+                <w:rFonts w:ascii="맑은 고딕" w:hAnsi="맑은 고딕" w:eastAsia="맑은 고딕" w:cs="맑은 고딕"/>
+                <w:b w:val="0"/>
+                <w:sz w:val="17"/>
+              </w:rPr>
+              <w:t>2중 하이브리드 RRF + reranker (참고)</w:t>
+            </w:r>
+          </w:p>
+        </w:tc>
+        <w:tc>
+          <w:tcPr>
+            <w:tcW w:type="dxa" w:w="1077"/>
+            <w:tcMar>
+              <w:top w:w="70" w:type="dxa"/>
+              <w:left w:w="90" w:type="dxa"/>
+              <w:bottom w:w="70" w:type="dxa"/>
+              <w:right w:w="90" w:type="dxa"/>
+            </w:tcMar>
+          </w:tcPr>
+          <w:p>
+            <w:pPr>
+              <w:spacing w:after="0" w:line="276" w:lineRule="auto"/>
+            </w:pPr>
+            <w:r>
+              <w:rPr>
+                <w:rFonts w:ascii="맑은 고딕" w:hAnsi="맑은 고딕" w:eastAsia="맑은 고딕" w:cs="맑은 고딕"/>
+                <w:b w:val="0"/>
+                <w:sz w:val="17"/>
+              </w:rPr>
+              <w:t>0.786</w:t>
+            </w:r>
+          </w:p>
+        </w:tc>
+        <w:tc>
+          <w:tcPr>
+            <w:tcW w:type="dxa" w:w="1077"/>
+            <w:tcMar>
+              <w:top w:w="70" w:type="dxa"/>
+              <w:left w:w="90" w:type="dxa"/>
+              <w:bottom w:w="70" w:type="dxa"/>
+              <w:right w:w="90" w:type="dxa"/>
+            </w:tcMar>
+          </w:tcPr>
+          <w:p>
+            <w:pPr>
+              <w:spacing w:after="0" w:line="276" w:lineRule="auto"/>
+            </w:pPr>
+            <w:r>
+              <w:rPr>
+                <w:rFonts w:ascii="맑은 고딕" w:hAnsi="맑은 고딕" w:eastAsia="맑은 고딕" w:cs="맑은 고딕"/>
+                <w:b w:val="0"/>
+                <w:sz w:val="17"/>
+              </w:rPr>
+              <w:t>0.952</w:t>
+            </w:r>
+          </w:p>
+        </w:tc>
+        <w:tc>
+          <w:tcPr>
+            <w:tcW w:type="dxa" w:w="1077"/>
+            <w:tcMar>
+              <w:top w:w="70" w:type="dxa"/>
+              <w:left w:w="90" w:type="dxa"/>
+              <w:bottom w:w="70" w:type="dxa"/>
+              <w:right w:w="90" w:type="dxa"/>
+            </w:tcMar>
+          </w:tcPr>
+          <w:p>
+            <w:pPr>
+              <w:spacing w:after="0" w:line="276" w:lineRule="auto"/>
+            </w:pPr>
+            <w:r>
+              <w:rPr>
+                <w:rFonts w:ascii="맑은 고딕" w:hAnsi="맑은 고딕" w:eastAsia="맑은 고딕" w:cs="맑은 고딕"/>
+                <w:b w:val="0"/>
+                <w:sz w:val="17"/>
+              </w:rPr>
+              <w:t>0.976</w:t>
+            </w:r>
+          </w:p>
+        </w:tc>
+        <w:tc>
+          <w:tcPr>
+            <w:tcW w:type="dxa" w:w="1077"/>
+            <w:tcMar>
+              <w:top w:w="70" w:type="dxa"/>
+              <w:left w:w="90" w:type="dxa"/>
+              <w:bottom w:w="70" w:type="dxa"/>
+              <w:right w:w="90" w:type="dxa"/>
+            </w:tcMar>
+          </w:tcPr>
+          <w:p>
+            <w:pPr>
+              <w:spacing w:after="0" w:line="276" w:lineRule="auto"/>
+            </w:pPr>
+            <w:r>
+              <w:rPr>
+                <w:rFonts w:ascii="맑은 고딕" w:hAnsi="맑은 고딕" w:eastAsia="맑은 고딕" w:cs="맑은 고딕"/>
+                <w:b w:val="0"/>
+                <w:sz w:val="17"/>
+              </w:rPr>
+              <w:t>0.863</w:t>
+            </w:r>
+          </w:p>
+        </w:tc>
+      </w:tr>
+      <w:tr>
+        <w:trPr>
+          <w:cantSplit/>
+        </w:trPr>
+        <w:tc>
+          <w:tcPr>
+            <w:tcW w:type="dxa" w:w="4762"/>
+            <w:tcMar>
+              <w:top w:w="70" w:type="dxa"/>
+              <w:left w:w="90" w:type="dxa"/>
+              <w:bottom w:w="70" w:type="dxa"/>
+              <w:right w:w="90" w:type="dxa"/>
+            </w:tcMar>
+          </w:tcPr>
+          <w:p>
+            <w:pPr>
+              <w:spacing w:after="0" w:line="276" w:lineRule="auto"/>
+            </w:pPr>
+            <w:r>
+              <w:rPr>
+                <w:rFonts w:ascii="맑은 고딕" w:hAnsi="맑은 고딕" w:eastAsia="맑은 고딕" w:cs="맑은 고딕"/>
+                <w:b/>
+                <w:color w:val="161A58"/>
+                <w:sz w:val="17"/>
+              </w:rPr>
+              <w:t>3중 하이브리드 RRF + reranker ← 채택(v1에서 고정)</w:t>
+            </w:r>
+          </w:p>
+        </w:tc>
+        <w:tc>
+          <w:tcPr>
+            <w:tcW w:type="dxa" w:w="1077"/>
+            <w:tcMar>
+              <w:top w:w="70" w:type="dxa"/>
+              <w:left w:w="90" w:type="dxa"/>
+              <w:bottom w:w="70" w:type="dxa"/>
+              <w:right w:w="90" w:type="dxa"/>
+            </w:tcMar>
+          </w:tcPr>
+          <w:p>
+            <w:pPr>
+              <w:spacing w:after="0" w:line="276" w:lineRule="auto"/>
+            </w:pPr>
+            <w:r>
+              <w:rPr>
+                <w:rFonts w:ascii="맑은 고딕" w:hAnsi="맑은 고딕" w:eastAsia="맑은 고딕" w:cs="맑은 고딕"/>
+                <w:b w:val="0"/>
+                <w:sz w:val="17"/>
+              </w:rPr>
+              <w:t>0.786</w:t>
+            </w:r>
+          </w:p>
+        </w:tc>
+        <w:tc>
+          <w:tcPr>
+            <w:tcW w:type="dxa" w:w="1077"/>
+            <w:tcMar>
+              <w:top w:w="70" w:type="dxa"/>
+              <w:left w:w="90" w:type="dxa"/>
+              <w:bottom w:w="70" w:type="dxa"/>
+              <w:right w:w="90" w:type="dxa"/>
+            </w:tcMar>
+          </w:tcPr>
+          <w:p>
+            <w:pPr>
+              <w:spacing w:after="0" w:line="276" w:lineRule="auto"/>
+            </w:pPr>
+            <w:r>
+              <w:rPr>
+                <w:rFonts w:ascii="맑은 고딕" w:hAnsi="맑은 고딕" w:eastAsia="맑은 고딕" w:cs="맑은 고딕"/>
+                <w:b w:val="0"/>
+                <w:sz w:val="17"/>
+              </w:rPr>
+              <w:t>0.952</w:t>
+            </w:r>
+          </w:p>
+        </w:tc>
+        <w:tc>
+          <w:tcPr>
+            <w:tcW w:type="dxa" w:w="1077"/>
+            <w:tcMar>
+              <w:top w:w="70" w:type="dxa"/>
+              <w:left w:w="90" w:type="dxa"/>
+              <w:bottom w:w="70" w:type="dxa"/>
+              <w:right w:w="90" w:type="dxa"/>
+            </w:tcMar>
+          </w:tcPr>
+          <w:p>
+            <w:pPr>
+              <w:spacing w:after="0" w:line="276" w:lineRule="auto"/>
+            </w:pPr>
+            <w:r>
+              <w:rPr>
+                <w:rFonts w:ascii="맑은 고딕" w:hAnsi="맑은 고딕" w:eastAsia="맑은 고딕" w:cs="맑은 고딕"/>
+                <w:b w:val="0"/>
+                <w:sz w:val="17"/>
+              </w:rPr>
+              <w:t>0.976</w:t>
+            </w:r>
+          </w:p>
+        </w:tc>
+        <w:tc>
+          <w:tcPr>
+            <w:tcW w:type="dxa" w:w="1077"/>
+            <w:tcMar>
+              <w:top w:w="70" w:type="dxa"/>
+              <w:left w:w="90" w:type="dxa"/>
+              <w:bottom w:w="70" w:type="dxa"/>
+              <w:right w:w="90" w:type="dxa"/>
+            </w:tcMar>
+          </w:tcPr>
+          <w:p>
+            <w:pPr>
+              <w:spacing w:after="0" w:line="276" w:lineRule="auto"/>
+            </w:pPr>
+            <w:r>
+              <w:rPr>
+                <w:rFonts w:ascii="맑은 고딕" w:hAnsi="맑은 고딕" w:eastAsia="맑은 고딕" w:cs="맑은 고딕"/>
+                <w:b w:val="0"/>
+                <w:sz w:val="17"/>
+              </w:rPr>
+              <w:t>0.863</w:t>
+            </w:r>
+          </w:p>
+        </w:tc>
+      </w:tr>
+    </w:tbl>
+    <w:p>
+      <w:pPr>
+        <w:spacing w:after="80" w:line="324" w:lineRule="auto"/>
+      </w:pPr>
+    </w:p>
+    <w:p>
+      <w:pPr>
+        <w:spacing w:after="80" w:line="324" w:lineRule="auto"/>
+        <w:ind w:left="113"/>
+        <w:pBdr>
+          <w:left w:val="single" w:sz="18" w:space="6" w:color="7F4ACB"/>
+        </w:pBdr>
+      </w:pPr>
+      <w:r>
+        <w:rPr>
+          <w:rFonts w:ascii="맑은 고딕" w:hAnsi="맑은 고딕" w:eastAsia="맑은 고딕" w:cs="맑은 고딕"/>
+          <w:b/>
+          <w:color w:val="555A6E"/>
+          <w:sz w:val="18"/>
+        </w:rPr>
+        <w:t>해석:</w:t>
+      </w:r>
+      <w:r>
+        <w:rPr>
+          <w:rFonts w:ascii="맑은 고딕" w:hAnsi="맑은 고딕" w:eastAsia="맑은 고딕" w:cs="맑은 고딕"/>
+          <w:b w:val="0"/>
+          <w:color w:val="555A6E"/>
+          <w:sz w:val="18"/>
+        </w:rPr>
+        <w:t xml:space="preserve"> 임베딩 순위는 v1과 같다. bge-m3가 전체 Hit@1·3·5와 MRR에서 가장 높았고, </w:t>
+      </w:r>
+      <w:r>
+        <w:rPr>
+          <w:rFonts w:ascii="D2Coding" w:hAnsi="D2Coding" w:eastAsia="맑은 고딕" w:cs="D2Coding"/>
+          <w:b w:val="0"/>
+          <w:color w:val="5B3FA0"/>
+          <w:sz w:val="17"/>
+        </w:rPr>
+        <w:t>min(SW, HW)</w:t>
+      </w:r>
+      <w:r>
+        <w:rPr>
+          <w:rFonts w:ascii="맑은 고딕" w:hAnsi="맑은 고딕" w:eastAsia="맑은 고딕" w:cs="맑은 고딕"/>
+          <w:b w:val="0"/>
+          <w:color w:val="555A6E"/>
+          <w:sz w:val="18"/>
+        </w:rPr>
+        <w:t>도 bge-m3 0.635, Qwen3 0.493이다. bge-m3는 청크 전체를 인코딩하자 MRR이 0.703에서 0.691로 약간 낮아졌다(1문항 순위 변화 수준). 채택 구성(3중 RRF + reranker)은 v1과 같은 Hit@1 0.786 · Hit@5 0.976 · MRR 0.863이다. 2중 RRF + reranker도 같은 값이라, reranker를 거친 뒤에는 이 평가셋으로 두 하이브리드의 차이가 드러나지 않는다. 설계는 v1에서 고정한 3중 구성을 유지한다(결과를 보고 사후에 교체하지 않음).</w:t>
+      </w:r>
+    </w:p>
+    <w:p>
+      <w:pPr>
+        <w:keepNext/>
+        <w:spacing w:after="80" w:line="324" w:lineRule="auto"/>
+      </w:pPr>
+      <w:r>
+        <w:rPr>
+          <w:rFonts w:ascii="맑은 고딕" w:hAnsi="맑은 고딕" w:eastAsia="맑은 고딕" w:cs="맑은 고딕"/>
+          <w:b/>
+          <w:color w:val="161A58"/>
+          <w:sz w:val="20"/>
+        </w:rPr>
         <w:t>평가의 한계와 향후 계획</w:t>
       </w:r>
     </w:p>
@@ -14864,7 +17038,7 @@
           <w:b w:val="0"/>
           <w:sz w:val="20"/>
         </w:rPr>
-        <w:t xml:space="preserve"> 위 수치는 일부 청크가 잘린 조건(</w:t>
+        <w:t xml:space="preserve"> v1 수치는 일부 청크가 잘린 조건(</w:t>
       </w:r>
       <w:r>
         <w:rPr>
@@ -14881,7 +17055,7 @@
           <w:b w:val="0"/>
           <w:sz w:val="20"/>
         </w:rPr>
-        <w:t xml:space="preserve"> 1,024)에서 측정했다.</w:t>
+        <w:t xml:space="preserve"> 1,024)에서 측정했다. 구현 조건(2,048)으로 다시 잰 v2 수치를 ④에 따로 적었다. v2는 판정 이력이 없는 쌍을 오답으로 처리했으므로 하한값이다.</w:t>
       </w:r>
     </w:p>
     <w:p>
@@ -14913,7 +17087,7 @@
           <w:b w:val="0"/>
           <w:sz w:val="20"/>
         </w:rPr>
-        <w:t xml:space="preserve"> 문항을 확충한 뒤 개발셋(설정 선택)과 테스트셋(최종 보고)을 분리한다. 현재 42문항을 둘로 나누면 테스트셋이 약 20문항이 되어 1문항이 5%p를 차지하므로, 확충이 먼저 필요하다. 재실행 결과는 새 수치(v2 측정)로 구분해 표기하고 기존 수치는 보존한다. 최종 42문항의 정답 청크 </w:t>
+        <w:t xml:space="preserve"> 문항을 확충한 뒤 개발셋(설정 선택)과 테스트셋(최종 보고)을 분리한다. 최종 성능은 테스트셋 수치로만 보고한다. 현재 42문항을 둘로 나누면 테스트셋이 약 20문항이 되어 1문항이 5%p를 차지하므로, 확충이 먼저 필요하다. 재실행 결과는 새 수치(v2 측정)로 구분해 표기하고 기존 수치는 보존한다. 최종 42문항의 정답 청크 </w:t>
       </w:r>
       <w:r>
         <w:rPr>
@@ -16146,7 +18320,58 @@
                 <w:b w:val="0"/>
                 <w:sz w:val="17"/>
               </w:rPr>
-              <w:t>으로 묶는다(Google 계열: research.google, blog.google, deepmind.google 등 / SK hynix 계열: skhynix.com, news.skhynix.com 등). 모든 웹 근거에 벤더/제3자 라벨을 붙인다.</w:t>
+              <w:t xml:space="preserve">으로 묶는다(Google 계열: research.google, blog.google, deepmind.google 등 / SK hynix 계열: skhynix.com, news.skhynix.com 등). 모든 웹 근거에 벤더/제3자 라벨을 붙인다. 도메인이 달라도 </w:t>
+            </w:r>
+            <w:r>
+              <w:rPr>
+                <w:rFonts w:ascii="맑은 고딕" w:hAnsi="맑은 고딕" w:eastAsia="맑은 고딕" w:cs="맑은 고딕"/>
+                <w:b/>
+                <w:color w:val="161A58"/>
+                <w:sz w:val="17"/>
+              </w:rPr>
+              <w:t>같은 보도자료·블로그를 재인용한 기사</w:t>
+            </w:r>
+            <w:r>
+              <w:rPr>
+                <w:rFonts w:ascii="맑은 고딕" w:hAnsi="맑은 고딕" w:eastAsia="맑은 고딕" w:cs="맑은 고딕"/>
+                <w:b w:val="0"/>
+                <w:sz w:val="17"/>
+              </w:rPr>
+              <w:t xml:space="preserve">는 독립 근거가 아니므로, 근거마다 </w:t>
+            </w:r>
+            <w:r>
+              <w:rPr>
+                <w:rFonts w:ascii="D2Coding" w:hAnsi="D2Coding" w:eastAsia="맑은 고딕" w:cs="D2Coding"/>
+                <w:b w:val="0"/>
+                <w:color w:val="5B3FA0"/>
+                <w:sz w:val="16"/>
+              </w:rPr>
+              <w:t>origin_group</w:t>
+            </w:r>
+            <w:r>
+              <w:rPr>
+                <w:rFonts w:ascii="맑은 고딕" w:hAnsi="맑은 고딕" w:eastAsia="맑은 고딕" w:cs="맑은 고딕"/>
+                <w:b w:val="0"/>
+                <w:sz w:val="17"/>
+              </w:rPr>
+              <w:t xml:space="preserve">(원 출처 계열)을 붙인다. 50% 비중과 찬반 할당량은 </w:t>
+            </w:r>
+            <w:r>
+              <w:rPr>
+                <w:rFonts w:ascii="맑은 고딕" w:hAnsi="맑은 고딕" w:eastAsia="맑은 고딕" w:cs="맑은 고딕"/>
+                <w:b/>
+                <w:color w:val="161A58"/>
+                <w:sz w:val="17"/>
+              </w:rPr>
+              <w:t>독립 계열 수</w:t>
+            </w:r>
+            <w:r>
+              <w:rPr>
+                <w:rFonts w:ascii="맑은 고딕" w:hAnsi="맑은 고딕" w:eastAsia="맑은 고딕" w:cs="맑은 고딕"/>
+                <w:b w:val="0"/>
+                <w:sz w:val="17"/>
+              </w:rPr>
+              <w:t xml:space="preserve"> 기준으로 센다. 예: Google 블로그 → 기술 매체 기사 → 그 기사를 재인용한 기사는 1계열이다.</w:t>
             </w:r>
           </w:p>
         </w:tc>
@@ -18876,6 +21101,55 @@
           <w:color w:val="161A58"/>
           <w:sz w:val="20"/>
         </w:rPr>
+        <w:t>임계값의 성격:</w:t>
+      </w:r>
+      <w:r>
+        <w:rPr>
+          <w:rFonts w:ascii="맑은 고딕" w:hAnsi="맑은 고딕" w:eastAsia="맑은 고딕" w:cs="맑은 고딕"/>
+          <w:b w:val="0"/>
+          <w:sz w:val="20"/>
+        </w:rPr>
+        <w:t xml:space="preserve"> 2.0·1.0 같은 상충 임계값과 H1 경계값은 기술의 절대적 평가 기준이 아니다. 관점 간 차이를 일관되게 분류하려고 </w:t>
+      </w:r>
+      <w:r>
+        <w:rPr>
+          <w:rFonts w:ascii="맑은 고딕" w:hAnsi="맑은 고딕" w:eastAsia="맑은 고딕" w:cs="맑은 고딕"/>
+          <w:b/>
+          <w:color w:val="161A58"/>
+          <w:sz w:val="20"/>
+        </w:rPr>
+        <w:t>분석 전에 고정한 운영 규칙(heuristic)</w:t>
+      </w:r>
+      <w:r>
+        <w:rPr>
+          <w:rFonts w:ascii="맑은 고딕" w:hAnsi="맑은 고딕" w:eastAsia="맑은 고딕" w:cs="맑은 고딕"/>
+          <w:b w:val="0"/>
+          <w:sz w:val="20"/>
+        </w:rPr>
+        <w:t>이다. 보고서 6장에서는 임계값을 ±0.5 바꿨을 때 분류가 달라지는 칸 수를 함께 보고한다(민감도 점검).</w:t>
+      </w:r>
+    </w:p>
+    <w:p>
+      <w:pPr>
+        <w:spacing w:after="40" w:line="312" w:lineRule="auto"/>
+        <w:ind w:left="312" w:hanging="227"/>
+      </w:pPr>
+      <w:r>
+        <w:rPr>
+          <w:rFonts w:ascii="맑은 고딕" w:hAnsi="맑은 고딕" w:eastAsia="맑은 고딕" w:cs="맑은 고딕"/>
+          <w:b/>
+          <w:color w:val="7F4ACB"/>
+          <w:sz w:val="20"/>
+        </w:rPr>
+        <w:t xml:space="preserve">• </w:t>
+      </w:r>
+      <w:r>
+        <w:rPr>
+          <w:rFonts w:ascii="맑은 고딕" w:hAnsi="맑은 고딕" w:eastAsia="맑은 고딕" w:cs="맑은 고딕"/>
+          <w:b/>
+          <w:color w:val="161A58"/>
+          <w:sz w:val="20"/>
+        </w:rPr>
         <w:t>TRL을 분리한 이유:</w:t>
       </w:r>
       <w:r>
@@ -20111,7 +22385,7 @@
           <w:b w:val="0"/>
           <w:sz w:val="20"/>
         </w:rPr>
-        <w:t xml:space="preserve"> 벤더 출처군 기준으로 비중이 50% 이하가 되도록 하고, 벤더/제3자 라벨을 붙인다(ITME·TurboQuant 모두 1차 자료가 벤더 발표이므로 필수). 기술 고유(</w:t>
+        <w:t xml:space="preserve"> 원 출처 계열(재인용은 같은 계열) 기준으로 비중이 50% 이하가 되도록 하고, 벤더/제3자 라벨을 붙인다(ITME·TurboQuant 모두 1차 자료가 벤더 발표이므로 필수). 기술 고유(</w:t>
       </w:r>
       <w:r>
         <w:rPr>
@@ -20321,6 +22595,87 @@
           <w:sz w:val="22"/>
         </w:rPr>
         <w:t>2.4.1 에이전트 설계</w:t>
+      </w:r>
+    </w:p>
+    <w:p>
+      <w:pPr>
+        <w:spacing w:after="80" w:line="324" w:lineRule="auto"/>
+        <w:ind w:left="113"/>
+        <w:pBdr>
+          <w:left w:val="single" w:sz="18" w:space="6" w:color="7F4ACB"/>
+        </w:pBdr>
+      </w:pPr>
+      <w:r>
+        <w:rPr>
+          <w:rFonts w:ascii="맑은 고딕" w:hAnsi="맑은 고딕" w:eastAsia="맑은 고딕" w:cs="맑은 고딕"/>
+          <w:b/>
+          <w:color w:val="555A6E"/>
+          <w:sz w:val="18"/>
+        </w:rPr>
+        <w:t>용어:</w:t>
+      </w:r>
+      <w:r>
+        <w:rPr>
+          <w:rFonts w:ascii="맑은 고딕" w:hAnsi="맑은 고딕" w:eastAsia="맑은 고딕" w:cs="맑은 고딕"/>
+          <w:b w:val="0"/>
+          <w:color w:val="555A6E"/>
+          <w:sz w:val="18"/>
+        </w:rPr>
+        <w:t xml:space="preserve"> Agent는 하나의 독립된 판단 책임 단위이고, Node는 LangGraph의 실행 단위이다. 하나의 Agent는 여러 Node로 구현될 수 있다. 예를 들어 기술 조사 Agent는 </w:t>
+      </w:r>
+      <w:r>
+        <w:rPr>
+          <w:rFonts w:ascii="D2Coding" w:hAnsi="D2Coding" w:eastAsia="맑은 고딕" w:cs="D2Coding"/>
+          <w:b w:val="0"/>
+          <w:color w:val="5B3FA0"/>
+          <w:sz w:val="17"/>
+        </w:rPr>
+        <w:t>selection_validator</w:t>
+      </w:r>
+      <w:r>
+        <w:rPr>
+          <w:rFonts w:ascii="맑은 고딕" w:hAnsi="맑은 고딕" w:eastAsia="맑은 고딕" w:cs="맑은 고딕"/>
+          <w:b w:val="0"/>
+          <w:color w:val="555A6E"/>
+          <w:sz w:val="18"/>
+        </w:rPr>
+        <w:t xml:space="preserve">, </w:t>
+      </w:r>
+      <w:r>
+        <w:rPr>
+          <w:rFonts w:ascii="D2Coding" w:hAnsi="D2Coding" w:eastAsia="맑은 고딕" w:cs="D2Coding"/>
+          <w:b w:val="0"/>
+          <w:color w:val="5B3FA0"/>
+          <w:sz w:val="17"/>
+        </w:rPr>
+        <w:t>tech_research</w:t>
+      </w:r>
+      <w:r>
+        <w:rPr>
+          <w:rFonts w:ascii="맑은 고딕" w:hAnsi="맑은 고딕" w:eastAsia="맑은 고딕" w:cs="맑은 고딕"/>
+          <w:b w:val="0"/>
+          <w:color w:val="555A6E"/>
+          <w:sz w:val="18"/>
+        </w:rPr>
+        <w:t xml:space="preserve">, </w:t>
+      </w:r>
+      <w:r>
+        <w:rPr>
+          <w:rFonts w:ascii="D2Coding" w:hAnsi="D2Coding" w:eastAsia="맑은 고딕" w:cs="D2Coding"/>
+          <w:b w:val="0"/>
+          <w:color w:val="5B3FA0"/>
+          <w:sz w:val="17"/>
+        </w:rPr>
+        <w:t>trl_assessor</w:t>
+      </w:r>
+      <w:r>
+        <w:rPr>
+          <w:rFonts w:ascii="맑은 고딕" w:hAnsi="맑은 고딕" w:eastAsia="맑은 고딕" w:cs="맑은 고딕"/>
+          <w:b w:val="0"/>
+          <w:color w:val="555A6E"/>
+          <w:sz w:val="18"/>
+        </w:rPr>
+        <w:t xml:space="preserve"> 3개 노드로 구현된다. 전체는 에이전트 7개, 노드 18개이다.</w:t>
       </w:r>
     </w:p>
     <w:p>
@@ -22134,23 +24489,6 @@
           <w:color w:val="5B3FA0"/>
           <w:sz w:val="19"/>
         </w:rPr>
-        <w:t>human_review</w:t>
-      </w:r>
-      <w:r>
-        <w:rPr>
-          <w:rFonts w:ascii="맑은 고딕" w:hAnsi="맑은 고딕" w:eastAsia="맑은 고딕" w:cs="맑은 고딕"/>
-          <w:b w:val="0"/>
-          <w:sz w:val="20"/>
-        </w:rPr>
-        <w:t xml:space="preserve">(최대 1회), </w:t>
-      </w:r>
-      <w:r>
-        <w:rPr>
-          <w:rFonts w:ascii="D2Coding" w:hAnsi="D2Coding" w:eastAsia="맑은 고딕" w:cs="D2Coding"/>
-          <w:b w:val="0"/>
-          <w:color w:val="5B3FA0"/>
-          <w:sz w:val="19"/>
-        </w:rPr>
         <w:t>index_builder</w:t>
       </w:r>
       <w:r>
@@ -22922,7 +25260,24 @@
                 <w:b w:val="0"/>
                 <w:sz w:val="17"/>
               </w:rPr>
-              <w:t>선정 기술 2건(config/CLI), 진영, 선정 사유</w:t>
+              <w:t xml:space="preserve">팀이 선정한 기술 2건(config / </w:t>
+            </w:r>
+            <w:r>
+              <w:rPr>
+                <w:rFonts w:ascii="D2Coding" w:hAnsi="D2Coding" w:eastAsia="맑은 고딕" w:cs="D2Coding"/>
+                <w:b w:val="0"/>
+                <w:color w:val="5B3FA0"/>
+                <w:sz w:val="16"/>
+              </w:rPr>
+              <w:t>--tech</w:t>
+            </w:r>
+            <w:r>
+              <w:rPr>
+                <w:rFonts w:ascii="맑은 고딕" w:hAnsi="맑은 고딕" w:eastAsia="맑은 고딕" w:cs="맑은 고딕"/>
+                <w:b w:val="0"/>
+                <w:sz w:val="17"/>
+              </w:rPr>
+              <w:t>), 진영, 선정 사유. 실행 중 변경 없음</w:t>
             </w:r>
           </w:p>
         </w:tc>
@@ -22952,7 +25307,7 @@
                 <w:color w:val="5B3FA0"/>
                 <w:sz w:val="16"/>
               </w:rPr>
-              <w:t>selection_override</w:t>
+              <w:t>selection_validation</w:t>
             </w:r>
           </w:p>
         </w:tc>
@@ -22977,7 +25332,7 @@
                 <w:color w:val="5B3FA0"/>
                 <w:sz w:val="16"/>
               </w:rPr>
-              <w:t>Optional[list[Technology]]</w:t>
+              <w:t>SelectionValidation</w:t>
             </w:r>
           </w:p>
         </w:tc>
@@ -23001,7 +25356,7 @@
                 <w:b w:val="0"/>
                 <w:sz w:val="17"/>
               </w:rPr>
-              <w:t>human_review</w:t>
+              <w:t>selection_validator</w:t>
             </w:r>
           </w:p>
         </w:tc>
@@ -23025,278 +25380,7 @@
                 <w:b w:val="0"/>
                 <w:sz w:val="17"/>
               </w:rPr>
-              <w:t>selection_validator, query_planner</w:t>
-            </w:r>
-          </w:p>
-        </w:tc>
-        <w:tc>
-          <w:tcPr>
-            <w:tcW w:type="dxa" w:w="2438"/>
-            <w:tcMar>
-              <w:top w:w="70" w:type="dxa"/>
-              <w:left w:w="90" w:type="dxa"/>
-              <w:bottom w:w="70" w:type="dxa"/>
-              <w:right w:w="90" w:type="dxa"/>
-            </w:tcMar>
-          </w:tcPr>
-          <w:p>
-            <w:pPr>
-              <w:spacing w:after="0" w:line="276" w:lineRule="auto"/>
-            </w:pPr>
-            <w:r>
-              <w:rPr>
-                <w:rFonts w:ascii="맑은 고딕" w:hAnsi="맑은 고딕" w:eastAsia="맑은 고딕" w:cs="맑은 고딕"/>
-                <w:b w:val="0"/>
-                <w:sz w:val="17"/>
-              </w:rPr>
-              <w:t xml:space="preserve">대화형 확인에서 사람이 기술을 바꾼 경우만 값이 있음(없으면 </w:t>
-            </w:r>
-            <w:r>
-              <w:rPr>
-                <w:rFonts w:ascii="D2Coding" w:hAnsi="D2Coding" w:eastAsia="맑은 고딕" w:cs="D2Coding"/>
-                <w:b w:val="0"/>
-                <w:color w:val="5B3FA0"/>
-                <w:sz w:val="16"/>
-              </w:rPr>
-              <w:t>selected_techs</w:t>
-            </w:r>
-            <w:r>
-              <w:rPr>
-                <w:rFonts w:ascii="맑은 고딕" w:hAnsi="맑은 고딕" w:eastAsia="맑은 고딕" w:cs="맑은 고딕"/>
-                <w:b w:val="0"/>
-                <w:sz w:val="17"/>
-              </w:rPr>
-              <w:t xml:space="preserve"> 사용)</w:t>
-            </w:r>
-          </w:p>
-        </w:tc>
-      </w:tr>
-      <w:tr>
-        <w:trPr>
-          <w:cantSplit/>
-        </w:trPr>
-        <w:tc>
-          <w:tcPr>
-            <w:tcW w:type="dxa" w:w="1871"/>
-            <w:tcMar>
-              <w:top w:w="70" w:type="dxa"/>
-              <w:left w:w="90" w:type="dxa"/>
-              <w:bottom w:w="70" w:type="dxa"/>
-              <w:right w:w="90" w:type="dxa"/>
-            </w:tcMar>
-          </w:tcPr>
-          <w:p>
-            <w:pPr>
-              <w:spacing w:after="0" w:line="276" w:lineRule="auto"/>
-            </w:pPr>
-            <w:r>
-              <w:rPr>
-                <w:rFonts w:ascii="D2Coding" w:hAnsi="D2Coding" w:eastAsia="맑은 고딕" w:cs="D2Coding"/>
-                <w:b w:val="0"/>
-                <w:color w:val="5B3FA0"/>
-                <w:sz w:val="16"/>
-              </w:rPr>
-              <w:t>selection_review_count</w:t>
-            </w:r>
-          </w:p>
-        </w:tc>
-        <w:tc>
-          <w:tcPr>
-            <w:tcW w:type="dxa" w:w="1474"/>
-            <w:tcMar>
-              <w:top w:w="70" w:type="dxa"/>
-              <w:left w:w="90" w:type="dxa"/>
-              <w:bottom w:w="70" w:type="dxa"/>
-              <w:right w:w="90" w:type="dxa"/>
-            </w:tcMar>
-          </w:tcPr>
-          <w:p>
-            <w:pPr>
-              <w:spacing w:after="0" w:line="276" w:lineRule="auto"/>
-            </w:pPr>
-            <w:r>
-              <w:rPr>
-                <w:rFonts w:ascii="D2Coding" w:hAnsi="D2Coding" w:eastAsia="맑은 고딕" w:cs="D2Coding"/>
-                <w:b w:val="0"/>
-                <w:color w:val="5B3FA0"/>
-                <w:sz w:val="16"/>
-              </w:rPr>
-              <w:t>int</w:t>
-            </w:r>
-          </w:p>
-        </w:tc>
-        <w:tc>
-          <w:tcPr>
-            <w:tcW w:type="dxa" w:w="1587"/>
-            <w:tcMar>
-              <w:top w:w="70" w:type="dxa"/>
-              <w:left w:w="90" w:type="dxa"/>
-              <w:bottom w:w="70" w:type="dxa"/>
-              <w:right w:w="90" w:type="dxa"/>
-            </w:tcMar>
-          </w:tcPr>
-          <w:p>
-            <w:pPr>
-              <w:spacing w:after="0" w:line="276" w:lineRule="auto"/>
-            </w:pPr>
-            <w:r>
-              <w:rPr>
-                <w:rFonts w:ascii="맑은 고딕" w:hAnsi="맑은 고딕" w:eastAsia="맑은 고딕" w:cs="맑은 고딕"/>
-                <w:b w:val="0"/>
-                <w:sz w:val="17"/>
-              </w:rPr>
-              <w:t>human_review</w:t>
-            </w:r>
-          </w:p>
-        </w:tc>
-        <w:tc>
-          <w:tcPr>
-            <w:tcW w:type="dxa" w:w="1701"/>
-            <w:tcMar>
-              <w:top w:w="70" w:type="dxa"/>
-              <w:left w:w="90" w:type="dxa"/>
-              <w:bottom w:w="70" w:type="dxa"/>
-              <w:right w:w="90" w:type="dxa"/>
-            </w:tcMar>
-          </w:tcPr>
-          <w:p>
-            <w:pPr>
-              <w:spacing w:after="0" w:line="276" w:lineRule="auto"/>
-            </w:pPr>
-            <w:r>
-              <w:rPr>
-                <w:rFonts w:ascii="맑은 고딕" w:hAnsi="맑은 고딕" w:eastAsia="맑은 고딕" w:cs="맑은 고딕"/>
-                <w:b w:val="0"/>
-                <w:sz w:val="17"/>
-              </w:rPr>
-              <w:t>라우터</w:t>
-            </w:r>
-          </w:p>
-        </w:tc>
-        <w:tc>
-          <w:tcPr>
-            <w:tcW w:type="dxa" w:w="2438"/>
-            <w:tcMar>
-              <w:top w:w="70" w:type="dxa"/>
-              <w:left w:w="90" w:type="dxa"/>
-              <w:bottom w:w="70" w:type="dxa"/>
-              <w:right w:w="90" w:type="dxa"/>
-            </w:tcMar>
-          </w:tcPr>
-          <w:p>
-            <w:pPr>
-              <w:spacing w:after="0" w:line="276" w:lineRule="auto"/>
-            </w:pPr>
-            <w:r>
-              <w:rPr>
-                <w:rFonts w:ascii="맑은 고딕" w:hAnsi="맑은 고딕" w:eastAsia="맑은 고딕" w:cs="맑은 고딕"/>
-                <w:b w:val="0"/>
-                <w:sz w:val="17"/>
-              </w:rPr>
-              <w:t>선정 재확인 횟수(최대 1)</w:t>
-            </w:r>
-          </w:p>
-        </w:tc>
-      </w:tr>
-      <w:tr>
-        <w:trPr>
-          <w:cantSplit/>
-        </w:trPr>
-        <w:tc>
-          <w:tcPr>
-            <w:tcW w:type="dxa" w:w="1871"/>
-            <w:tcMar>
-              <w:top w:w="70" w:type="dxa"/>
-              <w:left w:w="90" w:type="dxa"/>
-              <w:bottom w:w="70" w:type="dxa"/>
-              <w:right w:w="90" w:type="dxa"/>
-            </w:tcMar>
-          </w:tcPr>
-          <w:p>
-            <w:pPr>
-              <w:spacing w:after="0" w:line="276" w:lineRule="auto"/>
-            </w:pPr>
-            <w:r>
-              <w:rPr>
-                <w:rFonts w:ascii="D2Coding" w:hAnsi="D2Coding" w:eastAsia="맑은 고딕" w:cs="D2Coding"/>
-                <w:b w:val="0"/>
-                <w:color w:val="5B3FA0"/>
-                <w:sz w:val="16"/>
-              </w:rPr>
-              <w:t>selection_validation</w:t>
-            </w:r>
-          </w:p>
-        </w:tc>
-        <w:tc>
-          <w:tcPr>
-            <w:tcW w:type="dxa" w:w="1474"/>
-            <w:tcMar>
-              <w:top w:w="70" w:type="dxa"/>
-              <w:left w:w="90" w:type="dxa"/>
-              <w:bottom w:w="70" w:type="dxa"/>
-              <w:right w:w="90" w:type="dxa"/>
-            </w:tcMar>
-          </w:tcPr>
-          <w:p>
-            <w:pPr>
-              <w:spacing w:after="0" w:line="276" w:lineRule="auto"/>
-            </w:pPr>
-            <w:r>
-              <w:rPr>
-                <w:rFonts w:ascii="D2Coding" w:hAnsi="D2Coding" w:eastAsia="맑은 고딕" w:cs="D2Coding"/>
-                <w:b w:val="0"/>
-                <w:color w:val="5B3FA0"/>
-                <w:sz w:val="16"/>
-              </w:rPr>
-              <w:t>SelectionValidation</w:t>
-            </w:r>
-          </w:p>
-        </w:tc>
-        <w:tc>
-          <w:tcPr>
-            <w:tcW w:type="dxa" w:w="1587"/>
-            <w:tcMar>
-              <w:top w:w="70" w:type="dxa"/>
-              <w:left w:w="90" w:type="dxa"/>
-              <w:bottom w:w="70" w:type="dxa"/>
-              <w:right w:w="90" w:type="dxa"/>
-            </w:tcMar>
-          </w:tcPr>
-          <w:p>
-            <w:pPr>
-              <w:spacing w:after="0" w:line="276" w:lineRule="auto"/>
-            </w:pPr>
-            <w:r>
-              <w:rPr>
-                <w:rFonts w:ascii="맑은 고딕" w:hAnsi="맑은 고딕" w:eastAsia="맑은 고딕" w:cs="맑은 고딕"/>
-                <w:b w:val="0"/>
-                <w:sz w:val="17"/>
-              </w:rPr>
-              <w:t>selection_validator</w:t>
-            </w:r>
-          </w:p>
-        </w:tc>
-        <w:tc>
-          <w:tcPr>
-            <w:tcW w:type="dxa" w:w="1701"/>
-            <w:tcMar>
-              <w:top w:w="70" w:type="dxa"/>
-              <w:left w:w="90" w:type="dxa"/>
-              <w:bottom w:w="70" w:type="dxa"/>
-              <w:right w:w="90" w:type="dxa"/>
-            </w:tcMar>
-          </w:tcPr>
-          <w:p>
-            <w:pPr>
-              <w:spacing w:after="0" w:line="276" w:lineRule="auto"/>
-            </w:pPr>
-            <w:r>
-              <w:rPr>
-                <w:rFonts w:ascii="맑은 고딕" w:hAnsi="맑은 고딕" w:eastAsia="맑은 고딕" w:cs="맑은 고딕"/>
-                <w:b w:val="0"/>
-                <w:sz w:val="17"/>
-              </w:rPr>
-              <w:t>human_review, report_writer</w:t>
+              <w:t>report_writer</w:t>
             </w:r>
           </w:p>
         </w:tc>
@@ -26634,7 +28718,7 @@
                 <w:color w:val="2B2F4A"/>
                 <w:sz w:val="15"/>
               </w:rPr>
-              <w:t xml:space="preserve">                     source_group(eTLD+1 or vendor group), attempt}</w:t>
+              <w:t xml:space="preserve">                     source_group(eTLD+1 or vendor group), origin_group(원 출처 계열), attempt}</w:t>
             </w:r>
           </w:p>
           <w:p>
@@ -26718,7 +28802,7 @@
                 <w:color w:val="2B2F4A"/>
                 <w:sz w:val="15"/>
               </w:rPr>
-              <w:t xml:space="preserve">                     unsupported_claim_ids, checks{max_group_share, pro_count, con_count, lexicon_hits}}</w:t>
+              <w:t xml:space="preserve">                     unsupported_claim_ids, checks{max_origin_share, pro_origins, con_origins, lexicon_hits}}</w:t>
             </w:r>
           </w:p>
         </w:tc>
@@ -26763,7 +28847,7 @@
           <w:color w:val="161A58"/>
           <w:sz w:val="20"/>
         </w:rPr>
-        <w:t>초기화 → 선정 검증 → 공통 RAG(Loop) → 기술 조사 → 4개 관점 병렬 평가(Fan-out) → 종합(Fan-in) → Judge → retry_router(Branch·선택적 재실행) → 보고서 생성·검수(Loop) → PDF</w:t>
+        <w:t>Human 선정(2안) → 초기화 → 선정 검증(기록만) → 공통 RAG(Loop) → 기술 조사 → 4개 관점 병렬 평가(Fan-out) → 종합(Fan-in) → Judge → retry_router(Branch·선택적 재실행) → 보고서 생성·검수(Loop) → PDF</w:t>
       </w:r>
       <w:r>
         <w:rPr>
@@ -26866,7 +28950,7 @@
       <w:r>
         <w:drawing>
           <wp:inline xmlns:a="http://schemas.openxmlformats.org/drawingml/2006/main" xmlns:pic="http://schemas.openxmlformats.org/drawingml/2006/picture">
-            <wp:extent cx="5688000" cy="9116233"/>
+            <wp:extent cx="5688000" cy="8238047"/>
             <wp:docPr id="3" name="Picture 3"/>
             <wp:cNvGraphicFramePr>
               <a:graphicFrameLocks noChangeAspect="1"/>
@@ -26887,7 +28971,7 @@
                   <pic:spPr>
                     <a:xfrm>
                       <a:off x="0" y="0"/>
-                      <a:ext cx="5688000" cy="9116233"/>
+                      <a:ext cx="5688000" cy="8238047"/>
                     </a:xfrm>
                     <a:prstGeom prst="rect"/>
                   </pic:spPr>
@@ -27003,15 +29087,15 @@
           <w:color w:val="161A58"/>
           <w:sz w:val="20"/>
         </w:rPr>
-        <w:t>선정 검증 분기:</w:t>
-      </w:r>
-      <w:r>
-        <w:rPr>
-          <w:rFonts w:ascii="맑은 고딕" w:hAnsi="맑은 고딕" w:eastAsia="맑은 고딕" w:cs="맑은 고딕"/>
-          <w:b w:val="0"/>
-          <w:sz w:val="20"/>
-        </w:rPr>
-        <w:t xml:space="preserve"> 세 항목이 모두 충족되면 </w:t>
+        <w:t>선정 검증(분기 없음):</w:t>
+      </w:r>
+      <w:r>
+        <w:rPr>
+          <w:rFonts w:ascii="맑은 고딕" w:hAnsi="맑은 고딕" w:eastAsia="맑은 고딕" w:cs="맑은 고딕"/>
+          <w:b w:val="0"/>
+          <w:sz w:val="20"/>
+        </w:rPr>
+        <w:t xml:space="preserve"> </w:t>
       </w:r>
       <w:r>
         <w:rPr>
@@ -27020,15 +29104,15 @@
           <w:color w:val="5B3FA0"/>
           <w:sz w:val="19"/>
         </w:rPr>
-        <w:t>index_builder</w:t>
-      </w:r>
-      <w:r>
-        <w:rPr>
-          <w:rFonts w:ascii="맑은 고딕" w:hAnsi="맑은 고딕" w:eastAsia="맑은 고딕" w:cs="맑은 고딕"/>
-          <w:b w:val="0"/>
-          <w:sz w:val="20"/>
-        </w:rPr>
-        <w:t xml:space="preserve">로 간다. 미충족이고 </w:t>
+        <w:t>selection_validator</w:t>
+      </w:r>
+      <w:r>
+        <w:rPr>
+          <w:rFonts w:ascii="맑은 고딕" w:hAnsi="맑은 고딕" w:eastAsia="맑은 고딕" w:cs="맑은 고딕"/>
+          <w:b w:val="0"/>
+          <w:sz w:val="20"/>
+        </w:rPr>
+        <w:t xml:space="preserve">는 검증 결과를 </w:t>
       </w:r>
       <w:r>
         <w:rPr>
@@ -27037,15 +29121,15 @@
           <w:color w:val="5B3FA0"/>
           <w:sz w:val="19"/>
         </w:rPr>
-        <w:t>selection_review_count &lt; 1</w:t>
-      </w:r>
-      <w:r>
-        <w:rPr>
-          <w:rFonts w:ascii="맑은 고딕" w:hAnsi="맑은 고딕" w:eastAsia="맑은 고딕" w:cs="맑은 고딕"/>
-          <w:b w:val="0"/>
-          <w:sz w:val="20"/>
-        </w:rPr>
-        <w:t xml:space="preserve">이면 </w:t>
+        <w:t>selection_validation</w:t>
+      </w:r>
+      <w:r>
+        <w:rPr>
+          <w:rFonts w:ascii="맑은 고딕" w:hAnsi="맑은 고딕" w:eastAsia="맑은 고딕" w:cs="맑은 고딕"/>
+          <w:b w:val="0"/>
+          <w:sz w:val="20"/>
+        </w:rPr>
+        <w:t xml:space="preserve">에 쓰고, 미충족 항목은 </w:t>
       </w:r>
       <w:r>
         <w:rPr>
@@ -27054,15 +29138,15 @@
           <w:color w:val="5B3FA0"/>
           <w:sz w:val="19"/>
         </w:rPr>
-        <w:t>human_review</w:t>
-      </w:r>
-      <w:r>
-        <w:rPr>
-          <w:rFonts w:ascii="맑은 고딕" w:hAnsi="맑은 고딕" w:eastAsia="맑은 고딕" w:cs="맑은 고딕"/>
-          <w:b w:val="0"/>
-          <w:sz w:val="20"/>
-        </w:rPr>
-        <w:t xml:space="preserve">로 간다. </w:t>
+        <w:t>warnings</w:t>
+      </w:r>
+      <w:r>
+        <w:rPr>
+          <w:rFonts w:ascii="맑은 고딕" w:hAnsi="맑은 고딕" w:eastAsia="맑은 고딕" w:cs="맑은 고딕"/>
+          <w:b w:val="0"/>
+          <w:sz w:val="20"/>
+        </w:rPr>
+        <w:t xml:space="preserve">에 기록한 뒤 항상 </w:t>
       </w:r>
       <w:r>
         <w:rPr>
@@ -27071,49 +29155,15 @@
           <w:color w:val="5B3FA0"/>
           <w:sz w:val="19"/>
         </w:rPr>
-        <w:t>--interactive</w:t>
-      </w:r>
-      <w:r>
-        <w:rPr>
-          <w:rFonts w:ascii="맑은 고딕" w:hAnsi="맑은 고딕" w:eastAsia="맑은 고딕" w:cs="맑은 고딕"/>
-          <w:b w:val="0"/>
-          <w:sz w:val="20"/>
-        </w:rPr>
-        <w:t xml:space="preserve">에서는 LangGraph </w:t>
-      </w:r>
-      <w:r>
-        <w:rPr>
-          <w:rFonts w:ascii="D2Coding" w:hAnsi="D2Coding" w:eastAsia="맑은 고딕" w:cs="D2Coding"/>
-          <w:b w:val="0"/>
-          <w:color w:val="5B3FA0"/>
-          <w:sz w:val="19"/>
-        </w:rPr>
-        <w:t>interrupt</w:t>
-      </w:r>
-      <w:r>
-        <w:rPr>
-          <w:rFonts w:ascii="맑은 고딕" w:hAnsi="맑은 고딕" w:eastAsia="맑은 고딕" w:cs="맑은 고딕"/>
-          <w:b w:val="0"/>
-          <w:sz w:val="20"/>
-        </w:rPr>
-        <w:t xml:space="preserve">로 사람이 확인한다. 사람이 기술을 바꾸면 </w:t>
-      </w:r>
-      <w:r>
-        <w:rPr>
-          <w:rFonts w:ascii="D2Coding" w:hAnsi="D2Coding" w:eastAsia="맑은 고딕" w:cs="D2Coding"/>
-          <w:b w:val="0"/>
-          <w:color w:val="5B3FA0"/>
-          <w:sz w:val="19"/>
-        </w:rPr>
-        <w:t>selection_override</w:t>
-      </w:r>
-      <w:r>
-        <w:rPr>
-          <w:rFonts w:ascii="맑은 고딕" w:hAnsi="맑은 고딕" w:eastAsia="맑은 고딕" w:cs="맑은 고딕"/>
-          <w:b w:val="0"/>
-          <w:sz w:val="20"/>
-        </w:rPr>
-        <w:t>를 쓰고 다시 검증하며, 이 재검증은 1회까지이다. 기본 실행에서는 기존 선정을 유지하고 경고를 기록한 뒤 진행한다(자동 재현성 확보). 어느 경우든 검증 결과는 보고서 2.4절에 실린다.</w:t>
+        <w:t>index_builder</w:t>
+      </w:r>
+      <w:r>
+        <w:rPr>
+          <w:rFonts w:ascii="맑은 고딕" w:hAnsi="맑은 고딕" w:eastAsia="맑은 고딕" w:cs="맑은 고딕"/>
+          <w:b w:val="0"/>
+          <w:sz w:val="20"/>
+        </w:rPr>
+        <w:t>로 진행한다. 2안(Human 선정)이므로 그래프 안에서 기술을 바꾸지 않는다(자동 재현성 확보). 검증 결과는 보고서 2.4절에 실린다.</w:t>
       </w:r>
     </w:p>
     <w:p>
@@ -27890,7 +29940,7 @@
           <w:b w:val="0"/>
           <w:sz w:val="20"/>
         </w:rPr>
-        <w:t xml:space="preserve"> 루프 5개 모두에 횟수 한도가 있다. 선정 재확인 1, 공통 검색 2, 관점 내부 2, 관점별 재실행 2, 보고서 수정 1이다. 최악의 경우에도 그래프가 반드시 끝난다.</w:t>
+        <w:t xml:space="preserve"> 루프 4개 모두에 횟수 한도가 있다. 공통 검색 2, 관점 내부 2, 관점별 재실행 2, 보고서 수정 1이다. 최악의 경우에도 그래프가 반드시 끝난다.</w:t>
       </w:r>
     </w:p>
     <w:p>
@@ -28002,7 +30052,7 @@
                 <w:color w:val="2B2F4A"/>
                 <w:sz w:val="15"/>
               </w:rPr>
-              <w:t xml:space="preserve">         and max_group_share &lt;= 0.50 and pro_count &gt;= 2 and con_count &gt;= 2 and lexicon_hits == 0</w:t>
+              <w:t xml:space="preserve">         and max_origin_share &lt;= 0.50 and pro_origins &gt;= 2 and con_origins &gt;= 2 and lexicon_hits == 0</w:t>
             </w:r>
           </w:p>
         </w:tc>
@@ -28339,7 +30389,7 @@
                 <w:b w:val="0"/>
                 <w:sz w:val="17"/>
               </w:rPr>
-              <w:t xml:space="preserve"> 코드 검사에서 벤더 출처군 비중 ≤ 50%</w:t>
+              <w:t xml:space="preserve"> 코드 검사에서 원 출처 계열 비중 ≤ 50%</w:t>
             </w:r>
           </w:p>
         </w:tc>
@@ -28510,7 +30560,7 @@
                 <w:b w:val="0"/>
                 <w:sz w:val="17"/>
               </w:rPr>
-              <w:t xml:space="preserve"> 근거 pro ≥ 2, con ≥ 2</w:t>
+              <w:t xml:space="preserve"> 근거의 독립 계열 수 pro ≥ 2, con ≥ 2</w:t>
             </w:r>
           </w:p>
         </w:tc>
@@ -29943,24 +31993,7 @@
                 <w:b w:val="0"/>
                 <w:sz w:val="17"/>
               </w:rPr>
-              <w:t xml:space="preserve">bge-m3: Hit@1 0.548 · Hit@5 0.905 · MRR 0.703 (후보 4종 중 최고, </w:t>
-            </w:r>
-            <w:r>
-              <w:rPr>
-                <w:rFonts w:ascii="D2Coding" w:hAnsi="D2Coding" w:eastAsia="맑은 고딕" w:cs="D2Coding"/>
-                <w:b w:val="0"/>
-                <w:color w:val="5B3FA0"/>
-                <w:sz w:val="16"/>
-              </w:rPr>
-              <w:t>max_seq_length</w:t>
-            </w:r>
-            <w:r>
-              <w:rPr>
-                <w:rFonts w:ascii="맑은 고딕" w:hAnsi="맑은 고딕" w:eastAsia="맑은 고딕" w:cs="맑은 고딕"/>
-                <w:b w:val="0"/>
-                <w:sz w:val="17"/>
-              </w:rPr>
-              <w:t xml:space="preserve"> 1,024 조건)</w:t>
+              <w:t>bge-m3(후보 4종 중 최고). v1(1,024): Hit@1 0.548 · Hit@5 0.905 · MRR 0.703 / v2(2,048): Hit@1 0.524 · MRR 0.691. 개발 지표</w:t>
             </w:r>
           </w:p>
         </w:tc>
@@ -30038,7 +32071,7 @@
                 <w:b w:val="0"/>
                 <w:sz w:val="17"/>
               </w:rPr>
-              <w:t>3중 하이브리드 + reranker: Hit@1 0.786 · Hit@5 0.976 · MRR 0.863</w:t>
+              <w:t>3중 하이브리드 + reranker. v1: Hit@1 0.786 · Hit@5 0.976 · MRR 0.863 / v2: Hit@1 0.786 · Hit@5 0.976 · MRR 0.863. 개발 지표(v2는 하한값)</w:t>
             </w:r>
           </w:p>
         </w:tc>
@@ -30063,7 +32096,24 @@
                 <w:color w:val="5B3FA0"/>
                 <w:sz w:val="16"/>
               </w:rPr>
-              <w:t>outputs/eval/retrieval_config_eval.csv</w:t>
+              <w:t>outputs/eval/</w:t>
+            </w:r>
+            <w:r>
+              <w:rPr>
+                <w:rFonts w:ascii="맑은 고딕" w:hAnsi="맑은 고딕" w:eastAsia="맑은 고딕" w:cs="맑은 고딕"/>
+                <w:b w:val="0"/>
+                <w:sz w:val="17"/>
+              </w:rPr>
+              <w:t xml:space="preserve">, </w:t>
+            </w:r>
+            <w:r>
+              <w:rPr>
+                <w:rFonts w:ascii="D2Coding" w:hAnsi="D2Coding" w:eastAsia="맑은 고딕" w:cs="D2Coding"/>
+                <w:b w:val="0"/>
+                <w:color w:val="5B3FA0"/>
+                <w:sz w:val="16"/>
+              </w:rPr>
+              <w:t>outputs/eval/v2_maxlen2048/</w:t>
             </w:r>
           </w:p>
         </w:tc>
@@ -30922,7 +32972,7 @@
                 <w:b w:val="0"/>
                 <w:sz w:val="17"/>
               </w:rPr>
-              <w:t>reranker 지연(질의당 약 4.7초)</w:t>
+              <w:t>reranker 지연(질의당 약 4.5초)</w:t>
             </w:r>
           </w:p>
         </w:tc>
@@ -31725,7 +33775,7 @@
                 <w:color w:val="2B2F4A"/>
                 <w:sz w:val="15"/>
               </w:rPr>
-              <w:t xml:space="preserve">    INIT["START → initialize"] --&gt; VAL["selection_validator&lt;br/&gt;① 선정 검증"]</w:t>
+              <w:t xml:space="preserve">    H0(["Human 선정 (2안)&lt;br/&gt;config · --tech"]) --&gt; INIT["initialize"]</w:t>
             </w:r>
           </w:p>
           <w:p>
@@ -31739,7 +33789,7 @@
                 <w:color w:val="2B2F4A"/>
                 <w:sz w:val="15"/>
               </w:rPr>
-              <w:t xml:space="preserve">    VAL --&gt; VQ{{"충족?"}}</w:t>
+              <w:t xml:space="preserve">    INIT --&gt; VAL["selection_validator&lt;br/&gt;① 선정 검증 · 결과 기록"]</w:t>
             </w:r>
           </w:p>
           <w:p>
@@ -31753,7 +33803,7 @@
                 <w:color w:val="2B2F4A"/>
                 <w:sz w:val="15"/>
               </w:rPr>
-              <w:t xml:space="preserve">    VQ --&gt;|"미충족"| HUM["human_review&lt;br/&gt;(최대 1회)"]</w:t>
+              <w:t xml:space="preserve">    VAL --&gt; CR["index_builder →&lt;br/&gt;공통 RAG Loop ≤2 (2b-a)"]</w:t>
             </w:r>
           </w:p>
           <w:p>
@@ -31767,7 +33817,7 @@
                 <w:color w:val="2B2F4A"/>
                 <w:sz w:val="15"/>
               </w:rPr>
-              <w:t xml:space="preserve">    HUM --&gt;|"변경"| VAL</w:t>
+              <w:t xml:space="preserve">    CR --&gt; TR["tech_research&lt;br/&gt;② 개요·한계"]</w:t>
             </w:r>
           </w:p>
           <w:p>
@@ -31781,7 +33831,7 @@
                 <w:color w:val="2B2F4A"/>
                 <w:sz w:val="15"/>
               </w:rPr>
-              <w:t xml:space="preserve">    HUM --&gt;|"유지·경고"| CR</w:t>
+              <w:t xml:space="preserve">    subgraph FAN[" "]</w:t>
             </w:r>
           </w:p>
           <w:p>
@@ -31795,7 +33845,7 @@
                 <w:color w:val="2B2F4A"/>
                 <w:sz w:val="15"/>
               </w:rPr>
-              <w:t xml:space="preserve">    VQ --&gt;|"충족"| CR["index_builder →&lt;br/&gt;공통 RAG Loop ≤2 (2b-a)"]</w:t>
+              <w:t xml:space="preserve">        direction LR</w:t>
             </w:r>
           </w:p>
           <w:p>
@@ -31809,7 +33859,7 @@
                 <w:color w:val="2B2F4A"/>
                 <w:sz w:val="15"/>
               </w:rPr>
-              <w:t xml:space="preserve">    CR --&gt; TR["tech_research&lt;br/&gt;② 개요·한계"]</w:t>
+              <w:t xml:space="preserve">        TRL["trl_assessor&lt;br/&gt;③ TRL"]</w:t>
             </w:r>
           </w:p>
           <w:p>
@@ -31823,7 +33873,7 @@
                 <w:color w:val="2B2F4A"/>
                 <w:sz w:val="15"/>
               </w:rPr>
-              <w:t xml:space="preserve">    subgraph FAN[" "]</w:t>
+              <w:t xml:space="preserve">        MK["market_&lt;br/&gt;evaluator"]</w:t>
             </w:r>
           </w:p>
           <w:p>
@@ -31837,7 +33887,7 @@
                 <w:color w:val="2B2F4A"/>
                 <w:sz w:val="15"/>
               </w:rPr>
-              <w:t xml:space="preserve">        direction LR</w:t>
+              <w:t xml:space="preserve">        SH["stakeholder_&lt;br/&gt;evaluator"]</w:t>
             </w:r>
           </w:p>
           <w:p>
@@ -31851,7 +33901,7 @@
                 <w:color w:val="2B2F4A"/>
                 <w:sz w:val="15"/>
               </w:rPr>
-              <w:t xml:space="preserve">        TRL["trl_assessor&lt;br/&gt;③ TRL"]</w:t>
+              <w:t xml:space="preserve">        DM["domain_&lt;br/&gt;evaluator"]</w:t>
             </w:r>
           </w:p>
           <w:p>
@@ -31865,7 +33915,7 @@
                 <w:color w:val="2B2F4A"/>
                 <w:sz w:val="15"/>
               </w:rPr>
-              <w:t xml:space="preserve">        MK["market_&lt;br/&gt;evaluator"]</w:t>
+              <w:t xml:space="preserve">    end</w:t>
             </w:r>
           </w:p>
           <w:p>
@@ -31879,7 +33929,7 @@
                 <w:color w:val="2B2F4A"/>
                 <w:sz w:val="15"/>
               </w:rPr>
-              <w:t xml:space="preserve">        SH["stakeholder_&lt;br/&gt;evaluator"]</w:t>
+              <w:t xml:space="preserve">    TR --&gt; TRL &amp; MK &amp; SH &amp; DM</w:t>
             </w:r>
           </w:p>
           <w:p>
@@ -31893,7 +33943,7 @@
                 <w:color w:val="2B2F4A"/>
                 <w:sz w:val="15"/>
               </w:rPr>
-              <w:t xml:space="preserve">        DM["domain_&lt;br/&gt;evaluator"]</w:t>
+              <w:t xml:space="preserve">    TRL &amp; MK &amp; SH &amp; DM --&gt; SY["synthesizer&lt;br/&gt;Fan-in (defer)"]</w:t>
             </w:r>
           </w:p>
           <w:p>
@@ -31907,7 +33957,7 @@
                 <w:color w:val="2B2F4A"/>
                 <w:sz w:val="15"/>
               </w:rPr>
-              <w:t xml:space="preserve">    end</w:t>
+              <w:t xml:space="preserve">    SY --&gt; JD["judge"]</w:t>
             </w:r>
           </w:p>
           <w:p>
@@ -31921,7 +33971,7 @@
                 <w:color w:val="2B2F4A"/>
                 <w:sz w:val="15"/>
               </w:rPr>
-              <w:t xml:space="preserve">    TR --&gt; TRL &amp; MK &amp; SH &amp; DM</w:t>
+              <w:t xml:space="preserve">    JD --&gt; RR{{"retry_router&lt;br/&gt;미달·retry&lt;2?"}}</w:t>
             </w:r>
           </w:p>
           <w:p>
@@ -31935,7 +33985,7 @@
                 <w:color w:val="2B2F4A"/>
                 <w:sz w:val="15"/>
               </w:rPr>
-              <w:t xml:space="preserve">    TRL &amp; MK &amp; SH &amp; DM --&gt; SY["synthesizer&lt;br/&gt;Fan-in (defer)"]</w:t>
+              <w:t xml:space="preserve">    subgraph RERUN[" "]</w:t>
             </w:r>
           </w:p>
           <w:p>
@@ -31949,7 +33999,7 @@
                 <w:color w:val="2B2F4A"/>
                 <w:sz w:val="15"/>
               </w:rPr>
-              <w:t xml:space="preserve">    SY --&gt; JD["judge"]</w:t>
+              <w:t xml:space="preserve">        direction LR</w:t>
             </w:r>
           </w:p>
           <w:p>
@@ -31963,7 +34013,7 @@
                 <w:color w:val="2B2F4A"/>
                 <w:sz w:val="15"/>
               </w:rPr>
-              <w:t xml:space="preserve">    JD --&gt; RR{{"retry_router&lt;br/&gt;미달·retry&lt;2?"}}</w:t>
+              <w:t xml:space="preserve">        R1["↺ TRL"]</w:t>
             </w:r>
           </w:p>
           <w:p>
@@ -31977,7 +34027,7 @@
                 <w:color w:val="2B2F4A"/>
                 <w:sz w:val="15"/>
               </w:rPr>
-              <w:t xml:space="preserve">    subgraph RERUN[" "]</w:t>
+              <w:t xml:space="preserve">        R2["↺ 시장"]</w:t>
             </w:r>
           </w:p>
           <w:p>
@@ -31991,7 +34041,7 @@
                 <w:color w:val="2B2F4A"/>
                 <w:sz w:val="15"/>
               </w:rPr>
-              <w:t xml:space="preserve">        direction LR</w:t>
+              <w:t xml:space="preserve">        R3["↺ 이해관계자"]</w:t>
             </w:r>
           </w:p>
           <w:p>
@@ -32005,7 +34055,7 @@
                 <w:color w:val="2B2F4A"/>
                 <w:sz w:val="15"/>
               </w:rPr>
-              <w:t xml:space="preserve">        R1["↺ TRL"]</w:t>
+              <w:t xml:space="preserve">        R4["↺ 도메인"]</w:t>
             </w:r>
           </w:p>
           <w:p>
@@ -32019,7 +34069,7 @@
                 <w:color w:val="2B2F4A"/>
                 <w:sz w:val="15"/>
               </w:rPr>
-              <w:t xml:space="preserve">        R2["↺ 시장"]</w:t>
+              <w:t xml:space="preserve">    end</w:t>
             </w:r>
           </w:p>
           <w:p>
@@ -32033,7 +34083,7 @@
                 <w:color w:val="2B2F4A"/>
                 <w:sz w:val="15"/>
               </w:rPr>
-              <w:t xml:space="preserve">        R3["↺ 이해관계자"]</w:t>
+              <w:t xml:space="preserve">    RR -.-&gt;|"Send·failed 포함 시"| R1</w:t>
             </w:r>
           </w:p>
           <w:p>
@@ -32047,7 +34097,7 @@
                 <w:color w:val="2B2F4A"/>
                 <w:sz w:val="15"/>
               </w:rPr>
-              <w:t xml:space="preserve">        R4["↺ 도메인"]</w:t>
+              <w:t xml:space="preserve">    RR -.-&gt;|"Send"| R2</w:t>
             </w:r>
           </w:p>
           <w:p>
@@ -32061,7 +34111,7 @@
                 <w:color w:val="2B2F4A"/>
                 <w:sz w:val="15"/>
               </w:rPr>
-              <w:t xml:space="preserve">    end</w:t>
+              <w:t xml:space="preserve">    RR -.-&gt;|"Send"| R3</w:t>
             </w:r>
           </w:p>
           <w:p>
@@ -32075,7 +34125,7 @@
                 <w:color w:val="2B2F4A"/>
                 <w:sz w:val="15"/>
               </w:rPr>
-              <w:t xml:space="preserve">    RR -.-&gt;|"Send·failed 포함 시"| R1</w:t>
+              <w:t xml:space="preserve">    RR -.-&gt;|"Send"| R4</w:t>
             </w:r>
           </w:p>
           <w:p>
@@ -32089,7 +34139,7 @@
                 <w:color w:val="2B2F4A"/>
                 <w:sz w:val="15"/>
               </w:rPr>
-              <w:t xml:space="preserve">    RR -.-&gt;|"Send"| R2</w:t>
+              <w:t xml:space="preserve">    RR --&gt;|"없음·한도→판정 불확실"| RWR["report_writer"]</w:t>
             </w:r>
           </w:p>
           <w:p>
@@ -32103,7 +34153,7 @@
                 <w:color w:val="2B2F4A"/>
                 <w:sz w:val="15"/>
               </w:rPr>
-              <w:t xml:space="preserve">    RR -.-&gt;|"Send"| R3</w:t>
+              <w:t xml:space="preserve">    RWR --&gt; FC{{"final_check"}}</w:t>
             </w:r>
           </w:p>
           <w:p>
@@ -32117,7 +34167,7 @@
                 <w:color w:val="2B2F4A"/>
                 <w:sz w:val="15"/>
               </w:rPr>
-              <w:t xml:space="preserve">    RR -.-&gt;|"Send"| R4</w:t>
+              <w:t xml:space="preserve">    FC --&gt;|"수정 ≤1"| RWR</w:t>
             </w:r>
           </w:p>
           <w:p>
@@ -32131,7 +34181,7 @@
                 <w:color w:val="2B2F4A"/>
                 <w:sz w:val="15"/>
               </w:rPr>
-              <w:t xml:space="preserve">    RR --&gt;|"없음·한도→판정 불확실"| RWR["report_writer"]</w:t>
+              <w:t xml:space="preserve">    FC --&gt;|"통과"| PDF["pdf_renderer → END"]</w:t>
             </w:r>
           </w:p>
           <w:p>
@@ -32145,7 +34195,7 @@
                 <w:color w:val="2B2F4A"/>
                 <w:sz w:val="15"/>
               </w:rPr>
-              <w:t xml:space="preserve">    RWR --&gt; FC{{"final_check"}}</w:t>
+              <w:t xml:space="preserve">    classDef agent fill:#EEE8FA,stroke:#7F4ACB,color:#161A58;</w:t>
             </w:r>
           </w:p>
           <w:p>
@@ -32159,7 +34209,7 @@
                 <w:color w:val="2B2F4A"/>
                 <w:sz w:val="15"/>
               </w:rPr>
-              <w:t xml:space="preserve">    FC --&gt;|"수정 ≤1"| RWR</w:t>
+              <w:t xml:space="preserve">    classDef util fill:#F2F3F8,stroke:#9AA0B8,color:#161A58;</w:t>
             </w:r>
           </w:p>
           <w:p>
@@ -32173,7 +34223,7 @@
                 <w:color w:val="2B2F4A"/>
                 <w:sz w:val="15"/>
               </w:rPr>
-              <w:t xml:space="preserve">    FC --&gt;|"통과"| PDF["pdf_renderer → END"]</w:t>
+              <w:t xml:space="preserve">    classDef human fill:#E8F4EC,stroke:#2E7D4F,color:#16381F;</w:t>
             </w:r>
           </w:p>
           <w:p>
@@ -32187,7 +34237,7 @@
                 <w:color w:val="2B2F4A"/>
                 <w:sz w:val="15"/>
               </w:rPr>
-              <w:t xml:space="preserve">    classDef agent fill:#EEE8FA,stroke:#7F4ACB,color:#161A58;</w:t>
+              <w:t xml:space="preserve">    classDef gate fill:#FFF6E5,stroke:#D08A00,color:#3A2A00;</w:t>
             </w:r>
           </w:p>
           <w:p>
@@ -32201,7 +34251,7 @@
                 <w:color w:val="2B2F4A"/>
                 <w:sz w:val="15"/>
               </w:rPr>
-              <w:t xml:space="preserve">    classDef util fill:#F2F3F8,stroke:#9AA0B8,color:#161A58;</w:t>
+              <w:t xml:space="preserve">    class VAL,TR,TRL,MK,SH,DM,SY,JD,RWR,R1,R2,R3,R4 agent;</w:t>
             </w:r>
           </w:p>
           <w:p>
@@ -32215,7 +34265,7 @@
                 <w:color w:val="2B2F4A"/>
                 <w:sz w:val="15"/>
               </w:rPr>
-              <w:t xml:space="preserve">    classDef gate fill:#FFF6E5,stroke:#D08A00,color:#3A2A00;</w:t>
+              <w:t xml:space="preserve">    class INIT,CR,PDF util;</w:t>
             </w:r>
           </w:p>
           <w:p>
@@ -32229,7 +34279,7 @@
                 <w:color w:val="2B2F4A"/>
                 <w:sz w:val="15"/>
               </w:rPr>
-              <w:t xml:space="preserve">    class VAL,TR,TRL,MK,SH,DM,SY,JD,RWR,R1,R2,R3,R4 agent;</w:t>
+              <w:t xml:space="preserve">    class H0 human;</w:t>
             </w:r>
           </w:p>
           <w:p>
@@ -32243,21 +34293,7 @@
                 <w:color w:val="2B2F4A"/>
                 <w:sz w:val="15"/>
               </w:rPr>
-              <w:t xml:space="preserve">    class INIT,HUM,CR,PDF util;</w:t>
-            </w:r>
-          </w:p>
-          <w:p>
-            <w:pPr>
-              <w:spacing w:after="0" w:line="240" w:lineRule="auto"/>
-            </w:pPr>
-            <w:r>
-              <w:rPr>
-                <w:rFonts w:ascii="D2Coding" w:hAnsi="D2Coding" w:eastAsia="맑은 고딕" w:cs="D2Coding"/>
-                <w:b w:val="0"/>
-                <w:color w:val="2B2F4A"/>
-                <w:sz w:val="15"/>
-              </w:rPr>
-              <w:t xml:space="preserve">    class VQ,RR,FC gate;</w:t>
+              <w:t xml:space="preserve">    class RR,FC gate;</w:t>
             </w:r>
           </w:p>
           <w:p>
@@ -32830,7 +34866,7 @@
           <w:color w:val="161A58"/>
           <w:sz w:val="30"/>
         </w:rPr>
-        <w:t>부록 B. 개정 이력 (v1.0 → v1.1)</w:t>
+        <w:t>부록 B. 개정 이력 (v1.0 → v1.1 → v1.2)</w:t>
       </w:r>
     </w:p>
     <w:tbl>
@@ -34425,6 +36461,674 @@
                 <w:sz w:val="17"/>
               </w:rPr>
               <w:t>측정 조건 점검 행, Lessons ④, 리스크 3행(개발/테스트 미분리, 같은 계열 Judge, 소속 편향) 추가</w:t>
+            </w:r>
+          </w:p>
+        </w:tc>
+      </w:tr>
+      <w:tr>
+        <w:trPr>
+          <w:cantSplit/>
+        </w:trPr>
+        <w:tc>
+          <w:tcPr>
+            <w:tcW w:type="dxa" w:w="1247"/>
+            <w:tcMar>
+              <w:top w:w="70" w:type="dxa"/>
+              <w:left w:w="90" w:type="dxa"/>
+              <w:bottom w:w="70" w:type="dxa"/>
+              <w:right w:w="90" w:type="dxa"/>
+            </w:tcMar>
+          </w:tcPr>
+          <w:p>
+            <w:pPr>
+              <w:spacing w:after="0" w:line="276" w:lineRule="auto"/>
+            </w:pPr>
+            <w:r>
+              <w:rPr>
+                <w:rFonts w:ascii="맑은 고딕" w:hAnsi="맑은 고딕" w:eastAsia="맑은 고딕" w:cs="맑은 고딕"/>
+                <w:b w:val="0"/>
+                <w:sz w:val="17"/>
+              </w:rPr>
+              <w:t>(v1.2) 요약·2.1.1</w:t>
+            </w:r>
+          </w:p>
+        </w:tc>
+        <w:tc>
+          <w:tcPr>
+            <w:tcW w:type="dxa" w:w="3061"/>
+            <w:tcMar>
+              <w:top w:w="70" w:type="dxa"/>
+              <w:left w:w="90" w:type="dxa"/>
+              <w:bottom w:w="70" w:type="dxa"/>
+              <w:right w:w="90" w:type="dxa"/>
+            </w:tcMar>
+          </w:tcPr>
+          <w:p>
+            <w:pPr>
+              <w:spacing w:after="0" w:line="276" w:lineRule="auto"/>
+            </w:pPr>
+            <w:r>
+              <w:rPr>
+                <w:rFonts w:ascii="맑은 고딕" w:hAnsi="맑은 고딕" w:eastAsia="맑은 고딕" w:cs="맑은 고딕"/>
+                <w:b w:val="0"/>
+                <w:sz w:val="17"/>
+              </w:rPr>
+              <w:t>비교 공정성 판단 질문 "(같은 적용 계층)"</w:t>
+            </w:r>
+          </w:p>
+        </w:tc>
+        <w:tc>
+          <w:tcPr>
+            <w:tcW w:type="dxa" w:w="4762"/>
+            <w:tcMar>
+              <w:top w:w="70" w:type="dxa"/>
+              <w:left w:w="90" w:type="dxa"/>
+              <w:bottom w:w="70" w:type="dxa"/>
+              <w:right w:w="90" w:type="dxa"/>
+            </w:tcMar>
+          </w:tcPr>
+          <w:p>
+            <w:pPr>
+              <w:spacing w:after="0" w:line="276" w:lineRule="auto"/>
+            </w:pPr>
+            <w:r>
+              <w:rPr>
+                <w:rFonts w:ascii="맑은 고딕" w:hAnsi="맑은 고딕" w:eastAsia="맑은 고딕" w:cs="맑은 고딕"/>
+                <w:b w:val="0"/>
+                <w:sz w:val="17"/>
+              </w:rPr>
+              <w:t>"</w:t>
+            </w:r>
+            <w:r>
+              <w:rPr>
+                <w:rFonts w:ascii="맑은 고딕" w:hAnsi="맑은 고딕" w:eastAsia="맑은 고딕" w:cs="맑은 고딕"/>
+                <w:b/>
+                <w:color w:val="161A58"/>
+                <w:sz w:val="17"/>
+              </w:rPr>
+              <w:t>동일한 적용 시점(추론·서빙 단계)</w:t>
+            </w:r>
+            <w:r>
+              <w:rPr>
+                <w:rFonts w:ascii="맑은 고딕" w:hAnsi="맑은 고딕" w:eastAsia="맑은 고딕" w:cs="맑은 고딕"/>
+                <w:b w:val="0"/>
+                <w:sz w:val="17"/>
+              </w:rPr>
+              <w:t>". 계층은 서로 다름(데이터 표현 vs 메모리)과 일관</w:t>
+            </w:r>
+          </w:p>
+        </w:tc>
+      </w:tr>
+      <w:tr>
+        <w:trPr>
+          <w:cantSplit/>
+        </w:trPr>
+        <w:tc>
+          <w:tcPr>
+            <w:tcW w:type="dxa" w:w="1247"/>
+            <w:tcMar>
+              <w:top w:w="70" w:type="dxa"/>
+              <w:left w:w="90" w:type="dxa"/>
+              <w:bottom w:w="70" w:type="dxa"/>
+              <w:right w:w="90" w:type="dxa"/>
+            </w:tcMar>
+          </w:tcPr>
+          <w:p>
+            <w:pPr>
+              <w:spacing w:after="0" w:line="276" w:lineRule="auto"/>
+            </w:pPr>
+            <w:r>
+              <w:rPr>
+                <w:rFonts w:ascii="맑은 고딕" w:hAnsi="맑은 고딕" w:eastAsia="맑은 고딕" w:cs="맑은 고딕"/>
+                <w:b w:val="0"/>
+                <w:sz w:val="17"/>
+              </w:rPr>
+              <w:t>(v1.2) 2.1.5·2.4</w:t>
+            </w:r>
+          </w:p>
+        </w:tc>
+        <w:tc>
+          <w:tcPr>
+            <w:tcW w:type="dxa" w:w="3061"/>
+            <w:tcMar>
+              <w:top w:w="70" w:type="dxa"/>
+              <w:left w:w="90" w:type="dxa"/>
+              <w:bottom w:w="70" w:type="dxa"/>
+              <w:right w:w="90" w:type="dxa"/>
+            </w:tcMar>
+          </w:tcPr>
+          <w:p>
+            <w:pPr>
+              <w:spacing w:after="0" w:line="276" w:lineRule="auto"/>
+            </w:pPr>
+            <w:r>
+              <w:rPr>
+                <w:rFonts w:ascii="D2Coding" w:hAnsi="D2Coding" w:eastAsia="맑은 고딕" w:cs="D2Coding"/>
+                <w:b w:val="0"/>
+                <w:color w:val="5B3FA0"/>
+                <w:sz w:val="16"/>
+              </w:rPr>
+              <w:t>human_review</w:t>
+            </w:r>
+            <w:r>
+              <w:rPr>
+                <w:rFonts w:ascii="맑은 고딕" w:hAnsi="맑은 고딕" w:eastAsia="맑은 고딕" w:cs="맑은 고딕"/>
+                <w:b w:val="0"/>
+                <w:sz w:val="17"/>
+              </w:rPr>
+              <w:t xml:space="preserve"> 재선정 분기(대화형, 최대 1회)</w:t>
+            </w:r>
+          </w:p>
+        </w:tc>
+        <w:tc>
+          <w:tcPr>
+            <w:tcW w:type="dxa" w:w="4762"/>
+            <w:tcMar>
+              <w:top w:w="70" w:type="dxa"/>
+              <w:left w:w="90" w:type="dxa"/>
+              <w:bottom w:w="70" w:type="dxa"/>
+              <w:right w:w="90" w:type="dxa"/>
+            </w:tcMar>
+          </w:tcPr>
+          <w:p>
+            <w:pPr>
+              <w:spacing w:after="0" w:line="276" w:lineRule="auto"/>
+            </w:pPr>
+            <w:r>
+              <w:rPr>
+                <w:rFonts w:ascii="맑은 고딕" w:hAnsi="맑은 고딕" w:eastAsia="맑은 고딕" w:cs="맑은 고딕"/>
+                <w:b/>
+                <w:color w:val="161A58"/>
+                <w:sz w:val="17"/>
+              </w:rPr>
+              <w:t>2안만 반영.</w:t>
+            </w:r>
+            <w:r>
+              <w:rPr>
+                <w:rFonts w:ascii="맑은 고딕" w:hAnsi="맑은 고딕" w:eastAsia="맑은 고딕" w:cs="맑은 고딕"/>
+                <w:b w:val="0"/>
+                <w:sz w:val="17"/>
+              </w:rPr>
+              <w:t xml:space="preserve"> 그래프 안에 재선정 분기 없음. 검증 결과는 기록만 하고 진행, 선정 변경은 팀이 </w:t>
+            </w:r>
+            <w:r>
+              <w:rPr>
+                <w:rFonts w:ascii="D2Coding" w:hAnsi="D2Coding" w:eastAsia="맑은 고딕" w:cs="D2Coding"/>
+                <w:b w:val="0"/>
+                <w:color w:val="5B3FA0"/>
+                <w:sz w:val="16"/>
+              </w:rPr>
+              <w:t>--tech</w:t>
+            </w:r>
+            <w:r>
+              <w:rPr>
+                <w:rFonts w:ascii="맑은 고딕" w:hAnsi="맑은 고딕" w:eastAsia="맑은 고딕" w:cs="맑은 고딕"/>
+                <w:b w:val="0"/>
+                <w:sz w:val="17"/>
+              </w:rPr>
+              <w:t xml:space="preserve">로 재실행. </w:t>
+            </w:r>
+            <w:r>
+              <w:rPr>
+                <w:rFonts w:ascii="D2Coding" w:hAnsi="D2Coding" w:eastAsia="맑은 고딕" w:cs="D2Coding"/>
+                <w:b w:val="0"/>
+                <w:color w:val="5B3FA0"/>
+                <w:sz w:val="16"/>
+              </w:rPr>
+              <w:t>selection_override</w:t>
+            </w:r>
+            <w:r>
+              <w:rPr>
+                <w:rFonts w:ascii="맑은 고딕" w:hAnsi="맑은 고딕" w:eastAsia="맑은 고딕" w:cs="맑은 고딕"/>
+                <w:b w:val="0"/>
+                <w:sz w:val="17"/>
+              </w:rPr>
+              <w:t>·</w:t>
+            </w:r>
+            <w:r>
+              <w:rPr>
+                <w:rFonts w:ascii="D2Coding" w:hAnsi="D2Coding" w:eastAsia="맑은 고딕" w:cs="D2Coding"/>
+                <w:b w:val="0"/>
+                <w:color w:val="5B3FA0"/>
+                <w:sz w:val="16"/>
+              </w:rPr>
+              <w:t>selection_review_count</w:t>
+            </w:r>
+            <w:r>
+              <w:rPr>
+                <w:rFonts w:ascii="맑은 고딕" w:hAnsi="맑은 고딕" w:eastAsia="맑은 고딕" w:cs="맑은 고딕"/>
+                <w:b w:val="0"/>
+                <w:sz w:val="17"/>
+              </w:rPr>
+              <w:t xml:space="preserve"> 삭제(키 29 → 27), 루프 5 → 4</w:t>
+            </w:r>
+          </w:p>
+        </w:tc>
+      </w:tr>
+      <w:tr>
+        <w:trPr>
+          <w:cantSplit/>
+        </w:trPr>
+        <w:tc>
+          <w:tcPr>
+            <w:tcW w:type="dxa" w:w="1247"/>
+            <w:tcMar>
+              <w:top w:w="70" w:type="dxa"/>
+              <w:left w:w="90" w:type="dxa"/>
+              <w:bottom w:w="70" w:type="dxa"/>
+              <w:right w:w="90" w:type="dxa"/>
+            </w:tcMar>
+          </w:tcPr>
+          <w:p>
+            <w:pPr>
+              <w:spacing w:after="0" w:line="276" w:lineRule="auto"/>
+            </w:pPr>
+            <w:r>
+              <w:rPr>
+                <w:rFonts w:ascii="맑은 고딕" w:hAnsi="맑은 고딕" w:eastAsia="맑은 고딕" w:cs="맑은 고딕"/>
+                <w:b w:val="0"/>
+                <w:sz w:val="17"/>
+              </w:rPr>
+              <w:t>(v1.2) 2.2.6</w:t>
+            </w:r>
+          </w:p>
+        </w:tc>
+        <w:tc>
+          <w:tcPr>
+            <w:tcW w:type="dxa" w:w="3061"/>
+            <w:tcMar>
+              <w:top w:w="70" w:type="dxa"/>
+              <w:left w:w="90" w:type="dxa"/>
+              <w:bottom w:w="70" w:type="dxa"/>
+              <w:right w:w="90" w:type="dxa"/>
+            </w:tcMar>
+          </w:tcPr>
+          <w:p>
+            <w:pPr>
+              <w:spacing w:after="0" w:line="276" w:lineRule="auto"/>
+            </w:pPr>
+            <w:r>
+              <w:rPr>
+                <w:rFonts w:ascii="맑은 고딕" w:hAnsi="맑은 고딕" w:eastAsia="맑은 고딕" w:cs="맑은 고딕"/>
+                <w:b w:val="0"/>
+                <w:sz w:val="17"/>
+              </w:rPr>
+              <w:t>수치의 성격 미표기, 구현 조건 미측정</w:t>
+            </w:r>
+          </w:p>
+        </w:tc>
+        <w:tc>
+          <w:tcPr>
+            <w:tcW w:type="dxa" w:w="4762"/>
+            <w:tcMar>
+              <w:top w:w="70" w:type="dxa"/>
+              <w:left w:w="90" w:type="dxa"/>
+              <w:bottom w:w="70" w:type="dxa"/>
+              <w:right w:w="90" w:type="dxa"/>
+            </w:tcMar>
+          </w:tcPr>
+          <w:p>
+            <w:pPr>
+              <w:spacing w:after="0" w:line="276" w:lineRule="auto"/>
+            </w:pPr>
+            <w:r>
+              <w:rPr>
+                <w:rFonts w:ascii="맑은 고딕" w:hAnsi="맑은 고딕" w:eastAsia="맑은 고딕" w:cs="맑은 고딕"/>
+                <w:b w:val="0"/>
+                <w:sz w:val="17"/>
+              </w:rPr>
+              <w:t xml:space="preserve">모든 수치를 </w:t>
+            </w:r>
+            <w:r>
+              <w:rPr>
+                <w:rFonts w:ascii="맑은 고딕" w:hAnsi="맑은 고딕" w:eastAsia="맑은 고딕" w:cs="맑은 고딕"/>
+                <w:b/>
+                <w:color w:val="161A58"/>
+                <w:sz w:val="17"/>
+              </w:rPr>
+              <w:t>개발 지표(구성 선택용 42문항)</w:t>
+            </w:r>
+            <w:r>
+              <w:rPr>
+                <w:rFonts w:ascii="맑은 고딕" w:hAnsi="맑은 고딕" w:eastAsia="맑은 고딕" w:cs="맑은 고딕"/>
+                <w:b w:val="0"/>
+                <w:sz w:val="17"/>
+              </w:rPr>
+              <w:t xml:space="preserve">로 명시. </w:t>
+            </w:r>
+            <w:r>
+              <w:rPr>
+                <w:rFonts w:ascii="맑은 고딕" w:hAnsi="맑은 고딕" w:eastAsia="맑은 고딕" w:cs="맑은 고딕"/>
+                <w:b/>
+                <w:color w:val="161A58"/>
+                <w:sz w:val="17"/>
+              </w:rPr>
+              <w:t>v2 재측정(2,048, 잘림 0건)</w:t>
+            </w:r>
+            <w:r>
+              <w:rPr>
+                <w:rFonts w:ascii="맑은 고딕" w:hAnsi="맑은 고딕" w:eastAsia="맑은 고딕" w:cs="맑은 고딕"/>
+                <w:b w:val="0"/>
+                <w:sz w:val="17"/>
+              </w:rPr>
+              <w:t xml:space="preserve"> 추가: bge-m3 MRR 0.703 → 0.691, 순위 불변, 채택 구성 Hit@5 0.976·MRR 0.863 동일(하한값)</w:t>
+            </w:r>
+          </w:p>
+        </w:tc>
+      </w:tr>
+      <w:tr>
+        <w:trPr>
+          <w:cantSplit/>
+        </w:trPr>
+        <w:tc>
+          <w:tcPr>
+            <w:tcW w:type="dxa" w:w="1247"/>
+            <w:tcMar>
+              <w:top w:w="70" w:type="dxa"/>
+              <w:left w:w="90" w:type="dxa"/>
+              <w:bottom w:w="70" w:type="dxa"/>
+              <w:right w:w="90" w:type="dxa"/>
+            </w:tcMar>
+          </w:tcPr>
+          <w:p>
+            <w:pPr>
+              <w:spacing w:after="0" w:line="276" w:lineRule="auto"/>
+            </w:pPr>
+            <w:r>
+              <w:rPr>
+                <w:rFonts w:ascii="맑은 고딕" w:hAnsi="맑은 고딕" w:eastAsia="맑은 고딕" w:cs="맑은 고딕"/>
+                <w:b w:val="0"/>
+                <w:sz w:val="17"/>
+              </w:rPr>
+              <w:t>(v1.2) 2.3.1</w:t>
+            </w:r>
+          </w:p>
+        </w:tc>
+        <w:tc>
+          <w:tcPr>
+            <w:tcW w:type="dxa" w:w="3061"/>
+            <w:tcMar>
+              <w:top w:w="70" w:type="dxa"/>
+              <w:left w:w="90" w:type="dxa"/>
+              <w:bottom w:w="70" w:type="dxa"/>
+              <w:right w:w="90" w:type="dxa"/>
+            </w:tcMar>
+          </w:tcPr>
+          <w:p>
+            <w:pPr>
+              <w:spacing w:after="0" w:line="276" w:lineRule="auto"/>
+            </w:pPr>
+            <w:r>
+              <w:rPr>
+                <w:rFonts w:ascii="맑은 고딕" w:hAnsi="맑은 고딕" w:eastAsia="맑은 고딕" w:cs="맑은 고딕"/>
+                <w:b w:val="0"/>
+                <w:sz w:val="17"/>
+              </w:rPr>
+              <w:t>출처 다양성: 도메인·벤더 출처군</w:t>
+            </w:r>
+          </w:p>
+        </w:tc>
+        <w:tc>
+          <w:tcPr>
+            <w:tcW w:type="dxa" w:w="4762"/>
+            <w:tcMar>
+              <w:top w:w="70" w:type="dxa"/>
+              <w:left w:w="90" w:type="dxa"/>
+              <w:bottom w:w="70" w:type="dxa"/>
+              <w:right w:w="90" w:type="dxa"/>
+            </w:tcMar>
+          </w:tcPr>
+          <w:p>
+            <w:pPr>
+              <w:spacing w:after="0" w:line="276" w:lineRule="auto"/>
+            </w:pPr>
+            <w:r>
+              <w:rPr>
+                <w:rFonts w:ascii="D2Coding" w:hAnsi="D2Coding" w:eastAsia="맑은 고딕" w:cs="D2Coding"/>
+                <w:b w:val="0"/>
+                <w:color w:val="5B3FA0"/>
+                <w:sz w:val="16"/>
+              </w:rPr>
+              <w:t>origin_group</w:t>
+            </w:r>
+            <w:r>
+              <w:rPr>
+                <w:rFonts w:ascii="맑은 고딕" w:hAnsi="맑은 고딕" w:eastAsia="맑은 고딕" w:cs="맑은 고딕"/>
+                <w:b w:val="0"/>
+                <w:sz w:val="17"/>
+              </w:rPr>
+              <w:t>(원 출처 계열) 추가. 재인용 기사는 원 출처와 같은 계열, 50%·찬반 할당량은 독립 계열 수 기준</w:t>
+            </w:r>
+          </w:p>
+        </w:tc>
+      </w:tr>
+      <w:tr>
+        <w:trPr>
+          <w:cantSplit/>
+        </w:trPr>
+        <w:tc>
+          <w:tcPr>
+            <w:tcW w:type="dxa" w:w="1247"/>
+            <w:tcMar>
+              <w:top w:w="70" w:type="dxa"/>
+              <w:left w:w="90" w:type="dxa"/>
+              <w:bottom w:w="70" w:type="dxa"/>
+              <w:right w:w="90" w:type="dxa"/>
+            </w:tcMar>
+          </w:tcPr>
+          <w:p>
+            <w:pPr>
+              <w:spacing w:after="0" w:line="276" w:lineRule="auto"/>
+            </w:pPr>
+            <w:r>
+              <w:rPr>
+                <w:rFonts w:ascii="맑은 고딕" w:hAnsi="맑은 고딕" w:eastAsia="맑은 고딕" w:cs="맑은 고딕"/>
+                <w:b w:val="0"/>
+                <w:sz w:val="17"/>
+              </w:rPr>
+              <w:t>(v1.2) 2.3.5</w:t>
+            </w:r>
+          </w:p>
+        </w:tc>
+        <w:tc>
+          <w:tcPr>
+            <w:tcW w:type="dxa" w:w="3061"/>
+            <w:tcMar>
+              <w:top w:w="70" w:type="dxa"/>
+              <w:left w:w="90" w:type="dxa"/>
+              <w:bottom w:w="70" w:type="dxa"/>
+              <w:right w:w="90" w:type="dxa"/>
+            </w:tcMar>
+          </w:tcPr>
+          <w:p>
+            <w:pPr>
+              <w:spacing w:after="0" w:line="276" w:lineRule="auto"/>
+            </w:pPr>
+            <w:r>
+              <w:rPr>
+                <w:rFonts w:ascii="맑은 고딕" w:hAnsi="맑은 고딕" w:eastAsia="맑은 고딕" w:cs="맑은 고딕"/>
+                <w:b w:val="0"/>
+                <w:sz w:val="17"/>
+              </w:rPr>
+              <w:t>임계값 근거 미기재</w:t>
+            </w:r>
+          </w:p>
+        </w:tc>
+        <w:tc>
+          <w:tcPr>
+            <w:tcW w:type="dxa" w:w="4762"/>
+            <w:tcMar>
+              <w:top w:w="70" w:type="dxa"/>
+              <w:left w:w="90" w:type="dxa"/>
+              <w:bottom w:w="70" w:type="dxa"/>
+              <w:right w:w="90" w:type="dxa"/>
+            </w:tcMar>
+          </w:tcPr>
+          <w:p>
+            <w:pPr>
+              <w:spacing w:after="0" w:line="276" w:lineRule="auto"/>
+            </w:pPr>
+            <w:r>
+              <w:rPr>
+                <w:rFonts w:ascii="맑은 고딕" w:hAnsi="맑은 고딕" w:eastAsia="맑은 고딕" w:cs="맑은 고딕"/>
+                <w:b w:val="0"/>
+                <w:sz w:val="17"/>
+              </w:rPr>
+              <w:t>"분석 전 고정한 운영 규칙(heuristic)" 명시, 보고서에 ±0.5 민감도 점검</w:t>
+            </w:r>
+          </w:p>
+        </w:tc>
+      </w:tr>
+      <w:tr>
+        <w:trPr>
+          <w:cantSplit/>
+        </w:trPr>
+        <w:tc>
+          <w:tcPr>
+            <w:tcW w:type="dxa" w:w="1247"/>
+            <w:tcMar>
+              <w:top w:w="70" w:type="dxa"/>
+              <w:left w:w="90" w:type="dxa"/>
+              <w:bottom w:w="70" w:type="dxa"/>
+              <w:right w:w="90" w:type="dxa"/>
+            </w:tcMar>
+          </w:tcPr>
+          <w:p>
+            <w:pPr>
+              <w:spacing w:after="0" w:line="276" w:lineRule="auto"/>
+            </w:pPr>
+            <w:r>
+              <w:rPr>
+                <w:rFonts w:ascii="맑은 고딕" w:hAnsi="맑은 고딕" w:eastAsia="맑은 고딕" w:cs="맑은 고딕"/>
+                <w:b w:val="0"/>
+                <w:sz w:val="17"/>
+              </w:rPr>
+              <w:t>(v1.2) 2.4.1</w:t>
+            </w:r>
+          </w:p>
+        </w:tc>
+        <w:tc>
+          <w:tcPr>
+            <w:tcW w:type="dxa" w:w="3061"/>
+            <w:tcMar>
+              <w:top w:w="70" w:type="dxa"/>
+              <w:left w:w="90" w:type="dxa"/>
+              <w:bottom w:w="70" w:type="dxa"/>
+              <w:right w:w="90" w:type="dxa"/>
+            </w:tcMar>
+          </w:tcPr>
+          <w:p>
+            <w:pPr>
+              <w:spacing w:after="0" w:line="276" w:lineRule="auto"/>
+            </w:pPr>
+            <w:r>
+              <w:rPr>
+                <w:rFonts w:ascii="맑은 고딕" w:hAnsi="맑은 고딕" w:eastAsia="맑은 고딕" w:cs="맑은 고딕"/>
+                <w:b w:val="0"/>
+                <w:sz w:val="17"/>
+              </w:rPr>
+              <w:t>Agent와 Node 구분 없음</w:t>
+            </w:r>
+          </w:p>
+        </w:tc>
+        <w:tc>
+          <w:tcPr>
+            <w:tcW w:type="dxa" w:w="4762"/>
+            <w:tcMar>
+              <w:top w:w="70" w:type="dxa"/>
+              <w:left w:w="90" w:type="dxa"/>
+              <w:bottom w:w="70" w:type="dxa"/>
+              <w:right w:w="90" w:type="dxa"/>
+            </w:tcMar>
+          </w:tcPr>
+          <w:p>
+            <w:pPr>
+              <w:spacing w:after="0" w:line="276" w:lineRule="auto"/>
+            </w:pPr>
+            <w:r>
+              <w:rPr>
+                <w:rFonts w:ascii="맑은 고딕" w:hAnsi="맑은 고딕" w:eastAsia="맑은 고딕" w:cs="맑은 고딕"/>
+                <w:b w:val="0"/>
+                <w:sz w:val="17"/>
+              </w:rPr>
+              <w:t>"Agent = 판단 책임 단위, Node = 실행 단위" 정의(에이전트 7, 노드 18)</w:t>
+            </w:r>
+          </w:p>
+        </w:tc>
+      </w:tr>
+      <w:tr>
+        <w:trPr>
+          <w:cantSplit/>
+        </w:trPr>
+        <w:tc>
+          <w:tcPr>
+            <w:tcW w:type="dxa" w:w="1247"/>
+            <w:tcMar>
+              <w:top w:w="70" w:type="dxa"/>
+              <w:left w:w="90" w:type="dxa"/>
+              <w:bottom w:w="70" w:type="dxa"/>
+              <w:right w:w="90" w:type="dxa"/>
+            </w:tcMar>
+          </w:tcPr>
+          <w:p>
+            <w:pPr>
+              <w:spacing w:after="0" w:line="276" w:lineRule="auto"/>
+            </w:pPr>
+            <w:r>
+              <w:rPr>
+                <w:rFonts w:ascii="맑은 고딕" w:hAnsi="맑은 고딕" w:eastAsia="맑은 고딕" w:cs="맑은 고딕"/>
+                <w:b w:val="0"/>
+                <w:sz w:val="17"/>
+              </w:rPr>
+              <w:t>(v1.2) 그림 2a</w:t>
+            </w:r>
+          </w:p>
+        </w:tc>
+        <w:tc>
+          <w:tcPr>
+            <w:tcW w:type="dxa" w:w="3061"/>
+            <w:tcMar>
+              <w:top w:w="70" w:type="dxa"/>
+              <w:left w:w="90" w:type="dxa"/>
+              <w:bottom w:w="70" w:type="dxa"/>
+              <w:right w:w="90" w:type="dxa"/>
+            </w:tcMar>
+          </w:tcPr>
+          <w:p>
+            <w:pPr>
+              <w:spacing w:after="0" w:line="276" w:lineRule="auto"/>
+            </w:pPr>
+            <w:r>
+              <w:rPr>
+                <w:rFonts w:ascii="맑은 고딕" w:hAnsi="맑은 고딕" w:eastAsia="맑은 고딕" w:cs="맑은 고딕"/>
+                <w:b w:val="0"/>
+                <w:sz w:val="17"/>
+              </w:rPr>
+              <w:t>선정 검증 → 충족? → human_review 분기</w:t>
+            </w:r>
+          </w:p>
+        </w:tc>
+        <w:tc>
+          <w:tcPr>
+            <w:tcW w:type="dxa" w:w="4762"/>
+            <w:tcMar>
+              <w:top w:w="70" w:type="dxa"/>
+              <w:left w:w="90" w:type="dxa"/>
+              <w:bottom w:w="70" w:type="dxa"/>
+              <w:right w:w="90" w:type="dxa"/>
+            </w:tcMar>
+          </w:tcPr>
+          <w:p>
+            <w:pPr>
+              <w:spacing w:after="0" w:line="276" w:lineRule="auto"/>
+            </w:pPr>
+            <w:r>
+              <w:rPr>
+                <w:rFonts w:ascii="맑은 고딕" w:hAnsi="맑은 고딕" w:eastAsia="맑은 고딕" w:cs="맑은 고딕"/>
+                <w:b w:val="0"/>
+                <w:sz w:val="17"/>
+              </w:rPr>
+              <w:t>Human 선정(2안) → initialize → selection_validator(기록) → 공통 RAG</w:t>
             </w:r>
           </w:p>
         </w:tc>

</xml_diff>

<commit_message>
docs(design): 2차 리뷰 반영 및 v2 재측정
</commit_message>
<xml_diff>
--- a/deliverables/RAG-Design_판교-9반_김정인+김지수+김진수+전진만+정원준.docx
+++ b/deliverables/RAG-Design_판교-9반_김정인+김지수+김진수+전진만+정원준.docx
@@ -925,7 +925,7 @@
                 <w:sz w:val="19"/>
                 <w:szCs w:val="19"/>
               </w:rPr>
-              <w:t xml:space="preserve">v1.1 (설계 개정)</w:t>
+              <w:t xml:space="preserve">v1.2 (설계 개정)</w:t>
             </w:r>
           </w:p>
         </w:tc>
@@ -1025,7 +1025,7 @@
           <w:b w:val="0"/>
           <w:sz w:val="20"/>
         </w:rPr>
-        <w:t xml:space="preserve"> 조가 직접 선정(2안)했다. 후보 6개를 가중 기준표로 채점한 결과 TurboQuant 4.35, ITME 4.50이었다. 두 기술은 </w:t>
+        <w:t xml:space="preserve"> 조가 직접 선정(2안)했고, 에이전트는 검증 결과만 기록한다(그래프 안에 재선정 분기 없음). 후보 6개를 가중 기준표로 채점한 결과 TurboQuant 4.35, ITME 4.50이었다. 두 기술은 </w:t>
       </w:r>
       <w:r>
         <w:rPr>
@@ -1042,7 +1042,7 @@
           <w:b w:val="0"/>
           <w:sz w:val="20"/>
         </w:rPr>
-        <w:t xml:space="preserve"> 해결하므로 공정하게 비교할 수 있다. 에이전트는 선정을 사후 검증만 한다.</w:t>
+        <w:t xml:space="preserve"> 해결하므로 공정하게 비교할 수 있다.</w:t>
       </w:r>
     </w:p>
     <w:p>
@@ -1074,7 +1074,41 @@
           <w:b w:val="0"/>
           <w:sz w:val="20"/>
         </w:rPr>
-        <w:t xml:space="preserve"> 논문 6편(136p)을 절 인식 청크 159개로 인덱싱했다. 임베딩은 한국어→영어 42문항 자체 평가로 골랐다. 사전 적합성(다국어·모델 한계 900토큰 이상·오픈소스)을 통과한 후보 중 bge-m3를 선정했다(MRR 0.703, min(SW, HW) 0.659). 최종 검색 구성은 3중 RRF + reranker이며 Hit@5 0.976, MRR 0.863이다.</w:t>
+        <w:t xml:space="preserve"> 논문 6편(136p)을 절 인식 청크 159개로 인덱싱했다. 임베딩은 한국어→영어 42문항 자체 평가로 골랐다. 사전 적합성(다국어·모델 한계 900토큰 이상·오픈소스)을 통과한 후보 중 bge-m3를 선정했다(MRR 0.703, min(SW, HW) 0.659). 최종 검색 구성(3중 RRF + reranker)은 구현 조건(</w:t>
+      </w:r>
+      <w:r>
+        <w:rPr>
+          <w:rFonts w:ascii="D2Coding" w:hAnsi="D2Coding" w:eastAsia="맑은 고딕" w:cs="D2Coding"/>
+          <w:b w:val="0"/>
+          <w:color w:val="5B3FA0"/>
+          <w:sz w:val="19"/>
+        </w:rPr>
+        <w:t>max_seq_length</w:t>
+      </w:r>
+      <w:r>
+        <w:rPr>
+          <w:rFonts w:ascii="맑은 고딕" w:hAnsi="맑은 고딕" w:eastAsia="맑은 고딕" w:cs="맑은 고딕"/>
+          <w:b w:val="0"/>
+          <w:sz w:val="20"/>
+        </w:rPr>
+        <w:t xml:space="preserve"> 2,048)으로 다시 측정해 Hit@5 0.976, MRR 0.863이다. 모두 구성 선택에 쓴 42문항 기준의 </w:t>
+      </w:r>
+      <w:r>
+        <w:rPr>
+          <w:rFonts w:ascii="맑은 고딕" w:hAnsi="맑은 고딕" w:eastAsia="맑은 고딕" w:cs="맑은 고딕"/>
+          <w:b/>
+          <w:color w:val="161A58"/>
+          <w:sz w:val="20"/>
+        </w:rPr>
+        <w:t>개발 지표</w:t>
+      </w:r>
+      <w:r>
+        <w:rPr>
+          <w:rFonts w:ascii="맑은 고딕" w:hAnsi="맑은 고딕" w:eastAsia="맑은 고딕" w:cs="맑은 고딕"/>
+          <w:b w:val="0"/>
+          <w:sz w:val="20"/>
+        </w:rPr>
+        <w:t>이다.</w:t>
       </w:r>
     </w:p>
     <w:p>
@@ -1106,7 +1140,7 @@
           <w:b w:val="0"/>
           <w:sz w:val="20"/>
         </w:rPr>
-        <w:t xml:space="preserve"> 에이전트 7개(Notion 6개 + Judge), State 키 29개로 구성한다. 선정·공통 검색·관점 내부·관점 재실행·보고서 검수의 5개 루프에 모두 횟수 한도가 있다. Judge가 미달로 판정한 관점만 </w:t>
+        <w:t xml:space="preserve"> 에이전트 7개(Notion 6개 + Judge), State 키 27개로 구성한다. 공통 검색·관점 내부·관점 재실행·보고서 검수의 4개 루프에 모두 횟수 한도가 있다. Judge가 미달로 판정한 관점만 </w:t>
       </w:r>
       <w:r>
         <w:rPr>
@@ -1172,7 +1206,7 @@
           <w:b w:val="0"/>
           <w:sz w:val="20"/>
         </w:rPr>
-        <w:t xml:space="preserve"> 찬반 양면 검색(기술 고유 근거만 할당량으로 인정), 벤더 출처군 50% 상한, 인용 필수, 우열 어휘 검사, 상위 모델 Judge를 적용한다.</w:t>
+        <w:t xml:space="preserve"> 찬반 양면 검색(기술 고유 근거만 할당량으로 인정), 원 출처 계열 기준 50% 상한, 인용 필수, 우열 어휘 검사, 상위 모델 Judge를 적용한다.</w:t>
       </w:r>
     </w:p>
     <w:p>
@@ -1204,7 +1238,7 @@
           <w:b w:val="0"/>
           <w:sz w:val="20"/>
         </w:rPr>
-        <w:t xml:space="preserve"> 평가셋의 개발/테스트 미분리(42문항, 1문항 = 2.4%p), 평가 시 일부 청크 잘림(bge-m3 17/159), 같은 계열 Judge, ITME 공개 후 약 3개월, 평가 주체(SK 교육과정)의 소속 편향 가능성.</w:t>
+        <w:t xml:space="preserve"> 평가셋의 개발/테스트 미분리(42문항, 1문항 = 2.4%p), 같은 계열 Judge, ITME 공개 후 약 3개월, 평가 주체(SK 교육과정)의 소속 편향 가능성.</w:t>
       </w:r>
     </w:p>
     <w:p>
@@ -2304,7 +2338,7 @@
                 <w:b w:val="0"/>
                 <w:sz w:val="17"/>
               </w:rPr>
-              <w:t xml:space="preserve">두 기술 모두 모델 학습 이후의 </w:t>
+              <w:t xml:space="preserve">두 기술 모두 모델 학습 이후 </w:t>
             </w:r>
             <w:r>
               <w:rPr>
@@ -2313,15 +2347,15 @@
                 <w:color w:val="161A58"/>
                 <w:sz w:val="17"/>
               </w:rPr>
-              <w:t>추론·서빙 단계</w:t>
-            </w:r>
-            <w:r>
-              <w:rPr>
-                <w:rFonts w:ascii="맑은 고딕" w:hAnsi="맑은 고딕" w:eastAsia="맑은 고딕" w:cs="맑은 고딕"/>
-                <w:b w:val="0"/>
-                <w:sz w:val="17"/>
-              </w:rPr>
-              <w:t>에서 KV cache 병목을 직접 다루는가? (같은 적용 계층)</w:t>
+              <w:t>동일한 적용 시점(추론·서빙 단계)</w:t>
+            </w:r>
+            <w:r>
+              <w:rPr>
+                <w:rFonts w:ascii="맑은 고딕" w:hAnsi="맑은 고딕" w:eastAsia="맑은 고딕" w:cs="맑은 고딕"/>
+                <w:b w:val="0"/>
+                <w:sz w:val="17"/>
+              </w:rPr>
+              <w:t>에서 KV cache 용량 병목을 직접 다루는가?</w:t>
             </w:r>
           </w:p>
         </w:tc>
@@ -6368,7 +6402,7 @@
           <w:b w:val="0"/>
           <w:sz w:val="20"/>
         </w:rPr>
-        <w:t xml:space="preserve">가 원문을 근거로 세 가지를 다시 검증한다. ① 같은 문제를 다루는가 ② 적용 계층을 비교할 수 있는가 ③ 공개 근거가 충분한가. 하나라도 미충족이면 사유와 대체 후보를 </w:t>
+        <w:t xml:space="preserve">가 원문을 근거로 세 가지를 다시 검증한다. ① 같은 문제를 다루는가 ② 적용 시점이 같은가 ③ 공개 근거가 충분한가. 하나라도 미충족이면 사유와 대체 후보를 </w:t>
       </w:r>
       <w:r>
         <w:rPr>
@@ -6385,7 +6419,7 @@
           <w:b w:val="0"/>
           <w:sz w:val="20"/>
         </w:rPr>
-        <w:t xml:space="preserve">에 기록한다. </w:t>
+        <w:t xml:space="preserve">과 </w:t>
       </w:r>
       <w:r>
         <w:rPr>
@@ -6394,15 +6428,32 @@
           <w:color w:val="5B3FA0"/>
           <w:sz w:val="19"/>
         </w:rPr>
-        <w:t>--interactive</w:t>
-      </w:r>
-      <w:r>
-        <w:rPr>
-          <w:rFonts w:ascii="맑은 고딕" w:hAnsi="맑은 고딕" w:eastAsia="맑은 고딕" w:cs="맑은 고딕"/>
-          <w:b w:val="0"/>
-          <w:sz w:val="20"/>
-        </w:rPr>
-        <w:t xml:space="preserve"> 모드에서는 사람의 확인을 받는다(최대 1회). 기본 실행에서는 기존 선정을 유지하고, 검증 결과(통과 여부·약점·대체 후보)를 보고서 2.4절에 그대로 싣는다.</w:t>
+        <w:t>warnings</w:t>
+      </w:r>
+      <w:r>
+        <w:rPr>
+          <w:rFonts w:ascii="맑은 고딕" w:hAnsi="맑은 고딕" w:eastAsia="맑은 고딕" w:cs="맑은 고딕"/>
+          <w:b w:val="0"/>
+          <w:sz w:val="20"/>
+        </w:rPr>
+        <w:t xml:space="preserve">에 기록하고 실행은 계속한다. 2안(Human 선정)이므로 그래프 안에서 기술을 바꾸지 않는다. 선정을 바꿀지는 팀이 실행 밖에서 결정하고 </w:t>
+      </w:r>
+      <w:r>
+        <w:rPr>
+          <w:rFonts w:ascii="D2Coding" w:hAnsi="D2Coding" w:eastAsia="맑은 고딕" w:cs="D2Coding"/>
+          <w:b w:val="0"/>
+          <w:color w:val="5B3FA0"/>
+          <w:sz w:val="19"/>
+        </w:rPr>
+        <w:t>--tech</w:t>
+      </w:r>
+      <w:r>
+        <w:rPr>
+          <w:rFonts w:ascii="맑은 고딕" w:hAnsi="맑은 고딕" w:eastAsia="맑은 고딕" w:cs="맑은 고딕"/>
+          <w:b w:val="0"/>
+          <w:sz w:val="20"/>
+        </w:rPr>
+        <w:t>로 다시 실행한다. 검증 결과(통과 여부·약점·대체 후보)는 보고서 2.4절에 그대로 싣는다.</w:t>
       </w:r>
     </w:p>
     <w:p>
@@ -6523,6 +6574,14 @@
           <w:sz w:val="20"/>
         </w:rPr>
         <w:t>다시 고르지 않고 검증만 한다.</w:t>
+      </w:r>
+      <w:r>
+        <w:rPr>
+          <w:rFonts w:ascii="맑은 고딕" w:hAnsi="맑은 고딕" w:eastAsia="맑은 고딕" w:cs="맑은 고딕"/>
+          <w:b w:val="0"/>
+          <w:sz w:val="20"/>
+        </w:rPr>
+        <w:t xml:space="preserve"> 그래서 그래프에는 1안(에이전트 선정)이나 재선정 분기를 두지 않는다.</w:t>
       </w:r>
     </w:p>
     <w:p>
@@ -11357,6 +11416,51 @@
     </w:p>
     <w:p>
       <w:pPr>
+        <w:spacing w:after="80" w:line="324" w:lineRule="auto"/>
+        <w:ind w:left="113"/>
+        <w:pBdr>
+          <w:left w:val="single" w:sz="18" w:space="6" w:color="7F4ACB"/>
+        </w:pBdr>
+      </w:pPr>
+      <w:r>
+        <w:rPr>
+          <w:rFonts w:ascii="맑은 고딕" w:hAnsi="맑은 고딕" w:eastAsia="맑은 고딕" w:cs="맑은 고딕"/>
+          <w:b/>
+          <w:color w:val="555A6E"/>
+          <w:sz w:val="18"/>
+        </w:rPr>
+        <w:t>수치의 성격:</w:t>
+      </w:r>
+      <w:r>
+        <w:rPr>
+          <w:rFonts w:ascii="맑은 고딕" w:hAnsi="맑은 고딕" w:eastAsia="맑은 고딕" w:cs="맑은 고딕"/>
+          <w:b w:val="0"/>
+          <w:color w:val="555A6E"/>
+          <w:sz w:val="18"/>
+        </w:rPr>
+        <w:t xml:space="preserve"> 아래의 모든 Hit@K와 MRR은 모델·프롬프트·검색 구성을 고르는 데 쓴 </w:t>
+      </w:r>
+      <w:r>
+        <w:rPr>
+          <w:rFonts w:ascii="맑은 고딕" w:hAnsi="맑은 고딕" w:eastAsia="맑은 고딕" w:cs="맑은 고딕"/>
+          <w:b/>
+          <w:color w:val="555A6E"/>
+          <w:sz w:val="18"/>
+        </w:rPr>
+        <w:t>같은 42문항(구성 선택용 셋)으로 잰 개발 지표(development metric)</w:t>
+      </w:r>
+      <w:r>
+        <w:rPr>
+          <w:rFonts w:ascii="맑은 고딕" w:hAnsi="맑은 고딕" w:eastAsia="맑은 고딕" w:cs="맑은 고딕"/>
+          <w:b w:val="0"/>
+          <w:color w:val="555A6E"/>
+          <w:sz w:val="18"/>
+        </w:rPr>
+        <w:t>이다. 독립 테스트셋 성능이 아니다.</w:t>
+      </w:r>
+    </w:p>
+    <w:p>
+      <w:pPr>
         <w:keepNext/>
         <w:spacing w:after="80" w:line="324" w:lineRule="auto"/>
       </w:pPr>
@@ -11367,7 +11471,7 @@
           <w:color w:val="161A58"/>
           <w:sz w:val="20"/>
         </w:rPr>
-        <w:t>② 과제 전용 실험. 결과 1: 임베딩 후보 (dense only, 한국어 질의)</w:t>
+        <w:t>② 과제 전용 실험. 결과 1: 임베딩 후보 (dense only, 한국어 질의, v1 측정: `max_seq_length` 1,024)</w:t>
       </w:r>
     </w:p>
     <w:tbl>
@@ -12584,7 +12688,7 @@
           <w:color w:val="161A58"/>
           <w:sz w:val="20"/>
         </w:rPr>
-        <w:t>결과 2: 검색 구성 (bge-m3 기준, 같은 평가셋)</w:t>
+        <w:t>결과 2: 검색 구성 (bge-m3 기준, 같은 평가셋, v1 측정)</w:t>
       </w:r>
     </w:p>
     <w:tbl>
@@ -13149,7 +13253,7 @@
                 <w:b w:val="0"/>
                 <w:sz w:val="17"/>
               </w:rPr>
-              <w:t>하이브리드 RRF: Dense(KO) + BM25(EN)</w:t>
+              <w:t>2중 하이브리드 RRF: Dense(KO) + BM25(EN)</w:t>
             </w:r>
           </w:p>
         </w:tc>
@@ -13396,11 +13500,136 @@
             <w:r>
               <w:rPr>
                 <w:rFonts w:ascii="맑은 고딕" w:hAnsi="맑은 고딕" w:eastAsia="맑은 고딕" w:cs="맑은 고딕"/>
+                <w:b w:val="0"/>
+                <w:sz w:val="17"/>
+              </w:rPr>
+              <w:t>2중 하이브리드 RRF + reranker (참고)</w:t>
+            </w:r>
+          </w:p>
+        </w:tc>
+        <w:tc>
+          <w:tcPr>
+            <w:tcW w:type="dxa" w:w="1077"/>
+            <w:tcMar>
+              <w:top w:w="70" w:type="dxa"/>
+              <w:left w:w="90" w:type="dxa"/>
+              <w:bottom w:w="70" w:type="dxa"/>
+              <w:right w:w="90" w:type="dxa"/>
+            </w:tcMar>
+          </w:tcPr>
+          <w:p>
+            <w:pPr>
+              <w:spacing w:after="0" w:line="276" w:lineRule="auto"/>
+            </w:pPr>
+            <w:r>
+              <w:rPr>
+                <w:rFonts w:ascii="맑은 고딕" w:hAnsi="맑은 고딕" w:eastAsia="맑은 고딕" w:cs="맑은 고딕"/>
+                <w:b w:val="0"/>
+                <w:sz w:val="17"/>
+              </w:rPr>
+              <w:t>0.786</w:t>
+            </w:r>
+          </w:p>
+        </w:tc>
+        <w:tc>
+          <w:tcPr>
+            <w:tcW w:type="dxa" w:w="1077"/>
+            <w:tcMar>
+              <w:top w:w="70" w:type="dxa"/>
+              <w:left w:w="90" w:type="dxa"/>
+              <w:bottom w:w="70" w:type="dxa"/>
+              <w:right w:w="90" w:type="dxa"/>
+            </w:tcMar>
+          </w:tcPr>
+          <w:p>
+            <w:pPr>
+              <w:spacing w:after="0" w:line="276" w:lineRule="auto"/>
+            </w:pPr>
+            <w:r>
+              <w:rPr>
+                <w:rFonts w:ascii="맑은 고딕" w:hAnsi="맑은 고딕" w:eastAsia="맑은 고딕" w:cs="맑은 고딕"/>
+                <w:b w:val="0"/>
+                <w:sz w:val="17"/>
+              </w:rPr>
+              <w:t>0.952</w:t>
+            </w:r>
+          </w:p>
+        </w:tc>
+        <w:tc>
+          <w:tcPr>
+            <w:tcW w:type="dxa" w:w="1077"/>
+            <w:tcMar>
+              <w:top w:w="70" w:type="dxa"/>
+              <w:left w:w="90" w:type="dxa"/>
+              <w:bottom w:w="70" w:type="dxa"/>
+              <w:right w:w="90" w:type="dxa"/>
+            </w:tcMar>
+          </w:tcPr>
+          <w:p>
+            <w:pPr>
+              <w:spacing w:after="0" w:line="276" w:lineRule="auto"/>
+            </w:pPr>
+            <w:r>
+              <w:rPr>
+                <w:rFonts w:ascii="맑은 고딕" w:hAnsi="맑은 고딕" w:eastAsia="맑은 고딕" w:cs="맑은 고딕"/>
+                <w:b w:val="0"/>
+                <w:sz w:val="17"/>
+              </w:rPr>
+              <w:t>0.976</w:t>
+            </w:r>
+          </w:p>
+        </w:tc>
+        <w:tc>
+          <w:tcPr>
+            <w:tcW w:type="dxa" w:w="1077"/>
+            <w:tcMar>
+              <w:top w:w="70" w:type="dxa"/>
+              <w:left w:w="90" w:type="dxa"/>
+              <w:bottom w:w="70" w:type="dxa"/>
+              <w:right w:w="90" w:type="dxa"/>
+            </w:tcMar>
+          </w:tcPr>
+          <w:p>
+            <w:pPr>
+              <w:spacing w:after="0" w:line="276" w:lineRule="auto"/>
+            </w:pPr>
+            <w:r>
+              <w:rPr>
+                <w:rFonts w:ascii="맑은 고딕" w:hAnsi="맑은 고딕" w:eastAsia="맑은 고딕" w:cs="맑은 고딕"/>
+                <w:b w:val="0"/>
+                <w:sz w:val="17"/>
+              </w:rPr>
+              <w:t>0.863</w:t>
+            </w:r>
+          </w:p>
+        </w:tc>
+      </w:tr>
+      <w:tr>
+        <w:trPr>
+          <w:cantSplit/>
+        </w:trPr>
+        <w:tc>
+          <w:tcPr>
+            <w:tcW w:type="dxa" w:w="4762"/>
+            <w:tcMar>
+              <w:top w:w="70" w:type="dxa"/>
+              <w:left w:w="90" w:type="dxa"/>
+              <w:bottom w:w="70" w:type="dxa"/>
+              <w:right w:w="90" w:type="dxa"/>
+            </w:tcMar>
+          </w:tcPr>
+          <w:p>
+            <w:pPr>
+              <w:spacing w:after="0" w:line="276" w:lineRule="auto"/>
+            </w:pPr>
+            <w:r>
+              <w:rPr>
+                <w:rFonts w:ascii="맑은 고딕" w:hAnsi="맑은 고딕" w:eastAsia="맑은 고딕" w:cs="맑은 고딕"/>
                 <w:b/>
                 <w:color w:val="161A58"/>
                 <w:sz w:val="17"/>
               </w:rPr>
-              <w:t>3중 하이브리드 RRF + reranker (bge-reranker-v2-m3) ← 채택</w:t>
+              <w:t>3중 하이브리드 RRF + reranker ← 채택(v1에서 고정)</w:t>
             </w:r>
           </w:p>
         </w:tc>
@@ -14700,7 +14929,7 @@
           <w:color w:val="555A6E"/>
           <w:sz w:val="18"/>
         </w:rPr>
-        <w:t xml:space="preserve">은 bge-m3 0.659, Qwen3 0.493이었다. Qwen3는 SW 질문 MRR이 조금 더 높았지만(0.770 vs 0.748) HW 질문에서 0.493으로 크게 떨어졌다. ②의 확인 결과로, bge-m3는 전체 Hit@1·3·5와 MRR이 모두 가장 높았다. 설계 초안에서는 Qwen3-Embedding-0.6B를 가정했지만, 측정 결과 교차언어 정확도가 낮아 </w:t>
+        <w:t xml:space="preserve">은 bge-m3 0.659, Qwen3 0.493이었다. Qwen3는 SW 질문 MRR이 조금 더 높았지만(0.770 vs 0.748) HW 질문에서 0.493으로 크게 떨어졌다. ②의 확인 결과로, bge-m3는 전체 Hit@1·3·5와 MRR이 모두 가장 높았다. 구현 조건(2,048)으로 다시 측정해도 순위와 채택 구성의 수치는 같았다(④). 설계 초안에서는 Qwen3-Embedding-0.6B를 가정했지만, 측정 결과 교차언어 정확도가 낮아 </w:t>
       </w:r>
       <w:r>
         <w:rPr>
@@ -14718,7 +14947,7 @@
           <w:color w:val="555A6E"/>
           <w:sz w:val="18"/>
         </w:rPr>
-        <w:t xml:space="preserve"> reranker는 질의당 약 4.7초가 더 들지만, 보고서 생성은 대화형이 아닌 배치 작업이므로 비용 대비 정확도 개선(MRR +0.073)이 크다고 판단해 채택했다. 시간이 부족할 때는 </w:t>
+        <w:t xml:space="preserve"> reranker는 질의당 약 4.5초가 더 들지만, 보고서 생성은 대화형이 아닌 배치 작업이므로 비용 대비 정확도 개선(MRR +0.073)이 크다고 판단해 채택했다. 시간이 부족할 때는 </w:t>
       </w:r>
       <w:r>
         <w:rPr>
@@ -14751,6 +14980,1951 @@
           <w:color w:val="161A58"/>
           <w:sz w:val="20"/>
         </w:rPr>
+        <w:t>④ 구현 조건 재측정 (v2: `max_seq_length` 2,048, 잘린 청크 0건)</w:t>
+      </w:r>
+    </w:p>
+    <w:p>
+      <w:pPr>
+        <w:spacing w:after="80" w:line="324" w:lineRule="auto"/>
+      </w:pPr>
+      <w:r>
+        <w:rPr>
+          <w:rFonts w:ascii="맑은 고딕" w:hAnsi="맑은 고딕" w:eastAsia="맑은 고딕" w:cs="맑은 고딕"/>
+          <w:b w:val="0"/>
+          <w:sz w:val="20"/>
+        </w:rPr>
+        <w:t xml:space="preserve">v1 수치는 바꾸지 않고, 구현 설정으로 같은 42문항을 다시 측정했다. bge-m3·Qwen3는 2,048로, e5·MiniLM은 모델 한계 그대로 두었다. 새 순위에서 판정 이력이 없는 (질문, 청크) 쌍은 오답으로 처리했으므로 아래 값은 </w:t>
+      </w:r>
+      <w:r>
+        <w:rPr>
+          <w:rFonts w:ascii="맑은 고딕" w:hAnsi="맑은 고딕" w:eastAsia="맑은 고딕" w:cs="맑은 고딕"/>
+          <w:b/>
+          <w:color w:val="161A58"/>
+          <w:sz w:val="20"/>
+        </w:rPr>
+        <w:t>하한값</w:t>
+      </w:r>
+      <w:r>
+        <w:rPr>
+          <w:rFonts w:ascii="맑은 고딕" w:hAnsi="맑은 고딕" w:eastAsia="맑은 고딕" w:cs="맑은 고딕"/>
+          <w:b w:val="0"/>
+          <w:sz w:val="20"/>
+        </w:rPr>
+        <w:t>이다. 보고 지표 top-5 안에 판정 이력이 없는 쌍은 dense bge-m3에서 0건, 채택 구성에서 5건이다(</w:t>
+      </w:r>
+      <w:r>
+        <w:rPr>
+          <w:rFonts w:ascii="D2Coding" w:hAnsi="D2Coding" w:eastAsia="맑은 고딕" w:cs="D2Coding"/>
+          <w:b w:val="0"/>
+          <w:color w:val="5B3FA0"/>
+          <w:sz w:val="19"/>
+        </w:rPr>
+        <w:t>outputs/eval/v2_maxlen2048/</w:t>
+      </w:r>
+      <w:r>
+        <w:rPr>
+          <w:rFonts w:ascii="맑은 고딕" w:hAnsi="맑은 고딕" w:eastAsia="맑은 고딕" w:cs="맑은 고딕"/>
+          <w:b w:val="0"/>
+          <w:sz w:val="20"/>
+        </w:rPr>
+        <w:t>).</w:t>
+      </w:r>
+    </w:p>
+    <w:tbl>
+      <w:tblPr>
+        <w:jc w:val="center"/>
+        <w:tblLook w:firstColumn="1" w:firstRow="1" w:lastColumn="0" w:lastRow="0" w:noHBand="0" w:noVBand="1" w:val="04A0"/>
+        <w:tblBorders>
+          <w:top w:val="single" w:color="161A58" w:sz="8"/>
+          <w:left w:val="none" w:color="FFFFFF" w:sz="0"/>
+          <w:bottom w:val="single" w:color="161A58" w:sz="8"/>
+          <w:right w:val="none" w:color="FFFFFF" w:sz="0"/>
+          <w:insideH w:val="single" w:color="D8DAE5" w:sz="2"/>
+          <w:insideV w:val="single" w:color="D8DAE5" w:sz="2"/>
+        </w:tblBorders>
+        <w:tblW w:w="9072" w:type="dxa"/>
+        <w:tblLayout w:type="fixed"/>
+      </w:tblPr>
+      <w:tblGrid>
+        <w:gridCol w:w="2608"/>
+        <w:gridCol w:w="850"/>
+        <w:gridCol w:w="850"/>
+        <w:gridCol w:w="1701"/>
+        <w:gridCol w:w="1757"/>
+        <w:gridCol w:w="1304"/>
+      </w:tblGrid>
+      <w:tr>
+        <w:trPr>
+          <w:cantSplit/>
+          <w:tblHeader w:val="true"/>
+        </w:trPr>
+        <w:tc>
+          <w:tcPr>
+            <w:tcW w:type="dxa" w:w="2608"/>
+            <w:tcMar>
+              <w:top w:w="70" w:type="dxa"/>
+              <w:left w:w="90" w:type="dxa"/>
+              <w:bottom w:w="70" w:type="dxa"/>
+              <w:right w:w="90" w:type="dxa"/>
+            </w:tcMar>
+            <w:shd w:val="clear" w:color="auto" w:fill="F2F3F8"/>
+          </w:tcPr>
+          <w:p>
+            <w:pPr>
+              <w:spacing w:after="0" w:line="276" w:lineRule="auto"/>
+              <w:jc w:val="center"/>
+            </w:pPr>
+            <w:r>
+              <w:rPr>
+                <w:rFonts w:ascii="맑은 고딕" w:hAnsi="맑은 고딕" w:eastAsia="맑은 고딕" w:cs="맑은 고딕"/>
+                <w:b/>
+                <w:color w:val="161A58"/>
+                <w:sz w:val="17"/>
+              </w:rPr>
+              <w:t>모델 (평가 설정 길이)</w:t>
+            </w:r>
+          </w:p>
+        </w:tc>
+        <w:tc>
+          <w:tcPr>
+            <w:tcW w:type="dxa" w:w="850"/>
+            <w:tcMar>
+              <w:top w:w="70" w:type="dxa"/>
+              <w:left w:w="90" w:type="dxa"/>
+              <w:bottom w:w="70" w:type="dxa"/>
+              <w:right w:w="90" w:type="dxa"/>
+            </w:tcMar>
+            <w:shd w:val="clear" w:color="auto" w:fill="F2F3F8"/>
+          </w:tcPr>
+          <w:p>
+            <w:pPr>
+              <w:spacing w:after="0" w:line="276" w:lineRule="auto"/>
+              <w:jc w:val="center"/>
+            </w:pPr>
+            <w:r>
+              <w:rPr>
+                <w:rFonts w:ascii="맑은 고딕" w:hAnsi="맑은 고딕" w:eastAsia="맑은 고딕" w:cs="맑은 고딕"/>
+                <w:b/>
+                <w:color w:val="161A58"/>
+                <w:sz w:val="17"/>
+              </w:rPr>
+              <w:t>Hit@1</w:t>
+            </w:r>
+          </w:p>
+        </w:tc>
+        <w:tc>
+          <w:tcPr>
+            <w:tcW w:type="dxa" w:w="850"/>
+            <w:tcMar>
+              <w:top w:w="70" w:type="dxa"/>
+              <w:left w:w="90" w:type="dxa"/>
+              <w:bottom w:w="70" w:type="dxa"/>
+              <w:right w:w="90" w:type="dxa"/>
+            </w:tcMar>
+            <w:shd w:val="clear" w:color="auto" w:fill="F2F3F8"/>
+          </w:tcPr>
+          <w:p>
+            <w:pPr>
+              <w:spacing w:after="0" w:line="276" w:lineRule="auto"/>
+              <w:jc w:val="center"/>
+            </w:pPr>
+            <w:r>
+              <w:rPr>
+                <w:rFonts w:ascii="맑은 고딕" w:hAnsi="맑은 고딕" w:eastAsia="맑은 고딕" w:cs="맑은 고딕"/>
+                <w:b/>
+                <w:color w:val="161A58"/>
+                <w:sz w:val="17"/>
+              </w:rPr>
+              <w:t>Hit@5</w:t>
+            </w:r>
+          </w:p>
+        </w:tc>
+        <w:tc>
+          <w:tcPr>
+            <w:tcW w:type="dxa" w:w="1701"/>
+            <w:tcMar>
+              <w:top w:w="70" w:type="dxa"/>
+              <w:left w:w="90" w:type="dxa"/>
+              <w:bottom w:w="70" w:type="dxa"/>
+              <w:right w:w="90" w:type="dxa"/>
+            </w:tcMar>
+            <w:shd w:val="clear" w:color="auto" w:fill="F2F3F8"/>
+          </w:tcPr>
+          <w:p>
+            <w:pPr>
+              <w:spacing w:after="0" w:line="276" w:lineRule="auto"/>
+              <w:jc w:val="center"/>
+            </w:pPr>
+            <w:r>
+              <w:rPr>
+                <w:rFonts w:ascii="맑은 고딕" w:hAnsi="맑은 고딕" w:eastAsia="맑은 고딕" w:cs="맑은 고딕"/>
+                <w:b/>
+                <w:color w:val="161A58"/>
+                <w:sz w:val="17"/>
+              </w:rPr>
+              <w:t>MRR@10 (v1 → v2)</w:t>
+            </w:r>
+          </w:p>
+        </w:tc>
+        <w:tc>
+          <w:tcPr>
+            <w:tcW w:type="dxa" w:w="1757"/>
+            <w:tcMar>
+              <w:top w:w="70" w:type="dxa"/>
+              <w:left w:w="90" w:type="dxa"/>
+              <w:bottom w:w="70" w:type="dxa"/>
+              <w:right w:w="90" w:type="dxa"/>
+            </w:tcMar>
+            <w:shd w:val="clear" w:color="auto" w:fill="F2F3F8"/>
+          </w:tcPr>
+          <w:p>
+            <w:pPr>
+              <w:spacing w:after="0" w:line="276" w:lineRule="auto"/>
+              <w:jc w:val="center"/>
+            </w:pPr>
+            <w:r>
+              <w:rPr>
+                <w:rFonts w:ascii="맑은 고딕" w:hAnsi="맑은 고딕" w:eastAsia="맑은 고딕" w:cs="맑은 고딕"/>
+                <w:b/>
+                <w:color w:val="161A58"/>
+                <w:sz w:val="17"/>
+              </w:rPr>
+              <w:t>SW / HW MRR</w:t>
+            </w:r>
+          </w:p>
+        </w:tc>
+        <w:tc>
+          <w:tcPr>
+            <w:tcW w:type="dxa" w:w="1304"/>
+            <w:tcMar>
+              <w:top w:w="70" w:type="dxa"/>
+              <w:left w:w="90" w:type="dxa"/>
+              <w:bottom w:w="70" w:type="dxa"/>
+              <w:right w:w="90" w:type="dxa"/>
+            </w:tcMar>
+            <w:shd w:val="clear" w:color="auto" w:fill="F2F3F8"/>
+          </w:tcPr>
+          <w:p>
+            <w:pPr>
+              <w:spacing w:after="0" w:line="276" w:lineRule="auto"/>
+              <w:jc w:val="center"/>
+            </w:pPr>
+            <w:r>
+              <w:rPr>
+                <w:rFonts w:ascii="맑은 고딕" w:hAnsi="맑은 고딕" w:eastAsia="맑은 고딕" w:cs="맑은 고딕"/>
+                <w:b/>
+                <w:color w:val="161A58"/>
+                <w:sz w:val="17"/>
+              </w:rPr>
+              <w:t>min(SW, HW)</w:t>
+            </w:r>
+          </w:p>
+        </w:tc>
+      </w:tr>
+      <w:tr>
+        <w:trPr>
+          <w:cantSplit/>
+        </w:trPr>
+        <w:tc>
+          <w:tcPr>
+            <w:tcW w:type="dxa" w:w="2608"/>
+            <w:tcMar>
+              <w:top w:w="70" w:type="dxa"/>
+              <w:left w:w="90" w:type="dxa"/>
+              <w:bottom w:w="70" w:type="dxa"/>
+              <w:right w:w="90" w:type="dxa"/>
+            </w:tcMar>
+          </w:tcPr>
+          <w:p>
+            <w:pPr>
+              <w:spacing w:after="0" w:line="276" w:lineRule="auto"/>
+            </w:pPr>
+            <w:r>
+              <w:rPr>
+                <w:rFonts w:ascii="맑은 고딕" w:hAnsi="맑은 고딕" w:eastAsia="맑은 고딕" w:cs="맑은 고딕"/>
+                <w:b w:val="0"/>
+                <w:sz w:val="17"/>
+              </w:rPr>
+              <w:t>bge-m3 (2,048)</w:t>
+            </w:r>
+          </w:p>
+        </w:tc>
+        <w:tc>
+          <w:tcPr>
+            <w:tcW w:type="dxa" w:w="850"/>
+            <w:tcMar>
+              <w:top w:w="70" w:type="dxa"/>
+              <w:left w:w="90" w:type="dxa"/>
+              <w:bottom w:w="70" w:type="dxa"/>
+              <w:right w:w="90" w:type="dxa"/>
+            </w:tcMar>
+          </w:tcPr>
+          <w:p>
+            <w:pPr>
+              <w:spacing w:after="0" w:line="276" w:lineRule="auto"/>
+            </w:pPr>
+            <w:r>
+              <w:rPr>
+                <w:rFonts w:ascii="맑은 고딕" w:hAnsi="맑은 고딕" w:eastAsia="맑은 고딕" w:cs="맑은 고딕"/>
+                <w:b w:val="0"/>
+                <w:sz w:val="17"/>
+              </w:rPr>
+              <w:t>0.524</w:t>
+            </w:r>
+          </w:p>
+        </w:tc>
+        <w:tc>
+          <w:tcPr>
+            <w:tcW w:type="dxa" w:w="850"/>
+            <w:tcMar>
+              <w:top w:w="70" w:type="dxa"/>
+              <w:left w:w="90" w:type="dxa"/>
+              <w:bottom w:w="70" w:type="dxa"/>
+              <w:right w:w="90" w:type="dxa"/>
+            </w:tcMar>
+          </w:tcPr>
+          <w:p>
+            <w:pPr>
+              <w:spacing w:after="0" w:line="276" w:lineRule="auto"/>
+            </w:pPr>
+            <w:r>
+              <w:rPr>
+                <w:rFonts w:ascii="맑은 고딕" w:hAnsi="맑은 고딕" w:eastAsia="맑은 고딕" w:cs="맑은 고딕"/>
+                <w:b w:val="0"/>
+                <w:sz w:val="17"/>
+              </w:rPr>
+              <w:t>0.905</w:t>
+            </w:r>
+          </w:p>
+        </w:tc>
+        <w:tc>
+          <w:tcPr>
+            <w:tcW w:type="dxa" w:w="1701"/>
+            <w:tcMar>
+              <w:top w:w="70" w:type="dxa"/>
+              <w:left w:w="90" w:type="dxa"/>
+              <w:bottom w:w="70" w:type="dxa"/>
+              <w:right w:w="90" w:type="dxa"/>
+            </w:tcMar>
+          </w:tcPr>
+          <w:p>
+            <w:pPr>
+              <w:spacing w:after="0" w:line="276" w:lineRule="auto"/>
+            </w:pPr>
+            <w:r>
+              <w:rPr>
+                <w:rFonts w:ascii="맑은 고딕" w:hAnsi="맑은 고딕" w:eastAsia="맑은 고딕" w:cs="맑은 고딕"/>
+                <w:b w:val="0"/>
+                <w:sz w:val="17"/>
+              </w:rPr>
+              <w:t>0.703 → 0.691</w:t>
+            </w:r>
+          </w:p>
+        </w:tc>
+        <w:tc>
+          <w:tcPr>
+            <w:tcW w:type="dxa" w:w="1757"/>
+            <w:tcMar>
+              <w:top w:w="70" w:type="dxa"/>
+              <w:left w:w="90" w:type="dxa"/>
+              <w:bottom w:w="70" w:type="dxa"/>
+              <w:right w:w="90" w:type="dxa"/>
+            </w:tcMar>
+          </w:tcPr>
+          <w:p>
+            <w:pPr>
+              <w:spacing w:after="0" w:line="276" w:lineRule="auto"/>
+            </w:pPr>
+            <w:r>
+              <w:rPr>
+                <w:rFonts w:ascii="맑은 고딕" w:hAnsi="맑은 고딕" w:eastAsia="맑은 고딕" w:cs="맑은 고딕"/>
+                <w:b w:val="0"/>
+                <w:sz w:val="17"/>
+              </w:rPr>
+              <w:t>0.748 / 0.635</w:t>
+            </w:r>
+          </w:p>
+        </w:tc>
+        <w:tc>
+          <w:tcPr>
+            <w:tcW w:type="dxa" w:w="1304"/>
+            <w:tcMar>
+              <w:top w:w="70" w:type="dxa"/>
+              <w:left w:w="90" w:type="dxa"/>
+              <w:bottom w:w="70" w:type="dxa"/>
+              <w:right w:w="90" w:type="dxa"/>
+            </w:tcMar>
+          </w:tcPr>
+          <w:p>
+            <w:pPr>
+              <w:spacing w:after="0" w:line="276" w:lineRule="auto"/>
+            </w:pPr>
+            <w:r>
+              <w:rPr>
+                <w:rFonts w:ascii="맑은 고딕" w:hAnsi="맑은 고딕" w:eastAsia="맑은 고딕" w:cs="맑은 고딕"/>
+                <w:b w:val="0"/>
+                <w:sz w:val="17"/>
+              </w:rPr>
+              <w:t>0.635</w:t>
+            </w:r>
+          </w:p>
+        </w:tc>
+      </w:tr>
+      <w:tr>
+        <w:trPr>
+          <w:cantSplit/>
+        </w:trPr>
+        <w:tc>
+          <w:tcPr>
+            <w:tcW w:type="dxa" w:w="2608"/>
+            <w:tcMar>
+              <w:top w:w="70" w:type="dxa"/>
+              <w:left w:w="90" w:type="dxa"/>
+              <w:bottom w:w="70" w:type="dxa"/>
+              <w:right w:w="90" w:type="dxa"/>
+            </w:tcMar>
+          </w:tcPr>
+          <w:p>
+            <w:pPr>
+              <w:spacing w:after="0" w:line="276" w:lineRule="auto"/>
+            </w:pPr>
+            <w:r>
+              <w:rPr>
+                <w:rFonts w:ascii="맑은 고딕" w:hAnsi="맑은 고딕" w:eastAsia="맑은 고딕" w:cs="맑은 고딕"/>
+                <w:b w:val="0"/>
+                <w:sz w:val="17"/>
+              </w:rPr>
+              <w:t>qwen3-embedding-0.6b (2,048)</w:t>
+            </w:r>
+          </w:p>
+        </w:tc>
+        <w:tc>
+          <w:tcPr>
+            <w:tcW w:type="dxa" w:w="850"/>
+            <w:tcMar>
+              <w:top w:w="70" w:type="dxa"/>
+              <w:left w:w="90" w:type="dxa"/>
+              <w:bottom w:w="70" w:type="dxa"/>
+              <w:right w:w="90" w:type="dxa"/>
+            </w:tcMar>
+          </w:tcPr>
+          <w:p>
+            <w:pPr>
+              <w:spacing w:after="0" w:line="276" w:lineRule="auto"/>
+            </w:pPr>
+            <w:r>
+              <w:rPr>
+                <w:rFonts w:ascii="맑은 고딕" w:hAnsi="맑은 고딕" w:eastAsia="맑은 고딕" w:cs="맑은 고딕"/>
+                <w:b w:val="0"/>
+                <w:sz w:val="17"/>
+              </w:rPr>
+              <w:t>0.500</w:t>
+            </w:r>
+          </w:p>
+        </w:tc>
+        <w:tc>
+          <w:tcPr>
+            <w:tcW w:type="dxa" w:w="850"/>
+            <w:tcMar>
+              <w:top w:w="70" w:type="dxa"/>
+              <w:left w:w="90" w:type="dxa"/>
+              <w:bottom w:w="70" w:type="dxa"/>
+              <w:right w:w="90" w:type="dxa"/>
+            </w:tcMar>
+          </w:tcPr>
+          <w:p>
+            <w:pPr>
+              <w:spacing w:after="0" w:line="276" w:lineRule="auto"/>
+            </w:pPr>
+            <w:r>
+              <w:rPr>
+                <w:rFonts w:ascii="맑은 고딕" w:hAnsi="맑은 고딕" w:eastAsia="맑은 고딕" w:cs="맑은 고딕"/>
+                <w:b w:val="0"/>
+                <w:sz w:val="17"/>
+              </w:rPr>
+              <w:t>0.810</w:t>
+            </w:r>
+          </w:p>
+        </w:tc>
+        <w:tc>
+          <w:tcPr>
+            <w:tcW w:type="dxa" w:w="1701"/>
+            <w:tcMar>
+              <w:top w:w="70" w:type="dxa"/>
+              <w:left w:w="90" w:type="dxa"/>
+              <w:bottom w:w="70" w:type="dxa"/>
+              <w:right w:w="90" w:type="dxa"/>
+            </w:tcMar>
+          </w:tcPr>
+          <w:p>
+            <w:pPr>
+              <w:spacing w:after="0" w:line="276" w:lineRule="auto"/>
+            </w:pPr>
+            <w:r>
+              <w:rPr>
+                <w:rFonts w:ascii="맑은 고딕" w:hAnsi="맑은 고딕" w:eastAsia="맑은 고딕" w:cs="맑은 고딕"/>
+                <w:b w:val="0"/>
+                <w:sz w:val="17"/>
+              </w:rPr>
+              <w:t>0.631 → 0.631</w:t>
+            </w:r>
+          </w:p>
+        </w:tc>
+        <w:tc>
+          <w:tcPr>
+            <w:tcW w:type="dxa" w:w="1757"/>
+            <w:tcMar>
+              <w:top w:w="70" w:type="dxa"/>
+              <w:left w:w="90" w:type="dxa"/>
+              <w:bottom w:w="70" w:type="dxa"/>
+              <w:right w:w="90" w:type="dxa"/>
+            </w:tcMar>
+          </w:tcPr>
+          <w:p>
+            <w:pPr>
+              <w:spacing w:after="0" w:line="276" w:lineRule="auto"/>
+            </w:pPr>
+            <w:r>
+              <w:rPr>
+                <w:rFonts w:ascii="맑은 고딕" w:hAnsi="맑은 고딕" w:eastAsia="맑은 고딕" w:cs="맑은 고딕"/>
+                <w:b w:val="0"/>
+                <w:sz w:val="17"/>
+              </w:rPr>
+              <w:t>0.770 / 0.493</w:t>
+            </w:r>
+          </w:p>
+        </w:tc>
+        <w:tc>
+          <w:tcPr>
+            <w:tcW w:type="dxa" w:w="1304"/>
+            <w:tcMar>
+              <w:top w:w="70" w:type="dxa"/>
+              <w:left w:w="90" w:type="dxa"/>
+              <w:bottom w:w="70" w:type="dxa"/>
+              <w:right w:w="90" w:type="dxa"/>
+            </w:tcMar>
+          </w:tcPr>
+          <w:p>
+            <w:pPr>
+              <w:spacing w:after="0" w:line="276" w:lineRule="auto"/>
+            </w:pPr>
+            <w:r>
+              <w:rPr>
+                <w:rFonts w:ascii="맑은 고딕" w:hAnsi="맑은 고딕" w:eastAsia="맑은 고딕" w:cs="맑은 고딕"/>
+                <w:b w:val="0"/>
+                <w:sz w:val="17"/>
+              </w:rPr>
+              <w:t>0.493</w:t>
+            </w:r>
+          </w:p>
+        </w:tc>
+      </w:tr>
+      <w:tr>
+        <w:trPr>
+          <w:cantSplit/>
+        </w:trPr>
+        <w:tc>
+          <w:tcPr>
+            <w:tcW w:type="dxa" w:w="2608"/>
+            <w:tcMar>
+              <w:top w:w="70" w:type="dxa"/>
+              <w:left w:w="90" w:type="dxa"/>
+              <w:bottom w:w="70" w:type="dxa"/>
+              <w:right w:w="90" w:type="dxa"/>
+            </w:tcMar>
+          </w:tcPr>
+          <w:p>
+            <w:pPr>
+              <w:spacing w:after="0" w:line="276" w:lineRule="auto"/>
+            </w:pPr>
+            <w:r>
+              <w:rPr>
+                <w:rFonts w:ascii="맑은 고딕" w:hAnsi="맑은 고딕" w:eastAsia="맑은 고딕" w:cs="맑은 고딕"/>
+                <w:b w:val="0"/>
+                <w:sz w:val="17"/>
+              </w:rPr>
+              <w:t>multilingual-e5-large (512)</w:t>
+            </w:r>
+          </w:p>
+        </w:tc>
+        <w:tc>
+          <w:tcPr>
+            <w:tcW w:type="dxa" w:w="850"/>
+            <w:tcMar>
+              <w:top w:w="70" w:type="dxa"/>
+              <w:left w:w="90" w:type="dxa"/>
+              <w:bottom w:w="70" w:type="dxa"/>
+              <w:right w:w="90" w:type="dxa"/>
+            </w:tcMar>
+          </w:tcPr>
+          <w:p>
+            <w:pPr>
+              <w:spacing w:after="0" w:line="276" w:lineRule="auto"/>
+            </w:pPr>
+            <w:r>
+              <w:rPr>
+                <w:rFonts w:ascii="맑은 고딕" w:hAnsi="맑은 고딕" w:eastAsia="맑은 고딕" w:cs="맑은 고딕"/>
+                <w:b w:val="0"/>
+                <w:sz w:val="17"/>
+              </w:rPr>
+              <w:t>0.476</w:t>
+            </w:r>
+          </w:p>
+        </w:tc>
+        <w:tc>
+          <w:tcPr>
+            <w:tcW w:type="dxa" w:w="850"/>
+            <w:tcMar>
+              <w:top w:w="70" w:type="dxa"/>
+              <w:left w:w="90" w:type="dxa"/>
+              <w:bottom w:w="70" w:type="dxa"/>
+              <w:right w:w="90" w:type="dxa"/>
+            </w:tcMar>
+          </w:tcPr>
+          <w:p>
+            <w:pPr>
+              <w:spacing w:after="0" w:line="276" w:lineRule="auto"/>
+            </w:pPr>
+            <w:r>
+              <w:rPr>
+                <w:rFonts w:ascii="맑은 고딕" w:hAnsi="맑은 고딕" w:eastAsia="맑은 고딕" w:cs="맑은 고딕"/>
+                <w:b w:val="0"/>
+                <w:sz w:val="17"/>
+              </w:rPr>
+              <w:t>0.857</w:t>
+            </w:r>
+          </w:p>
+        </w:tc>
+        <w:tc>
+          <w:tcPr>
+            <w:tcW w:type="dxa" w:w="1701"/>
+            <w:tcMar>
+              <w:top w:w="70" w:type="dxa"/>
+              <w:left w:w="90" w:type="dxa"/>
+              <w:bottom w:w="70" w:type="dxa"/>
+              <w:right w:w="90" w:type="dxa"/>
+            </w:tcMar>
+          </w:tcPr>
+          <w:p>
+            <w:pPr>
+              <w:spacing w:after="0" w:line="276" w:lineRule="auto"/>
+            </w:pPr>
+            <w:r>
+              <w:rPr>
+                <w:rFonts w:ascii="맑은 고딕" w:hAnsi="맑은 고딕" w:eastAsia="맑은 고딕" w:cs="맑은 고딕"/>
+                <w:b w:val="0"/>
+                <w:sz w:val="17"/>
+              </w:rPr>
+              <w:t>0.626 → 0.626</w:t>
+            </w:r>
+          </w:p>
+        </w:tc>
+        <w:tc>
+          <w:tcPr>
+            <w:tcW w:type="dxa" w:w="1757"/>
+            <w:tcMar>
+              <w:top w:w="70" w:type="dxa"/>
+              <w:left w:w="90" w:type="dxa"/>
+              <w:bottom w:w="70" w:type="dxa"/>
+              <w:right w:w="90" w:type="dxa"/>
+            </w:tcMar>
+          </w:tcPr>
+          <w:p>
+            <w:pPr>
+              <w:spacing w:after="0" w:line="276" w:lineRule="auto"/>
+            </w:pPr>
+            <w:r>
+              <w:rPr>
+                <w:rFonts w:ascii="맑은 고딕" w:hAnsi="맑은 고딕" w:eastAsia="맑은 고딕" w:cs="맑은 고딕"/>
+                <w:b w:val="0"/>
+                <w:sz w:val="17"/>
+              </w:rPr>
+              <w:t>0.662 / 0.589</w:t>
+            </w:r>
+          </w:p>
+        </w:tc>
+        <w:tc>
+          <w:tcPr>
+            <w:tcW w:type="dxa" w:w="1304"/>
+            <w:tcMar>
+              <w:top w:w="70" w:type="dxa"/>
+              <w:left w:w="90" w:type="dxa"/>
+              <w:bottom w:w="70" w:type="dxa"/>
+              <w:right w:w="90" w:type="dxa"/>
+            </w:tcMar>
+          </w:tcPr>
+          <w:p>
+            <w:pPr>
+              <w:spacing w:after="0" w:line="276" w:lineRule="auto"/>
+            </w:pPr>
+            <w:r>
+              <w:rPr>
+                <w:rFonts w:ascii="맑은 고딕" w:hAnsi="맑은 고딕" w:eastAsia="맑은 고딕" w:cs="맑은 고딕"/>
+                <w:b w:val="0"/>
+                <w:sz w:val="17"/>
+              </w:rPr>
+              <w:t>0.589</w:t>
+            </w:r>
+          </w:p>
+        </w:tc>
+      </w:tr>
+      <w:tr>
+        <w:trPr>
+          <w:cantSplit/>
+        </w:trPr>
+        <w:tc>
+          <w:tcPr>
+            <w:tcW w:type="dxa" w:w="2608"/>
+            <w:tcMar>
+              <w:top w:w="70" w:type="dxa"/>
+              <w:left w:w="90" w:type="dxa"/>
+              <w:bottom w:w="70" w:type="dxa"/>
+              <w:right w:w="90" w:type="dxa"/>
+            </w:tcMar>
+          </w:tcPr>
+          <w:p>
+            <w:pPr>
+              <w:spacing w:after="0" w:line="276" w:lineRule="auto"/>
+            </w:pPr>
+            <w:r>
+              <w:rPr>
+                <w:rFonts w:ascii="맑은 고딕" w:hAnsi="맑은 고딕" w:eastAsia="맑은 고딕" w:cs="맑은 고딕"/>
+                <w:b w:val="0"/>
+                <w:sz w:val="17"/>
+              </w:rPr>
+              <w:t>multilingual-minilm-l12 (128)</w:t>
+            </w:r>
+          </w:p>
+        </w:tc>
+        <w:tc>
+          <w:tcPr>
+            <w:tcW w:type="dxa" w:w="850"/>
+            <w:tcMar>
+              <w:top w:w="70" w:type="dxa"/>
+              <w:left w:w="90" w:type="dxa"/>
+              <w:bottom w:w="70" w:type="dxa"/>
+              <w:right w:w="90" w:type="dxa"/>
+            </w:tcMar>
+          </w:tcPr>
+          <w:p>
+            <w:pPr>
+              <w:spacing w:after="0" w:line="276" w:lineRule="auto"/>
+            </w:pPr>
+            <w:r>
+              <w:rPr>
+                <w:rFonts w:ascii="맑은 고딕" w:hAnsi="맑은 고딕" w:eastAsia="맑은 고딕" w:cs="맑은 고딕"/>
+                <w:b w:val="0"/>
+                <w:sz w:val="17"/>
+              </w:rPr>
+              <w:t>0.262</w:t>
+            </w:r>
+          </w:p>
+        </w:tc>
+        <w:tc>
+          <w:tcPr>
+            <w:tcW w:type="dxa" w:w="850"/>
+            <w:tcMar>
+              <w:top w:w="70" w:type="dxa"/>
+              <w:left w:w="90" w:type="dxa"/>
+              <w:bottom w:w="70" w:type="dxa"/>
+              <w:right w:w="90" w:type="dxa"/>
+            </w:tcMar>
+          </w:tcPr>
+          <w:p>
+            <w:pPr>
+              <w:spacing w:after="0" w:line="276" w:lineRule="auto"/>
+            </w:pPr>
+            <w:r>
+              <w:rPr>
+                <w:rFonts w:ascii="맑은 고딕" w:hAnsi="맑은 고딕" w:eastAsia="맑은 고딕" w:cs="맑은 고딕"/>
+                <w:b w:val="0"/>
+                <w:sz w:val="17"/>
+              </w:rPr>
+              <w:t>0.500</w:t>
+            </w:r>
+          </w:p>
+        </w:tc>
+        <w:tc>
+          <w:tcPr>
+            <w:tcW w:type="dxa" w:w="1701"/>
+            <w:tcMar>
+              <w:top w:w="70" w:type="dxa"/>
+              <w:left w:w="90" w:type="dxa"/>
+              <w:bottom w:w="70" w:type="dxa"/>
+              <w:right w:w="90" w:type="dxa"/>
+            </w:tcMar>
+          </w:tcPr>
+          <w:p>
+            <w:pPr>
+              <w:spacing w:after="0" w:line="276" w:lineRule="auto"/>
+            </w:pPr>
+            <w:r>
+              <w:rPr>
+                <w:rFonts w:ascii="맑은 고딕" w:hAnsi="맑은 고딕" w:eastAsia="맑은 고딕" w:cs="맑은 고딕"/>
+                <w:b w:val="0"/>
+                <w:sz w:val="17"/>
+              </w:rPr>
+              <w:t>0.377 → 0.377</w:t>
+            </w:r>
+          </w:p>
+        </w:tc>
+        <w:tc>
+          <w:tcPr>
+            <w:tcW w:type="dxa" w:w="1757"/>
+            <w:tcMar>
+              <w:top w:w="70" w:type="dxa"/>
+              <w:left w:w="90" w:type="dxa"/>
+              <w:bottom w:w="70" w:type="dxa"/>
+              <w:right w:w="90" w:type="dxa"/>
+            </w:tcMar>
+          </w:tcPr>
+          <w:p>
+            <w:pPr>
+              <w:spacing w:after="0" w:line="276" w:lineRule="auto"/>
+            </w:pPr>
+            <w:r>
+              <w:rPr>
+                <w:rFonts w:ascii="맑은 고딕" w:hAnsi="맑은 고딕" w:eastAsia="맑은 고딕" w:cs="맑은 고딕"/>
+                <w:b w:val="0"/>
+                <w:sz w:val="17"/>
+              </w:rPr>
+              <w:t>0.378 / 0.375</w:t>
+            </w:r>
+          </w:p>
+        </w:tc>
+        <w:tc>
+          <w:tcPr>
+            <w:tcW w:type="dxa" w:w="1304"/>
+            <w:tcMar>
+              <w:top w:w="70" w:type="dxa"/>
+              <w:left w:w="90" w:type="dxa"/>
+              <w:bottom w:w="70" w:type="dxa"/>
+              <w:right w:w="90" w:type="dxa"/>
+            </w:tcMar>
+          </w:tcPr>
+          <w:p>
+            <w:pPr>
+              <w:spacing w:after="0" w:line="276" w:lineRule="auto"/>
+            </w:pPr>
+            <w:r>
+              <w:rPr>
+                <w:rFonts w:ascii="맑은 고딕" w:hAnsi="맑은 고딕" w:eastAsia="맑은 고딕" w:cs="맑은 고딕"/>
+                <w:b w:val="0"/>
+                <w:sz w:val="17"/>
+              </w:rPr>
+              <w:t>0.375</w:t>
+            </w:r>
+          </w:p>
+        </w:tc>
+      </w:tr>
+    </w:tbl>
+    <w:p>
+      <w:pPr>
+        <w:spacing w:after="80" w:line="324" w:lineRule="auto"/>
+      </w:pPr>
+    </w:p>
+    <w:tbl>
+      <w:tblPr>
+        <w:jc w:val="center"/>
+        <w:tblLook w:firstColumn="1" w:firstRow="1" w:lastColumn="0" w:lastRow="0" w:noHBand="0" w:noVBand="1" w:val="04A0"/>
+        <w:tblBorders>
+          <w:top w:val="single" w:color="161A58" w:sz="8"/>
+          <w:left w:val="none" w:color="FFFFFF" w:sz="0"/>
+          <w:bottom w:val="single" w:color="161A58" w:sz="8"/>
+          <w:right w:val="none" w:color="FFFFFF" w:sz="0"/>
+          <w:insideH w:val="single" w:color="D8DAE5" w:sz="2"/>
+          <w:insideV w:val="single" w:color="D8DAE5" w:sz="2"/>
+        </w:tblBorders>
+        <w:tblW w:w="9072" w:type="dxa"/>
+        <w:tblLayout w:type="fixed"/>
+      </w:tblPr>
+      <w:tblGrid>
+        <w:gridCol w:w="4762"/>
+        <w:gridCol w:w="1077"/>
+        <w:gridCol w:w="1077"/>
+        <w:gridCol w:w="1077"/>
+        <w:gridCol w:w="1077"/>
+      </w:tblGrid>
+      <w:tr>
+        <w:trPr>
+          <w:cantSplit/>
+          <w:tblHeader w:val="true"/>
+        </w:trPr>
+        <w:tc>
+          <w:tcPr>
+            <w:tcW w:type="dxa" w:w="4762"/>
+            <w:tcMar>
+              <w:top w:w="70" w:type="dxa"/>
+              <w:left w:w="90" w:type="dxa"/>
+              <w:bottom w:w="70" w:type="dxa"/>
+              <w:right w:w="90" w:type="dxa"/>
+            </w:tcMar>
+            <w:shd w:val="clear" w:color="auto" w:fill="F2F3F8"/>
+          </w:tcPr>
+          <w:p>
+            <w:pPr>
+              <w:spacing w:after="0" w:line="276" w:lineRule="auto"/>
+              <w:jc w:val="center"/>
+            </w:pPr>
+            <w:r>
+              <w:rPr>
+                <w:rFonts w:ascii="맑은 고딕" w:hAnsi="맑은 고딕" w:eastAsia="맑은 고딕" w:cs="맑은 고딕"/>
+                <w:b/>
+                <w:color w:val="161A58"/>
+                <w:sz w:val="17"/>
+              </w:rPr>
+              <w:t>검색 구성</w:t>
+            </w:r>
+          </w:p>
+        </w:tc>
+        <w:tc>
+          <w:tcPr>
+            <w:tcW w:type="dxa" w:w="1077"/>
+            <w:tcMar>
+              <w:top w:w="70" w:type="dxa"/>
+              <w:left w:w="90" w:type="dxa"/>
+              <w:bottom w:w="70" w:type="dxa"/>
+              <w:right w:w="90" w:type="dxa"/>
+            </w:tcMar>
+            <w:shd w:val="clear" w:color="auto" w:fill="F2F3F8"/>
+          </w:tcPr>
+          <w:p>
+            <w:pPr>
+              <w:spacing w:after="0" w:line="276" w:lineRule="auto"/>
+              <w:jc w:val="center"/>
+            </w:pPr>
+            <w:r>
+              <w:rPr>
+                <w:rFonts w:ascii="맑은 고딕" w:hAnsi="맑은 고딕" w:eastAsia="맑은 고딕" w:cs="맑은 고딕"/>
+                <w:b/>
+                <w:color w:val="161A58"/>
+                <w:sz w:val="17"/>
+              </w:rPr>
+              <w:t>Hit@1</w:t>
+            </w:r>
+          </w:p>
+        </w:tc>
+        <w:tc>
+          <w:tcPr>
+            <w:tcW w:type="dxa" w:w="1077"/>
+            <w:tcMar>
+              <w:top w:w="70" w:type="dxa"/>
+              <w:left w:w="90" w:type="dxa"/>
+              <w:bottom w:w="70" w:type="dxa"/>
+              <w:right w:w="90" w:type="dxa"/>
+            </w:tcMar>
+            <w:shd w:val="clear" w:color="auto" w:fill="F2F3F8"/>
+          </w:tcPr>
+          <w:p>
+            <w:pPr>
+              <w:spacing w:after="0" w:line="276" w:lineRule="auto"/>
+              <w:jc w:val="center"/>
+            </w:pPr>
+            <w:r>
+              <w:rPr>
+                <w:rFonts w:ascii="맑은 고딕" w:hAnsi="맑은 고딕" w:eastAsia="맑은 고딕" w:cs="맑은 고딕"/>
+                <w:b/>
+                <w:color w:val="161A58"/>
+                <w:sz w:val="17"/>
+              </w:rPr>
+              <w:t>Hit@3</w:t>
+            </w:r>
+          </w:p>
+        </w:tc>
+        <w:tc>
+          <w:tcPr>
+            <w:tcW w:type="dxa" w:w="1077"/>
+            <w:tcMar>
+              <w:top w:w="70" w:type="dxa"/>
+              <w:left w:w="90" w:type="dxa"/>
+              <w:bottom w:w="70" w:type="dxa"/>
+              <w:right w:w="90" w:type="dxa"/>
+            </w:tcMar>
+            <w:shd w:val="clear" w:color="auto" w:fill="F2F3F8"/>
+          </w:tcPr>
+          <w:p>
+            <w:pPr>
+              <w:spacing w:after="0" w:line="276" w:lineRule="auto"/>
+              <w:jc w:val="center"/>
+            </w:pPr>
+            <w:r>
+              <w:rPr>
+                <w:rFonts w:ascii="맑은 고딕" w:hAnsi="맑은 고딕" w:eastAsia="맑은 고딕" w:cs="맑은 고딕"/>
+                <w:b/>
+                <w:color w:val="161A58"/>
+                <w:sz w:val="17"/>
+              </w:rPr>
+              <w:t>Hit@5</w:t>
+            </w:r>
+          </w:p>
+        </w:tc>
+        <w:tc>
+          <w:tcPr>
+            <w:tcW w:type="dxa" w:w="1077"/>
+            <w:tcMar>
+              <w:top w:w="70" w:type="dxa"/>
+              <w:left w:w="90" w:type="dxa"/>
+              <w:bottom w:w="70" w:type="dxa"/>
+              <w:right w:w="90" w:type="dxa"/>
+            </w:tcMar>
+            <w:shd w:val="clear" w:color="auto" w:fill="F2F3F8"/>
+          </w:tcPr>
+          <w:p>
+            <w:pPr>
+              <w:spacing w:after="0" w:line="276" w:lineRule="auto"/>
+              <w:jc w:val="center"/>
+            </w:pPr>
+            <w:r>
+              <w:rPr>
+                <w:rFonts w:ascii="맑은 고딕" w:hAnsi="맑은 고딕" w:eastAsia="맑은 고딕" w:cs="맑은 고딕"/>
+                <w:b/>
+                <w:color w:val="161A58"/>
+                <w:sz w:val="17"/>
+              </w:rPr>
+              <w:t>MRR@10</w:t>
+            </w:r>
+          </w:p>
+        </w:tc>
+      </w:tr>
+      <w:tr>
+        <w:trPr>
+          <w:cantSplit/>
+        </w:trPr>
+        <w:tc>
+          <w:tcPr>
+            <w:tcW w:type="dxa" w:w="4762"/>
+            <w:tcMar>
+              <w:top w:w="70" w:type="dxa"/>
+              <w:left w:w="90" w:type="dxa"/>
+              <w:bottom w:w="70" w:type="dxa"/>
+              <w:right w:w="90" w:type="dxa"/>
+            </w:tcMar>
+          </w:tcPr>
+          <w:p>
+            <w:pPr>
+              <w:spacing w:after="0" w:line="276" w:lineRule="auto"/>
+            </w:pPr>
+            <w:r>
+              <w:rPr>
+                <w:rFonts w:ascii="맑은 고딕" w:hAnsi="맑은 고딕" w:eastAsia="맑은 고딕" w:cs="맑은 고딕"/>
+                <w:b w:val="0"/>
+                <w:sz w:val="17"/>
+              </w:rPr>
+              <w:t>Dense (한국어 질의)</w:t>
+            </w:r>
+          </w:p>
+        </w:tc>
+        <w:tc>
+          <w:tcPr>
+            <w:tcW w:type="dxa" w:w="1077"/>
+            <w:tcMar>
+              <w:top w:w="70" w:type="dxa"/>
+              <w:left w:w="90" w:type="dxa"/>
+              <w:bottom w:w="70" w:type="dxa"/>
+              <w:right w:w="90" w:type="dxa"/>
+            </w:tcMar>
+          </w:tcPr>
+          <w:p>
+            <w:pPr>
+              <w:spacing w:after="0" w:line="276" w:lineRule="auto"/>
+            </w:pPr>
+            <w:r>
+              <w:rPr>
+                <w:rFonts w:ascii="맑은 고딕" w:hAnsi="맑은 고딕" w:eastAsia="맑은 고딕" w:cs="맑은 고딕"/>
+                <w:b w:val="0"/>
+                <w:sz w:val="17"/>
+              </w:rPr>
+              <w:t>0.524</w:t>
+            </w:r>
+          </w:p>
+        </w:tc>
+        <w:tc>
+          <w:tcPr>
+            <w:tcW w:type="dxa" w:w="1077"/>
+            <w:tcMar>
+              <w:top w:w="70" w:type="dxa"/>
+              <w:left w:w="90" w:type="dxa"/>
+              <w:bottom w:w="70" w:type="dxa"/>
+              <w:right w:w="90" w:type="dxa"/>
+            </w:tcMar>
+          </w:tcPr>
+          <w:p>
+            <w:pPr>
+              <w:spacing w:after="0" w:line="276" w:lineRule="auto"/>
+            </w:pPr>
+            <w:r>
+              <w:rPr>
+                <w:rFonts w:ascii="맑은 고딕" w:hAnsi="맑은 고딕" w:eastAsia="맑은 고딕" w:cs="맑은 고딕"/>
+                <w:b w:val="0"/>
+                <w:sz w:val="17"/>
+              </w:rPr>
+              <w:t>0.857</w:t>
+            </w:r>
+          </w:p>
+        </w:tc>
+        <w:tc>
+          <w:tcPr>
+            <w:tcW w:type="dxa" w:w="1077"/>
+            <w:tcMar>
+              <w:top w:w="70" w:type="dxa"/>
+              <w:left w:w="90" w:type="dxa"/>
+              <w:bottom w:w="70" w:type="dxa"/>
+              <w:right w:w="90" w:type="dxa"/>
+            </w:tcMar>
+          </w:tcPr>
+          <w:p>
+            <w:pPr>
+              <w:spacing w:after="0" w:line="276" w:lineRule="auto"/>
+            </w:pPr>
+            <w:r>
+              <w:rPr>
+                <w:rFonts w:ascii="맑은 고딕" w:hAnsi="맑은 고딕" w:eastAsia="맑은 고딕" w:cs="맑은 고딕"/>
+                <w:b w:val="0"/>
+                <w:sz w:val="17"/>
+              </w:rPr>
+              <w:t>0.905</w:t>
+            </w:r>
+          </w:p>
+        </w:tc>
+        <w:tc>
+          <w:tcPr>
+            <w:tcW w:type="dxa" w:w="1077"/>
+            <w:tcMar>
+              <w:top w:w="70" w:type="dxa"/>
+              <w:left w:w="90" w:type="dxa"/>
+              <w:bottom w:w="70" w:type="dxa"/>
+              <w:right w:w="90" w:type="dxa"/>
+            </w:tcMar>
+          </w:tcPr>
+          <w:p>
+            <w:pPr>
+              <w:spacing w:after="0" w:line="276" w:lineRule="auto"/>
+            </w:pPr>
+            <w:r>
+              <w:rPr>
+                <w:rFonts w:ascii="맑은 고딕" w:hAnsi="맑은 고딕" w:eastAsia="맑은 고딕" w:cs="맑은 고딕"/>
+                <w:b w:val="0"/>
+                <w:sz w:val="17"/>
+              </w:rPr>
+              <w:t>0.691</w:t>
+            </w:r>
+          </w:p>
+        </w:tc>
+      </w:tr>
+      <w:tr>
+        <w:trPr>
+          <w:cantSplit/>
+        </w:trPr>
+        <w:tc>
+          <w:tcPr>
+            <w:tcW w:type="dxa" w:w="4762"/>
+            <w:tcMar>
+              <w:top w:w="70" w:type="dxa"/>
+              <w:left w:w="90" w:type="dxa"/>
+              <w:bottom w:w="70" w:type="dxa"/>
+              <w:right w:w="90" w:type="dxa"/>
+            </w:tcMar>
+          </w:tcPr>
+          <w:p>
+            <w:pPr>
+              <w:spacing w:after="0" w:line="276" w:lineRule="auto"/>
+            </w:pPr>
+            <w:r>
+              <w:rPr>
+                <w:rFonts w:ascii="맑은 고딕" w:hAnsi="맑은 고딕" w:eastAsia="맑은 고딕" w:cs="맑은 고딕"/>
+                <w:b w:val="0"/>
+                <w:sz w:val="17"/>
+              </w:rPr>
+              <w:t>BM25 (한국어 질의)</w:t>
+            </w:r>
+          </w:p>
+        </w:tc>
+        <w:tc>
+          <w:tcPr>
+            <w:tcW w:type="dxa" w:w="1077"/>
+            <w:tcMar>
+              <w:top w:w="70" w:type="dxa"/>
+              <w:left w:w="90" w:type="dxa"/>
+              <w:bottom w:w="70" w:type="dxa"/>
+              <w:right w:w="90" w:type="dxa"/>
+            </w:tcMar>
+          </w:tcPr>
+          <w:p>
+            <w:pPr>
+              <w:spacing w:after="0" w:line="276" w:lineRule="auto"/>
+            </w:pPr>
+            <w:r>
+              <w:rPr>
+                <w:rFonts w:ascii="맑은 고딕" w:hAnsi="맑은 고딕" w:eastAsia="맑은 고딕" w:cs="맑은 고딕"/>
+                <w:b w:val="0"/>
+                <w:sz w:val="17"/>
+              </w:rPr>
+              <w:t>0.548</w:t>
+            </w:r>
+          </w:p>
+        </w:tc>
+        <w:tc>
+          <w:tcPr>
+            <w:tcW w:type="dxa" w:w="1077"/>
+            <w:tcMar>
+              <w:top w:w="70" w:type="dxa"/>
+              <w:left w:w="90" w:type="dxa"/>
+              <w:bottom w:w="70" w:type="dxa"/>
+              <w:right w:w="90" w:type="dxa"/>
+            </w:tcMar>
+          </w:tcPr>
+          <w:p>
+            <w:pPr>
+              <w:spacing w:after="0" w:line="276" w:lineRule="auto"/>
+            </w:pPr>
+            <w:r>
+              <w:rPr>
+                <w:rFonts w:ascii="맑은 고딕" w:hAnsi="맑은 고딕" w:eastAsia="맑은 고딕" w:cs="맑은 고딕"/>
+                <w:b w:val="0"/>
+                <w:sz w:val="17"/>
+              </w:rPr>
+              <w:t>0.810</w:t>
+            </w:r>
+          </w:p>
+        </w:tc>
+        <w:tc>
+          <w:tcPr>
+            <w:tcW w:type="dxa" w:w="1077"/>
+            <w:tcMar>
+              <w:top w:w="70" w:type="dxa"/>
+              <w:left w:w="90" w:type="dxa"/>
+              <w:bottom w:w="70" w:type="dxa"/>
+              <w:right w:w="90" w:type="dxa"/>
+            </w:tcMar>
+          </w:tcPr>
+          <w:p>
+            <w:pPr>
+              <w:spacing w:after="0" w:line="276" w:lineRule="auto"/>
+            </w:pPr>
+            <w:r>
+              <w:rPr>
+                <w:rFonts w:ascii="맑은 고딕" w:hAnsi="맑은 고딕" w:eastAsia="맑은 고딕" w:cs="맑은 고딕"/>
+                <w:b w:val="0"/>
+                <w:sz w:val="17"/>
+              </w:rPr>
+              <w:t>0.881</w:t>
+            </w:r>
+          </w:p>
+        </w:tc>
+        <w:tc>
+          <w:tcPr>
+            <w:tcW w:type="dxa" w:w="1077"/>
+            <w:tcMar>
+              <w:top w:w="70" w:type="dxa"/>
+              <w:left w:w="90" w:type="dxa"/>
+              <w:bottom w:w="70" w:type="dxa"/>
+              <w:right w:w="90" w:type="dxa"/>
+            </w:tcMar>
+          </w:tcPr>
+          <w:p>
+            <w:pPr>
+              <w:spacing w:after="0" w:line="276" w:lineRule="auto"/>
+            </w:pPr>
+            <w:r>
+              <w:rPr>
+                <w:rFonts w:ascii="맑은 고딕" w:hAnsi="맑은 고딕" w:eastAsia="맑은 고딕" w:cs="맑은 고딕"/>
+                <w:b w:val="0"/>
+                <w:sz w:val="17"/>
+              </w:rPr>
+              <w:t>0.697</w:t>
+            </w:r>
+          </w:p>
+        </w:tc>
+      </w:tr>
+      <w:tr>
+        <w:trPr>
+          <w:cantSplit/>
+        </w:trPr>
+        <w:tc>
+          <w:tcPr>
+            <w:tcW w:type="dxa" w:w="4762"/>
+            <w:tcMar>
+              <w:top w:w="70" w:type="dxa"/>
+              <w:left w:w="90" w:type="dxa"/>
+              <w:bottom w:w="70" w:type="dxa"/>
+              <w:right w:w="90" w:type="dxa"/>
+            </w:tcMar>
+          </w:tcPr>
+          <w:p>
+            <w:pPr>
+              <w:spacing w:after="0" w:line="276" w:lineRule="auto"/>
+            </w:pPr>
+            <w:r>
+              <w:rPr>
+                <w:rFonts w:ascii="맑은 고딕" w:hAnsi="맑은 고딕" w:eastAsia="맑은 고딕" w:cs="맑은 고딕"/>
+                <w:b w:val="0"/>
+                <w:sz w:val="17"/>
+              </w:rPr>
+              <w:t>BM25 (영어 재작성 질의)</w:t>
+            </w:r>
+          </w:p>
+        </w:tc>
+        <w:tc>
+          <w:tcPr>
+            <w:tcW w:type="dxa" w:w="1077"/>
+            <w:tcMar>
+              <w:top w:w="70" w:type="dxa"/>
+              <w:left w:w="90" w:type="dxa"/>
+              <w:bottom w:w="70" w:type="dxa"/>
+              <w:right w:w="90" w:type="dxa"/>
+            </w:tcMar>
+          </w:tcPr>
+          <w:p>
+            <w:pPr>
+              <w:spacing w:after="0" w:line="276" w:lineRule="auto"/>
+            </w:pPr>
+            <w:r>
+              <w:rPr>
+                <w:rFonts w:ascii="맑은 고딕" w:hAnsi="맑은 고딕" w:eastAsia="맑은 고딕" w:cs="맑은 고딕"/>
+                <w:b w:val="0"/>
+                <w:sz w:val="17"/>
+              </w:rPr>
+              <w:t>0.643</w:t>
+            </w:r>
+          </w:p>
+        </w:tc>
+        <w:tc>
+          <w:tcPr>
+            <w:tcW w:type="dxa" w:w="1077"/>
+            <w:tcMar>
+              <w:top w:w="70" w:type="dxa"/>
+              <w:left w:w="90" w:type="dxa"/>
+              <w:bottom w:w="70" w:type="dxa"/>
+              <w:right w:w="90" w:type="dxa"/>
+            </w:tcMar>
+          </w:tcPr>
+          <w:p>
+            <w:pPr>
+              <w:spacing w:after="0" w:line="276" w:lineRule="auto"/>
+            </w:pPr>
+            <w:r>
+              <w:rPr>
+                <w:rFonts w:ascii="맑은 고딕" w:hAnsi="맑은 고딕" w:eastAsia="맑은 고딕" w:cs="맑은 고딕"/>
+                <w:b w:val="0"/>
+                <w:sz w:val="17"/>
+              </w:rPr>
+              <w:t>0.905</w:t>
+            </w:r>
+          </w:p>
+        </w:tc>
+        <w:tc>
+          <w:tcPr>
+            <w:tcW w:type="dxa" w:w="1077"/>
+            <w:tcMar>
+              <w:top w:w="70" w:type="dxa"/>
+              <w:left w:w="90" w:type="dxa"/>
+              <w:bottom w:w="70" w:type="dxa"/>
+              <w:right w:w="90" w:type="dxa"/>
+            </w:tcMar>
+          </w:tcPr>
+          <w:p>
+            <w:pPr>
+              <w:spacing w:after="0" w:line="276" w:lineRule="auto"/>
+            </w:pPr>
+            <w:r>
+              <w:rPr>
+                <w:rFonts w:ascii="맑은 고딕" w:hAnsi="맑은 고딕" w:eastAsia="맑은 고딕" w:cs="맑은 고딕"/>
+                <w:b w:val="0"/>
+                <w:sz w:val="17"/>
+              </w:rPr>
+              <w:t>0.929</w:t>
+            </w:r>
+          </w:p>
+        </w:tc>
+        <w:tc>
+          <w:tcPr>
+            <w:tcW w:type="dxa" w:w="1077"/>
+            <w:tcMar>
+              <w:top w:w="70" w:type="dxa"/>
+              <w:left w:w="90" w:type="dxa"/>
+              <w:bottom w:w="70" w:type="dxa"/>
+              <w:right w:w="90" w:type="dxa"/>
+            </w:tcMar>
+          </w:tcPr>
+          <w:p>
+            <w:pPr>
+              <w:spacing w:after="0" w:line="276" w:lineRule="auto"/>
+            </w:pPr>
+            <w:r>
+              <w:rPr>
+                <w:rFonts w:ascii="맑은 고딕" w:hAnsi="맑은 고딕" w:eastAsia="맑은 고딕" w:cs="맑은 고딕"/>
+                <w:b w:val="0"/>
+                <w:sz w:val="17"/>
+              </w:rPr>
+              <w:t>0.770</w:t>
+            </w:r>
+          </w:p>
+        </w:tc>
+      </w:tr>
+      <w:tr>
+        <w:trPr>
+          <w:cantSplit/>
+        </w:trPr>
+        <w:tc>
+          <w:tcPr>
+            <w:tcW w:type="dxa" w:w="4762"/>
+            <w:tcMar>
+              <w:top w:w="70" w:type="dxa"/>
+              <w:left w:w="90" w:type="dxa"/>
+              <w:bottom w:w="70" w:type="dxa"/>
+              <w:right w:w="90" w:type="dxa"/>
+            </w:tcMar>
+          </w:tcPr>
+          <w:p>
+            <w:pPr>
+              <w:spacing w:after="0" w:line="276" w:lineRule="auto"/>
+            </w:pPr>
+            <w:r>
+              <w:rPr>
+                <w:rFonts w:ascii="맑은 고딕" w:hAnsi="맑은 고딕" w:eastAsia="맑은 고딕" w:cs="맑은 고딕"/>
+                <w:b w:val="0"/>
+                <w:sz w:val="17"/>
+              </w:rPr>
+              <w:t>2중 하이브리드 RRF: Dense(KO) + BM25(EN)</w:t>
+            </w:r>
+          </w:p>
+        </w:tc>
+        <w:tc>
+          <w:tcPr>
+            <w:tcW w:type="dxa" w:w="1077"/>
+            <w:tcMar>
+              <w:top w:w="70" w:type="dxa"/>
+              <w:left w:w="90" w:type="dxa"/>
+              <w:bottom w:w="70" w:type="dxa"/>
+              <w:right w:w="90" w:type="dxa"/>
+            </w:tcMar>
+          </w:tcPr>
+          <w:p>
+            <w:pPr>
+              <w:spacing w:after="0" w:line="276" w:lineRule="auto"/>
+            </w:pPr>
+            <w:r>
+              <w:rPr>
+                <w:rFonts w:ascii="맑은 고딕" w:hAnsi="맑은 고딕" w:eastAsia="맑은 고딕" w:cs="맑은 고딕"/>
+                <w:b w:val="0"/>
+                <w:sz w:val="17"/>
+              </w:rPr>
+              <w:t>0.643</w:t>
+            </w:r>
+          </w:p>
+        </w:tc>
+        <w:tc>
+          <w:tcPr>
+            <w:tcW w:type="dxa" w:w="1077"/>
+            <w:tcMar>
+              <w:top w:w="70" w:type="dxa"/>
+              <w:left w:w="90" w:type="dxa"/>
+              <w:bottom w:w="70" w:type="dxa"/>
+              <w:right w:w="90" w:type="dxa"/>
+            </w:tcMar>
+          </w:tcPr>
+          <w:p>
+            <w:pPr>
+              <w:spacing w:after="0" w:line="276" w:lineRule="auto"/>
+            </w:pPr>
+            <w:r>
+              <w:rPr>
+                <w:rFonts w:ascii="맑은 고딕" w:hAnsi="맑은 고딕" w:eastAsia="맑은 고딕" w:cs="맑은 고딕"/>
+                <w:b w:val="0"/>
+                <w:sz w:val="17"/>
+              </w:rPr>
+              <w:t>0.929</w:t>
+            </w:r>
+          </w:p>
+        </w:tc>
+        <w:tc>
+          <w:tcPr>
+            <w:tcW w:type="dxa" w:w="1077"/>
+            <w:tcMar>
+              <w:top w:w="70" w:type="dxa"/>
+              <w:left w:w="90" w:type="dxa"/>
+              <w:bottom w:w="70" w:type="dxa"/>
+              <w:right w:w="90" w:type="dxa"/>
+            </w:tcMar>
+          </w:tcPr>
+          <w:p>
+            <w:pPr>
+              <w:spacing w:after="0" w:line="276" w:lineRule="auto"/>
+            </w:pPr>
+            <w:r>
+              <w:rPr>
+                <w:rFonts w:ascii="맑은 고딕" w:hAnsi="맑은 고딕" w:eastAsia="맑은 고딕" w:cs="맑은 고딕"/>
+                <w:b w:val="0"/>
+                <w:sz w:val="17"/>
+              </w:rPr>
+              <w:t>0.929</w:t>
+            </w:r>
+          </w:p>
+        </w:tc>
+        <w:tc>
+          <w:tcPr>
+            <w:tcW w:type="dxa" w:w="1077"/>
+            <w:tcMar>
+              <w:top w:w="70" w:type="dxa"/>
+              <w:left w:w="90" w:type="dxa"/>
+              <w:bottom w:w="70" w:type="dxa"/>
+              <w:right w:w="90" w:type="dxa"/>
+            </w:tcMar>
+          </w:tcPr>
+          <w:p>
+            <w:pPr>
+              <w:spacing w:after="0" w:line="276" w:lineRule="auto"/>
+            </w:pPr>
+            <w:r>
+              <w:rPr>
+                <w:rFonts w:ascii="맑은 고딕" w:hAnsi="맑은 고딕" w:eastAsia="맑은 고딕" w:cs="맑은 고딕"/>
+                <w:b w:val="0"/>
+                <w:sz w:val="17"/>
+              </w:rPr>
+              <w:t>0.786</w:t>
+            </w:r>
+          </w:p>
+        </w:tc>
+      </w:tr>
+      <w:tr>
+        <w:trPr>
+          <w:cantSplit/>
+        </w:trPr>
+        <w:tc>
+          <w:tcPr>
+            <w:tcW w:type="dxa" w:w="4762"/>
+            <w:tcMar>
+              <w:top w:w="70" w:type="dxa"/>
+              <w:left w:w="90" w:type="dxa"/>
+              <w:bottom w:w="70" w:type="dxa"/>
+              <w:right w:w="90" w:type="dxa"/>
+            </w:tcMar>
+          </w:tcPr>
+          <w:p>
+            <w:pPr>
+              <w:spacing w:after="0" w:line="276" w:lineRule="auto"/>
+            </w:pPr>
+            <w:r>
+              <w:rPr>
+                <w:rFonts w:ascii="맑은 고딕" w:hAnsi="맑은 고딕" w:eastAsia="맑은 고딕" w:cs="맑은 고딕"/>
+                <w:b w:val="0"/>
+                <w:sz w:val="17"/>
+              </w:rPr>
+              <w:t>3중 하이브리드 RRF: Dense(KO) + Dense(EN) + BM25(EN)</w:t>
+            </w:r>
+          </w:p>
+        </w:tc>
+        <w:tc>
+          <w:tcPr>
+            <w:tcW w:type="dxa" w:w="1077"/>
+            <w:tcMar>
+              <w:top w:w="70" w:type="dxa"/>
+              <w:left w:w="90" w:type="dxa"/>
+              <w:bottom w:w="70" w:type="dxa"/>
+              <w:right w:w="90" w:type="dxa"/>
+            </w:tcMar>
+          </w:tcPr>
+          <w:p>
+            <w:pPr>
+              <w:spacing w:after="0" w:line="276" w:lineRule="auto"/>
+            </w:pPr>
+            <w:r>
+              <w:rPr>
+                <w:rFonts w:ascii="맑은 고딕" w:hAnsi="맑은 고딕" w:eastAsia="맑은 고딕" w:cs="맑은 고딕"/>
+                <w:b w:val="0"/>
+                <w:sz w:val="17"/>
+              </w:rPr>
+              <w:t>0.643</w:t>
+            </w:r>
+          </w:p>
+        </w:tc>
+        <w:tc>
+          <w:tcPr>
+            <w:tcW w:type="dxa" w:w="1077"/>
+            <w:tcMar>
+              <w:top w:w="70" w:type="dxa"/>
+              <w:left w:w="90" w:type="dxa"/>
+              <w:bottom w:w="70" w:type="dxa"/>
+              <w:right w:w="90" w:type="dxa"/>
+            </w:tcMar>
+          </w:tcPr>
+          <w:p>
+            <w:pPr>
+              <w:spacing w:after="0" w:line="276" w:lineRule="auto"/>
+            </w:pPr>
+            <w:r>
+              <w:rPr>
+                <w:rFonts w:ascii="맑은 고딕" w:hAnsi="맑은 고딕" w:eastAsia="맑은 고딕" w:cs="맑은 고딕"/>
+                <w:b w:val="0"/>
+                <w:sz w:val="17"/>
+              </w:rPr>
+              <w:t>0.881</w:t>
+            </w:r>
+          </w:p>
+        </w:tc>
+        <w:tc>
+          <w:tcPr>
+            <w:tcW w:type="dxa" w:w="1077"/>
+            <w:tcMar>
+              <w:top w:w="70" w:type="dxa"/>
+              <w:left w:w="90" w:type="dxa"/>
+              <w:bottom w:w="70" w:type="dxa"/>
+              <w:right w:w="90" w:type="dxa"/>
+            </w:tcMar>
+          </w:tcPr>
+          <w:p>
+            <w:pPr>
+              <w:spacing w:after="0" w:line="276" w:lineRule="auto"/>
+            </w:pPr>
+            <w:r>
+              <w:rPr>
+                <w:rFonts w:ascii="맑은 고딕" w:hAnsi="맑은 고딕" w:eastAsia="맑은 고딕" w:cs="맑은 고딕"/>
+                <w:b w:val="0"/>
+                <w:sz w:val="17"/>
+              </w:rPr>
+              <w:t>0.952</w:t>
+            </w:r>
+          </w:p>
+        </w:tc>
+        <w:tc>
+          <w:tcPr>
+            <w:tcW w:type="dxa" w:w="1077"/>
+            <w:tcMar>
+              <w:top w:w="70" w:type="dxa"/>
+              <w:left w:w="90" w:type="dxa"/>
+              <w:bottom w:w="70" w:type="dxa"/>
+              <w:right w:w="90" w:type="dxa"/>
+            </w:tcMar>
+          </w:tcPr>
+          <w:p>
+            <w:pPr>
+              <w:spacing w:after="0" w:line="276" w:lineRule="auto"/>
+            </w:pPr>
+            <w:r>
+              <w:rPr>
+                <w:rFonts w:ascii="맑은 고딕" w:hAnsi="맑은 고딕" w:eastAsia="맑은 고딕" w:cs="맑은 고딕"/>
+                <w:b w:val="0"/>
+                <w:sz w:val="17"/>
+              </w:rPr>
+              <w:t>0.778</w:t>
+            </w:r>
+          </w:p>
+        </w:tc>
+      </w:tr>
+      <w:tr>
+        <w:trPr>
+          <w:cantSplit/>
+        </w:trPr>
+        <w:tc>
+          <w:tcPr>
+            <w:tcW w:type="dxa" w:w="4762"/>
+            <w:tcMar>
+              <w:top w:w="70" w:type="dxa"/>
+              <w:left w:w="90" w:type="dxa"/>
+              <w:bottom w:w="70" w:type="dxa"/>
+              <w:right w:w="90" w:type="dxa"/>
+            </w:tcMar>
+          </w:tcPr>
+          <w:p>
+            <w:pPr>
+              <w:spacing w:after="0" w:line="276" w:lineRule="auto"/>
+            </w:pPr>
+            <w:r>
+              <w:rPr>
+                <w:rFonts w:ascii="맑은 고딕" w:hAnsi="맑은 고딕" w:eastAsia="맑은 고딕" w:cs="맑은 고딕"/>
+                <w:b w:val="0"/>
+                <w:sz w:val="17"/>
+              </w:rPr>
+              <w:t>2중 하이브리드 RRF + reranker (참고)</w:t>
+            </w:r>
+          </w:p>
+        </w:tc>
+        <w:tc>
+          <w:tcPr>
+            <w:tcW w:type="dxa" w:w="1077"/>
+            <w:tcMar>
+              <w:top w:w="70" w:type="dxa"/>
+              <w:left w:w="90" w:type="dxa"/>
+              <w:bottom w:w="70" w:type="dxa"/>
+              <w:right w:w="90" w:type="dxa"/>
+            </w:tcMar>
+          </w:tcPr>
+          <w:p>
+            <w:pPr>
+              <w:spacing w:after="0" w:line="276" w:lineRule="auto"/>
+            </w:pPr>
+            <w:r>
+              <w:rPr>
+                <w:rFonts w:ascii="맑은 고딕" w:hAnsi="맑은 고딕" w:eastAsia="맑은 고딕" w:cs="맑은 고딕"/>
+                <w:b w:val="0"/>
+                <w:sz w:val="17"/>
+              </w:rPr>
+              <w:t>0.786</w:t>
+            </w:r>
+          </w:p>
+        </w:tc>
+        <w:tc>
+          <w:tcPr>
+            <w:tcW w:type="dxa" w:w="1077"/>
+            <w:tcMar>
+              <w:top w:w="70" w:type="dxa"/>
+              <w:left w:w="90" w:type="dxa"/>
+              <w:bottom w:w="70" w:type="dxa"/>
+              <w:right w:w="90" w:type="dxa"/>
+            </w:tcMar>
+          </w:tcPr>
+          <w:p>
+            <w:pPr>
+              <w:spacing w:after="0" w:line="276" w:lineRule="auto"/>
+            </w:pPr>
+            <w:r>
+              <w:rPr>
+                <w:rFonts w:ascii="맑은 고딕" w:hAnsi="맑은 고딕" w:eastAsia="맑은 고딕" w:cs="맑은 고딕"/>
+                <w:b w:val="0"/>
+                <w:sz w:val="17"/>
+              </w:rPr>
+              <w:t>0.952</w:t>
+            </w:r>
+          </w:p>
+        </w:tc>
+        <w:tc>
+          <w:tcPr>
+            <w:tcW w:type="dxa" w:w="1077"/>
+            <w:tcMar>
+              <w:top w:w="70" w:type="dxa"/>
+              <w:left w:w="90" w:type="dxa"/>
+              <w:bottom w:w="70" w:type="dxa"/>
+              <w:right w:w="90" w:type="dxa"/>
+            </w:tcMar>
+          </w:tcPr>
+          <w:p>
+            <w:pPr>
+              <w:spacing w:after="0" w:line="276" w:lineRule="auto"/>
+            </w:pPr>
+            <w:r>
+              <w:rPr>
+                <w:rFonts w:ascii="맑은 고딕" w:hAnsi="맑은 고딕" w:eastAsia="맑은 고딕" w:cs="맑은 고딕"/>
+                <w:b w:val="0"/>
+                <w:sz w:val="17"/>
+              </w:rPr>
+              <w:t>0.976</w:t>
+            </w:r>
+          </w:p>
+        </w:tc>
+        <w:tc>
+          <w:tcPr>
+            <w:tcW w:type="dxa" w:w="1077"/>
+            <w:tcMar>
+              <w:top w:w="70" w:type="dxa"/>
+              <w:left w:w="90" w:type="dxa"/>
+              <w:bottom w:w="70" w:type="dxa"/>
+              <w:right w:w="90" w:type="dxa"/>
+            </w:tcMar>
+          </w:tcPr>
+          <w:p>
+            <w:pPr>
+              <w:spacing w:after="0" w:line="276" w:lineRule="auto"/>
+            </w:pPr>
+            <w:r>
+              <w:rPr>
+                <w:rFonts w:ascii="맑은 고딕" w:hAnsi="맑은 고딕" w:eastAsia="맑은 고딕" w:cs="맑은 고딕"/>
+                <w:b w:val="0"/>
+                <w:sz w:val="17"/>
+              </w:rPr>
+              <w:t>0.863</w:t>
+            </w:r>
+          </w:p>
+        </w:tc>
+      </w:tr>
+      <w:tr>
+        <w:trPr>
+          <w:cantSplit/>
+        </w:trPr>
+        <w:tc>
+          <w:tcPr>
+            <w:tcW w:type="dxa" w:w="4762"/>
+            <w:tcMar>
+              <w:top w:w="70" w:type="dxa"/>
+              <w:left w:w="90" w:type="dxa"/>
+              <w:bottom w:w="70" w:type="dxa"/>
+              <w:right w:w="90" w:type="dxa"/>
+            </w:tcMar>
+          </w:tcPr>
+          <w:p>
+            <w:pPr>
+              <w:spacing w:after="0" w:line="276" w:lineRule="auto"/>
+            </w:pPr>
+            <w:r>
+              <w:rPr>
+                <w:rFonts w:ascii="맑은 고딕" w:hAnsi="맑은 고딕" w:eastAsia="맑은 고딕" w:cs="맑은 고딕"/>
+                <w:b/>
+                <w:color w:val="161A58"/>
+                <w:sz w:val="17"/>
+              </w:rPr>
+              <w:t>3중 하이브리드 RRF + reranker ← 채택(v1에서 고정)</w:t>
+            </w:r>
+          </w:p>
+        </w:tc>
+        <w:tc>
+          <w:tcPr>
+            <w:tcW w:type="dxa" w:w="1077"/>
+            <w:tcMar>
+              <w:top w:w="70" w:type="dxa"/>
+              <w:left w:w="90" w:type="dxa"/>
+              <w:bottom w:w="70" w:type="dxa"/>
+              <w:right w:w="90" w:type="dxa"/>
+            </w:tcMar>
+          </w:tcPr>
+          <w:p>
+            <w:pPr>
+              <w:spacing w:after="0" w:line="276" w:lineRule="auto"/>
+            </w:pPr>
+            <w:r>
+              <w:rPr>
+                <w:rFonts w:ascii="맑은 고딕" w:hAnsi="맑은 고딕" w:eastAsia="맑은 고딕" w:cs="맑은 고딕"/>
+                <w:b w:val="0"/>
+                <w:sz w:val="17"/>
+              </w:rPr>
+              <w:t>0.786</w:t>
+            </w:r>
+          </w:p>
+        </w:tc>
+        <w:tc>
+          <w:tcPr>
+            <w:tcW w:type="dxa" w:w="1077"/>
+            <w:tcMar>
+              <w:top w:w="70" w:type="dxa"/>
+              <w:left w:w="90" w:type="dxa"/>
+              <w:bottom w:w="70" w:type="dxa"/>
+              <w:right w:w="90" w:type="dxa"/>
+            </w:tcMar>
+          </w:tcPr>
+          <w:p>
+            <w:pPr>
+              <w:spacing w:after="0" w:line="276" w:lineRule="auto"/>
+            </w:pPr>
+            <w:r>
+              <w:rPr>
+                <w:rFonts w:ascii="맑은 고딕" w:hAnsi="맑은 고딕" w:eastAsia="맑은 고딕" w:cs="맑은 고딕"/>
+                <w:b w:val="0"/>
+                <w:sz w:val="17"/>
+              </w:rPr>
+              <w:t>0.952</w:t>
+            </w:r>
+          </w:p>
+        </w:tc>
+        <w:tc>
+          <w:tcPr>
+            <w:tcW w:type="dxa" w:w="1077"/>
+            <w:tcMar>
+              <w:top w:w="70" w:type="dxa"/>
+              <w:left w:w="90" w:type="dxa"/>
+              <w:bottom w:w="70" w:type="dxa"/>
+              <w:right w:w="90" w:type="dxa"/>
+            </w:tcMar>
+          </w:tcPr>
+          <w:p>
+            <w:pPr>
+              <w:spacing w:after="0" w:line="276" w:lineRule="auto"/>
+            </w:pPr>
+            <w:r>
+              <w:rPr>
+                <w:rFonts w:ascii="맑은 고딕" w:hAnsi="맑은 고딕" w:eastAsia="맑은 고딕" w:cs="맑은 고딕"/>
+                <w:b w:val="0"/>
+                <w:sz w:val="17"/>
+              </w:rPr>
+              <w:t>0.976</w:t>
+            </w:r>
+          </w:p>
+        </w:tc>
+        <w:tc>
+          <w:tcPr>
+            <w:tcW w:type="dxa" w:w="1077"/>
+            <w:tcMar>
+              <w:top w:w="70" w:type="dxa"/>
+              <w:left w:w="90" w:type="dxa"/>
+              <w:bottom w:w="70" w:type="dxa"/>
+              <w:right w:w="90" w:type="dxa"/>
+            </w:tcMar>
+          </w:tcPr>
+          <w:p>
+            <w:pPr>
+              <w:spacing w:after="0" w:line="276" w:lineRule="auto"/>
+            </w:pPr>
+            <w:r>
+              <w:rPr>
+                <w:rFonts w:ascii="맑은 고딕" w:hAnsi="맑은 고딕" w:eastAsia="맑은 고딕" w:cs="맑은 고딕"/>
+                <w:b w:val="0"/>
+                <w:sz w:val="17"/>
+              </w:rPr>
+              <w:t>0.863</w:t>
+            </w:r>
+          </w:p>
+        </w:tc>
+      </w:tr>
+    </w:tbl>
+    <w:p>
+      <w:pPr>
+        <w:spacing w:after="80" w:line="324" w:lineRule="auto"/>
+      </w:pPr>
+    </w:p>
+    <w:p>
+      <w:pPr>
+        <w:spacing w:after="80" w:line="324" w:lineRule="auto"/>
+        <w:ind w:left="113"/>
+        <w:pBdr>
+          <w:left w:val="single" w:sz="18" w:space="6" w:color="7F4ACB"/>
+        </w:pBdr>
+      </w:pPr>
+      <w:r>
+        <w:rPr>
+          <w:rFonts w:ascii="맑은 고딕" w:hAnsi="맑은 고딕" w:eastAsia="맑은 고딕" w:cs="맑은 고딕"/>
+          <w:b/>
+          <w:color w:val="555A6E"/>
+          <w:sz w:val="18"/>
+        </w:rPr>
+        <w:t>해석:</w:t>
+      </w:r>
+      <w:r>
+        <w:rPr>
+          <w:rFonts w:ascii="맑은 고딕" w:hAnsi="맑은 고딕" w:eastAsia="맑은 고딕" w:cs="맑은 고딕"/>
+          <w:b w:val="0"/>
+          <w:color w:val="555A6E"/>
+          <w:sz w:val="18"/>
+        </w:rPr>
+        <w:t xml:space="preserve"> 임베딩 순위는 v1과 같다. bge-m3가 전체 Hit@1·3·5와 MRR에서 가장 높았고, </w:t>
+      </w:r>
+      <w:r>
+        <w:rPr>
+          <w:rFonts w:ascii="D2Coding" w:hAnsi="D2Coding" w:eastAsia="맑은 고딕" w:cs="D2Coding"/>
+          <w:b w:val="0"/>
+          <w:color w:val="5B3FA0"/>
+          <w:sz w:val="17"/>
+        </w:rPr>
+        <w:t>min(SW, HW)</w:t>
+      </w:r>
+      <w:r>
+        <w:rPr>
+          <w:rFonts w:ascii="맑은 고딕" w:hAnsi="맑은 고딕" w:eastAsia="맑은 고딕" w:cs="맑은 고딕"/>
+          <w:b w:val="0"/>
+          <w:color w:val="555A6E"/>
+          <w:sz w:val="18"/>
+        </w:rPr>
+        <w:t>도 bge-m3 0.635, Qwen3 0.493이다. bge-m3는 청크 전체를 인코딩하자 MRR이 0.703에서 0.691로 약간 낮아졌다(1문항 순위 변화 수준). 채택 구성(3중 RRF + reranker)은 v1과 같은 Hit@1 0.786 · Hit@5 0.976 · MRR 0.863이다. 2중 RRF + reranker도 같은 값이라, reranker를 거친 뒤에는 이 평가셋으로 두 하이브리드의 차이가 드러나지 않는다. 설계는 v1에서 고정한 3중 구성을 유지한다(결과를 보고 사후에 교체하지 않음).</w:t>
+      </w:r>
+    </w:p>
+    <w:p>
+      <w:pPr>
+        <w:keepNext/>
+        <w:spacing w:after="80" w:line="324" w:lineRule="auto"/>
+      </w:pPr>
+      <w:r>
+        <w:rPr>
+          <w:rFonts w:ascii="맑은 고딕" w:hAnsi="맑은 고딕" w:eastAsia="맑은 고딕" w:cs="맑은 고딕"/>
+          <w:b/>
+          <w:color w:val="161A58"/>
+          <w:sz w:val="20"/>
+        </w:rPr>
         <w:t>평가의 한계와 향후 계획</w:t>
       </w:r>
     </w:p>
@@ -14864,7 +17038,7 @@
           <w:b w:val="0"/>
           <w:sz w:val="20"/>
         </w:rPr>
-        <w:t xml:space="preserve"> 위 수치는 일부 청크가 잘린 조건(</w:t>
+        <w:t xml:space="preserve"> v1 수치는 일부 청크가 잘린 조건(</w:t>
       </w:r>
       <w:r>
         <w:rPr>
@@ -14881,7 +17055,7 @@
           <w:b w:val="0"/>
           <w:sz w:val="20"/>
         </w:rPr>
-        <w:t xml:space="preserve"> 1,024)에서 측정했다.</w:t>
+        <w:t xml:space="preserve"> 1,024)에서 측정했다. 구현 조건(2,048)으로 다시 잰 v2 수치를 ④에 따로 적었다. v2는 판정 이력이 없는 쌍을 오답으로 처리했으므로 하한값이다.</w:t>
       </w:r>
     </w:p>
     <w:p>
@@ -14913,7 +17087,7 @@
           <w:b w:val="0"/>
           <w:sz w:val="20"/>
         </w:rPr>
-        <w:t xml:space="preserve"> 문항을 확충한 뒤 개발셋(설정 선택)과 테스트셋(최종 보고)을 분리한다. 현재 42문항을 둘로 나누면 테스트셋이 약 20문항이 되어 1문항이 5%p를 차지하므로, 확충이 먼저 필요하다. 재실행 결과는 새 수치(v2 측정)로 구분해 표기하고 기존 수치는 보존한다. 최종 42문항의 정답 청크 </w:t>
+        <w:t xml:space="preserve"> 문항을 확충한 뒤 개발셋(설정 선택)과 테스트셋(최종 보고)을 분리한다. 최종 성능은 테스트셋 수치로만 보고한다. 현재 42문항을 둘로 나누면 테스트셋이 약 20문항이 되어 1문항이 5%p를 차지하므로, 확충이 먼저 필요하다. 재실행 결과는 새 수치(v2 측정)로 구분해 표기하고 기존 수치는 보존한다. 최종 42문항의 정답 청크 </w:t>
       </w:r>
       <w:r>
         <w:rPr>
@@ -16146,7 +18320,58 @@
                 <w:b w:val="0"/>
                 <w:sz w:val="17"/>
               </w:rPr>
-              <w:t>으로 묶는다(Google 계열: research.google, blog.google, deepmind.google 등 / SK hynix 계열: skhynix.com, news.skhynix.com 등). 모든 웹 근거에 벤더/제3자 라벨을 붙인다.</w:t>
+              <w:t xml:space="preserve">으로 묶는다(Google 계열: research.google, blog.google, deepmind.google 등 / SK hynix 계열: skhynix.com, news.skhynix.com 등). 모든 웹 근거에 벤더/제3자 라벨을 붙인다. 도메인이 달라도 </w:t>
+            </w:r>
+            <w:r>
+              <w:rPr>
+                <w:rFonts w:ascii="맑은 고딕" w:hAnsi="맑은 고딕" w:eastAsia="맑은 고딕" w:cs="맑은 고딕"/>
+                <w:b/>
+                <w:color w:val="161A58"/>
+                <w:sz w:val="17"/>
+              </w:rPr>
+              <w:t>같은 보도자료·블로그를 재인용한 기사</w:t>
+            </w:r>
+            <w:r>
+              <w:rPr>
+                <w:rFonts w:ascii="맑은 고딕" w:hAnsi="맑은 고딕" w:eastAsia="맑은 고딕" w:cs="맑은 고딕"/>
+                <w:b w:val="0"/>
+                <w:sz w:val="17"/>
+              </w:rPr>
+              <w:t xml:space="preserve">는 독립 근거가 아니므로, 근거마다 </w:t>
+            </w:r>
+            <w:r>
+              <w:rPr>
+                <w:rFonts w:ascii="D2Coding" w:hAnsi="D2Coding" w:eastAsia="맑은 고딕" w:cs="D2Coding"/>
+                <w:b w:val="0"/>
+                <w:color w:val="5B3FA0"/>
+                <w:sz w:val="16"/>
+              </w:rPr>
+              <w:t>origin_group</w:t>
+            </w:r>
+            <w:r>
+              <w:rPr>
+                <w:rFonts w:ascii="맑은 고딕" w:hAnsi="맑은 고딕" w:eastAsia="맑은 고딕" w:cs="맑은 고딕"/>
+                <w:b w:val="0"/>
+                <w:sz w:val="17"/>
+              </w:rPr>
+              <w:t xml:space="preserve">(원 출처 계열)을 붙인다. 50% 비중과 찬반 할당량은 </w:t>
+            </w:r>
+            <w:r>
+              <w:rPr>
+                <w:rFonts w:ascii="맑은 고딕" w:hAnsi="맑은 고딕" w:eastAsia="맑은 고딕" w:cs="맑은 고딕"/>
+                <w:b/>
+                <w:color w:val="161A58"/>
+                <w:sz w:val="17"/>
+              </w:rPr>
+              <w:t>독립 계열 수</w:t>
+            </w:r>
+            <w:r>
+              <w:rPr>
+                <w:rFonts w:ascii="맑은 고딕" w:hAnsi="맑은 고딕" w:eastAsia="맑은 고딕" w:cs="맑은 고딕"/>
+                <w:b w:val="0"/>
+                <w:sz w:val="17"/>
+              </w:rPr>
+              <w:t xml:space="preserve"> 기준으로 센다. 예: Google 블로그 → 기술 매체 기사 → 그 기사를 재인용한 기사는 1계열이다.</w:t>
             </w:r>
           </w:p>
         </w:tc>
@@ -18876,6 +21101,55 @@
           <w:color w:val="161A58"/>
           <w:sz w:val="20"/>
         </w:rPr>
+        <w:t>임계값의 성격:</w:t>
+      </w:r>
+      <w:r>
+        <w:rPr>
+          <w:rFonts w:ascii="맑은 고딕" w:hAnsi="맑은 고딕" w:eastAsia="맑은 고딕" w:cs="맑은 고딕"/>
+          <w:b w:val="0"/>
+          <w:sz w:val="20"/>
+        </w:rPr>
+        <w:t xml:space="preserve"> 2.0·1.0 같은 상충 임계값과 H1 경계값은 기술의 절대적 평가 기준이 아니다. 관점 간 차이를 일관되게 분류하려고 </w:t>
+      </w:r>
+      <w:r>
+        <w:rPr>
+          <w:rFonts w:ascii="맑은 고딕" w:hAnsi="맑은 고딕" w:eastAsia="맑은 고딕" w:cs="맑은 고딕"/>
+          <w:b/>
+          <w:color w:val="161A58"/>
+          <w:sz w:val="20"/>
+        </w:rPr>
+        <w:t>분석 전에 고정한 운영 규칙(heuristic)</w:t>
+      </w:r>
+      <w:r>
+        <w:rPr>
+          <w:rFonts w:ascii="맑은 고딕" w:hAnsi="맑은 고딕" w:eastAsia="맑은 고딕" w:cs="맑은 고딕"/>
+          <w:b w:val="0"/>
+          <w:sz w:val="20"/>
+        </w:rPr>
+        <w:t>이다. 보고서 6장에서는 임계값을 ±0.5 바꿨을 때 분류가 달라지는 칸 수를 함께 보고한다(민감도 점검).</w:t>
+      </w:r>
+    </w:p>
+    <w:p>
+      <w:pPr>
+        <w:spacing w:after="40" w:line="312" w:lineRule="auto"/>
+        <w:ind w:left="312" w:hanging="227"/>
+      </w:pPr>
+      <w:r>
+        <w:rPr>
+          <w:rFonts w:ascii="맑은 고딕" w:hAnsi="맑은 고딕" w:eastAsia="맑은 고딕" w:cs="맑은 고딕"/>
+          <w:b/>
+          <w:color w:val="7F4ACB"/>
+          <w:sz w:val="20"/>
+        </w:rPr>
+        <w:t xml:space="preserve">• </w:t>
+      </w:r>
+      <w:r>
+        <w:rPr>
+          <w:rFonts w:ascii="맑은 고딕" w:hAnsi="맑은 고딕" w:eastAsia="맑은 고딕" w:cs="맑은 고딕"/>
+          <w:b/>
+          <w:color w:val="161A58"/>
+          <w:sz w:val="20"/>
+        </w:rPr>
         <w:t>TRL을 분리한 이유:</w:t>
       </w:r>
       <w:r>
@@ -20111,7 +22385,7 @@
           <w:b w:val="0"/>
           <w:sz w:val="20"/>
         </w:rPr>
-        <w:t xml:space="preserve"> 벤더 출처군 기준으로 비중이 50% 이하가 되도록 하고, 벤더/제3자 라벨을 붙인다(ITME·TurboQuant 모두 1차 자료가 벤더 발표이므로 필수). 기술 고유(</w:t>
+        <w:t xml:space="preserve"> 원 출처 계열(재인용은 같은 계열) 기준으로 비중이 50% 이하가 되도록 하고, 벤더/제3자 라벨을 붙인다(ITME·TurboQuant 모두 1차 자료가 벤더 발표이므로 필수). 기술 고유(</w:t>
       </w:r>
       <w:r>
         <w:rPr>
@@ -20321,6 +22595,87 @@
           <w:sz w:val="22"/>
         </w:rPr>
         <w:t>2.4.1 에이전트 설계</w:t>
+      </w:r>
+    </w:p>
+    <w:p>
+      <w:pPr>
+        <w:spacing w:after="80" w:line="324" w:lineRule="auto"/>
+        <w:ind w:left="113"/>
+        <w:pBdr>
+          <w:left w:val="single" w:sz="18" w:space="6" w:color="7F4ACB"/>
+        </w:pBdr>
+      </w:pPr>
+      <w:r>
+        <w:rPr>
+          <w:rFonts w:ascii="맑은 고딕" w:hAnsi="맑은 고딕" w:eastAsia="맑은 고딕" w:cs="맑은 고딕"/>
+          <w:b/>
+          <w:color w:val="555A6E"/>
+          <w:sz w:val="18"/>
+        </w:rPr>
+        <w:t>용어:</w:t>
+      </w:r>
+      <w:r>
+        <w:rPr>
+          <w:rFonts w:ascii="맑은 고딕" w:hAnsi="맑은 고딕" w:eastAsia="맑은 고딕" w:cs="맑은 고딕"/>
+          <w:b w:val="0"/>
+          <w:color w:val="555A6E"/>
+          <w:sz w:val="18"/>
+        </w:rPr>
+        <w:t xml:space="preserve"> Agent는 하나의 독립된 판단 책임 단위이고, Node는 LangGraph의 실행 단위이다. 하나의 Agent는 여러 Node로 구현될 수 있다. 예를 들어 기술 조사 Agent는 </w:t>
+      </w:r>
+      <w:r>
+        <w:rPr>
+          <w:rFonts w:ascii="D2Coding" w:hAnsi="D2Coding" w:eastAsia="맑은 고딕" w:cs="D2Coding"/>
+          <w:b w:val="0"/>
+          <w:color w:val="5B3FA0"/>
+          <w:sz w:val="17"/>
+        </w:rPr>
+        <w:t>selection_validator</w:t>
+      </w:r>
+      <w:r>
+        <w:rPr>
+          <w:rFonts w:ascii="맑은 고딕" w:hAnsi="맑은 고딕" w:eastAsia="맑은 고딕" w:cs="맑은 고딕"/>
+          <w:b w:val="0"/>
+          <w:color w:val="555A6E"/>
+          <w:sz w:val="18"/>
+        </w:rPr>
+        <w:t xml:space="preserve">, </w:t>
+      </w:r>
+      <w:r>
+        <w:rPr>
+          <w:rFonts w:ascii="D2Coding" w:hAnsi="D2Coding" w:eastAsia="맑은 고딕" w:cs="D2Coding"/>
+          <w:b w:val="0"/>
+          <w:color w:val="5B3FA0"/>
+          <w:sz w:val="17"/>
+        </w:rPr>
+        <w:t>tech_research</w:t>
+      </w:r>
+      <w:r>
+        <w:rPr>
+          <w:rFonts w:ascii="맑은 고딕" w:hAnsi="맑은 고딕" w:eastAsia="맑은 고딕" w:cs="맑은 고딕"/>
+          <w:b w:val="0"/>
+          <w:color w:val="555A6E"/>
+          <w:sz w:val="18"/>
+        </w:rPr>
+        <w:t xml:space="preserve">, </w:t>
+      </w:r>
+      <w:r>
+        <w:rPr>
+          <w:rFonts w:ascii="D2Coding" w:hAnsi="D2Coding" w:eastAsia="맑은 고딕" w:cs="D2Coding"/>
+          <w:b w:val="0"/>
+          <w:color w:val="5B3FA0"/>
+          <w:sz w:val="17"/>
+        </w:rPr>
+        <w:t>trl_assessor</w:t>
+      </w:r>
+      <w:r>
+        <w:rPr>
+          <w:rFonts w:ascii="맑은 고딕" w:hAnsi="맑은 고딕" w:eastAsia="맑은 고딕" w:cs="맑은 고딕"/>
+          <w:b w:val="0"/>
+          <w:color w:val="555A6E"/>
+          <w:sz w:val="18"/>
+        </w:rPr>
+        <w:t xml:space="preserve"> 3개 노드로 구현된다. 전체는 에이전트 7개, 노드 18개이다.</w:t>
       </w:r>
     </w:p>
     <w:p>
@@ -22134,23 +24489,6 @@
           <w:color w:val="5B3FA0"/>
           <w:sz w:val="19"/>
         </w:rPr>
-        <w:t>human_review</w:t>
-      </w:r>
-      <w:r>
-        <w:rPr>
-          <w:rFonts w:ascii="맑은 고딕" w:hAnsi="맑은 고딕" w:eastAsia="맑은 고딕" w:cs="맑은 고딕"/>
-          <w:b w:val="0"/>
-          <w:sz w:val="20"/>
-        </w:rPr>
-        <w:t xml:space="preserve">(최대 1회), </w:t>
-      </w:r>
-      <w:r>
-        <w:rPr>
-          <w:rFonts w:ascii="D2Coding" w:hAnsi="D2Coding" w:eastAsia="맑은 고딕" w:cs="D2Coding"/>
-          <w:b w:val="0"/>
-          <w:color w:val="5B3FA0"/>
-          <w:sz w:val="19"/>
-        </w:rPr>
         <w:t>index_builder</w:t>
       </w:r>
       <w:r>
@@ -22922,7 +25260,24 @@
                 <w:b w:val="0"/>
                 <w:sz w:val="17"/>
               </w:rPr>
-              <w:t>선정 기술 2건(config/CLI), 진영, 선정 사유</w:t>
+              <w:t xml:space="preserve">팀이 선정한 기술 2건(config / </w:t>
+            </w:r>
+            <w:r>
+              <w:rPr>
+                <w:rFonts w:ascii="D2Coding" w:hAnsi="D2Coding" w:eastAsia="맑은 고딕" w:cs="D2Coding"/>
+                <w:b w:val="0"/>
+                <w:color w:val="5B3FA0"/>
+                <w:sz w:val="16"/>
+              </w:rPr>
+              <w:t>--tech</w:t>
+            </w:r>
+            <w:r>
+              <w:rPr>
+                <w:rFonts w:ascii="맑은 고딕" w:hAnsi="맑은 고딕" w:eastAsia="맑은 고딕" w:cs="맑은 고딕"/>
+                <w:b w:val="0"/>
+                <w:sz w:val="17"/>
+              </w:rPr>
+              <w:t>), 진영, 선정 사유. 실행 중 변경 없음</w:t>
             </w:r>
           </w:p>
         </w:tc>
@@ -22952,7 +25307,7 @@
                 <w:color w:val="5B3FA0"/>
                 <w:sz w:val="16"/>
               </w:rPr>
-              <w:t>selection_override</w:t>
+              <w:t>selection_validation</w:t>
             </w:r>
           </w:p>
         </w:tc>
@@ -22977,7 +25332,7 @@
                 <w:color w:val="5B3FA0"/>
                 <w:sz w:val="16"/>
               </w:rPr>
-              <w:t>Optional[list[Technology]]</w:t>
+              <w:t>SelectionValidation</w:t>
             </w:r>
           </w:p>
         </w:tc>
@@ -23001,7 +25356,7 @@
                 <w:b w:val="0"/>
                 <w:sz w:val="17"/>
               </w:rPr>
-              <w:t>human_review</w:t>
+              <w:t>selection_validator</w:t>
             </w:r>
           </w:p>
         </w:tc>
@@ -23025,278 +25380,7 @@
                 <w:b w:val="0"/>
                 <w:sz w:val="17"/>
               </w:rPr>
-              <w:t>selection_validator, query_planner</w:t>
-            </w:r>
-          </w:p>
-        </w:tc>
-        <w:tc>
-          <w:tcPr>
-            <w:tcW w:type="dxa" w:w="2438"/>
-            <w:tcMar>
-              <w:top w:w="70" w:type="dxa"/>
-              <w:left w:w="90" w:type="dxa"/>
-              <w:bottom w:w="70" w:type="dxa"/>
-              <w:right w:w="90" w:type="dxa"/>
-            </w:tcMar>
-          </w:tcPr>
-          <w:p>
-            <w:pPr>
-              <w:spacing w:after="0" w:line="276" w:lineRule="auto"/>
-            </w:pPr>
-            <w:r>
-              <w:rPr>
-                <w:rFonts w:ascii="맑은 고딕" w:hAnsi="맑은 고딕" w:eastAsia="맑은 고딕" w:cs="맑은 고딕"/>
-                <w:b w:val="0"/>
-                <w:sz w:val="17"/>
-              </w:rPr>
-              <w:t xml:space="preserve">대화형 확인에서 사람이 기술을 바꾼 경우만 값이 있음(없으면 </w:t>
-            </w:r>
-            <w:r>
-              <w:rPr>
-                <w:rFonts w:ascii="D2Coding" w:hAnsi="D2Coding" w:eastAsia="맑은 고딕" w:cs="D2Coding"/>
-                <w:b w:val="0"/>
-                <w:color w:val="5B3FA0"/>
-                <w:sz w:val="16"/>
-              </w:rPr>
-              <w:t>selected_techs</w:t>
-            </w:r>
-            <w:r>
-              <w:rPr>
-                <w:rFonts w:ascii="맑은 고딕" w:hAnsi="맑은 고딕" w:eastAsia="맑은 고딕" w:cs="맑은 고딕"/>
-                <w:b w:val="0"/>
-                <w:sz w:val="17"/>
-              </w:rPr>
-              <w:t xml:space="preserve"> 사용)</w:t>
-            </w:r>
-          </w:p>
-        </w:tc>
-      </w:tr>
-      <w:tr>
-        <w:trPr>
-          <w:cantSplit/>
-        </w:trPr>
-        <w:tc>
-          <w:tcPr>
-            <w:tcW w:type="dxa" w:w="1871"/>
-            <w:tcMar>
-              <w:top w:w="70" w:type="dxa"/>
-              <w:left w:w="90" w:type="dxa"/>
-              <w:bottom w:w="70" w:type="dxa"/>
-              <w:right w:w="90" w:type="dxa"/>
-            </w:tcMar>
-          </w:tcPr>
-          <w:p>
-            <w:pPr>
-              <w:spacing w:after="0" w:line="276" w:lineRule="auto"/>
-            </w:pPr>
-            <w:r>
-              <w:rPr>
-                <w:rFonts w:ascii="D2Coding" w:hAnsi="D2Coding" w:eastAsia="맑은 고딕" w:cs="D2Coding"/>
-                <w:b w:val="0"/>
-                <w:color w:val="5B3FA0"/>
-                <w:sz w:val="16"/>
-              </w:rPr>
-              <w:t>selection_review_count</w:t>
-            </w:r>
-          </w:p>
-        </w:tc>
-        <w:tc>
-          <w:tcPr>
-            <w:tcW w:type="dxa" w:w="1474"/>
-            <w:tcMar>
-              <w:top w:w="70" w:type="dxa"/>
-              <w:left w:w="90" w:type="dxa"/>
-              <w:bottom w:w="70" w:type="dxa"/>
-              <w:right w:w="90" w:type="dxa"/>
-            </w:tcMar>
-          </w:tcPr>
-          <w:p>
-            <w:pPr>
-              <w:spacing w:after="0" w:line="276" w:lineRule="auto"/>
-            </w:pPr>
-            <w:r>
-              <w:rPr>
-                <w:rFonts w:ascii="D2Coding" w:hAnsi="D2Coding" w:eastAsia="맑은 고딕" w:cs="D2Coding"/>
-                <w:b w:val="0"/>
-                <w:color w:val="5B3FA0"/>
-                <w:sz w:val="16"/>
-              </w:rPr>
-              <w:t>int</w:t>
-            </w:r>
-          </w:p>
-        </w:tc>
-        <w:tc>
-          <w:tcPr>
-            <w:tcW w:type="dxa" w:w="1587"/>
-            <w:tcMar>
-              <w:top w:w="70" w:type="dxa"/>
-              <w:left w:w="90" w:type="dxa"/>
-              <w:bottom w:w="70" w:type="dxa"/>
-              <w:right w:w="90" w:type="dxa"/>
-            </w:tcMar>
-          </w:tcPr>
-          <w:p>
-            <w:pPr>
-              <w:spacing w:after="0" w:line="276" w:lineRule="auto"/>
-            </w:pPr>
-            <w:r>
-              <w:rPr>
-                <w:rFonts w:ascii="맑은 고딕" w:hAnsi="맑은 고딕" w:eastAsia="맑은 고딕" w:cs="맑은 고딕"/>
-                <w:b w:val="0"/>
-                <w:sz w:val="17"/>
-              </w:rPr>
-              <w:t>human_review</w:t>
-            </w:r>
-          </w:p>
-        </w:tc>
-        <w:tc>
-          <w:tcPr>
-            <w:tcW w:type="dxa" w:w="1701"/>
-            <w:tcMar>
-              <w:top w:w="70" w:type="dxa"/>
-              <w:left w:w="90" w:type="dxa"/>
-              <w:bottom w:w="70" w:type="dxa"/>
-              <w:right w:w="90" w:type="dxa"/>
-            </w:tcMar>
-          </w:tcPr>
-          <w:p>
-            <w:pPr>
-              <w:spacing w:after="0" w:line="276" w:lineRule="auto"/>
-            </w:pPr>
-            <w:r>
-              <w:rPr>
-                <w:rFonts w:ascii="맑은 고딕" w:hAnsi="맑은 고딕" w:eastAsia="맑은 고딕" w:cs="맑은 고딕"/>
-                <w:b w:val="0"/>
-                <w:sz w:val="17"/>
-              </w:rPr>
-              <w:t>라우터</w:t>
-            </w:r>
-          </w:p>
-        </w:tc>
-        <w:tc>
-          <w:tcPr>
-            <w:tcW w:type="dxa" w:w="2438"/>
-            <w:tcMar>
-              <w:top w:w="70" w:type="dxa"/>
-              <w:left w:w="90" w:type="dxa"/>
-              <w:bottom w:w="70" w:type="dxa"/>
-              <w:right w:w="90" w:type="dxa"/>
-            </w:tcMar>
-          </w:tcPr>
-          <w:p>
-            <w:pPr>
-              <w:spacing w:after="0" w:line="276" w:lineRule="auto"/>
-            </w:pPr>
-            <w:r>
-              <w:rPr>
-                <w:rFonts w:ascii="맑은 고딕" w:hAnsi="맑은 고딕" w:eastAsia="맑은 고딕" w:cs="맑은 고딕"/>
-                <w:b w:val="0"/>
-                <w:sz w:val="17"/>
-              </w:rPr>
-              <w:t>선정 재확인 횟수(최대 1)</w:t>
-            </w:r>
-          </w:p>
-        </w:tc>
-      </w:tr>
-      <w:tr>
-        <w:trPr>
-          <w:cantSplit/>
-        </w:trPr>
-        <w:tc>
-          <w:tcPr>
-            <w:tcW w:type="dxa" w:w="1871"/>
-            <w:tcMar>
-              <w:top w:w="70" w:type="dxa"/>
-              <w:left w:w="90" w:type="dxa"/>
-              <w:bottom w:w="70" w:type="dxa"/>
-              <w:right w:w="90" w:type="dxa"/>
-            </w:tcMar>
-          </w:tcPr>
-          <w:p>
-            <w:pPr>
-              <w:spacing w:after="0" w:line="276" w:lineRule="auto"/>
-            </w:pPr>
-            <w:r>
-              <w:rPr>
-                <w:rFonts w:ascii="D2Coding" w:hAnsi="D2Coding" w:eastAsia="맑은 고딕" w:cs="D2Coding"/>
-                <w:b w:val="0"/>
-                <w:color w:val="5B3FA0"/>
-                <w:sz w:val="16"/>
-              </w:rPr>
-              <w:t>selection_validation</w:t>
-            </w:r>
-          </w:p>
-        </w:tc>
-        <w:tc>
-          <w:tcPr>
-            <w:tcW w:type="dxa" w:w="1474"/>
-            <w:tcMar>
-              <w:top w:w="70" w:type="dxa"/>
-              <w:left w:w="90" w:type="dxa"/>
-              <w:bottom w:w="70" w:type="dxa"/>
-              <w:right w:w="90" w:type="dxa"/>
-            </w:tcMar>
-          </w:tcPr>
-          <w:p>
-            <w:pPr>
-              <w:spacing w:after="0" w:line="276" w:lineRule="auto"/>
-            </w:pPr>
-            <w:r>
-              <w:rPr>
-                <w:rFonts w:ascii="D2Coding" w:hAnsi="D2Coding" w:eastAsia="맑은 고딕" w:cs="D2Coding"/>
-                <w:b w:val="0"/>
-                <w:color w:val="5B3FA0"/>
-                <w:sz w:val="16"/>
-              </w:rPr>
-              <w:t>SelectionValidation</w:t>
-            </w:r>
-          </w:p>
-        </w:tc>
-        <w:tc>
-          <w:tcPr>
-            <w:tcW w:type="dxa" w:w="1587"/>
-            <w:tcMar>
-              <w:top w:w="70" w:type="dxa"/>
-              <w:left w:w="90" w:type="dxa"/>
-              <w:bottom w:w="70" w:type="dxa"/>
-              <w:right w:w="90" w:type="dxa"/>
-            </w:tcMar>
-          </w:tcPr>
-          <w:p>
-            <w:pPr>
-              <w:spacing w:after="0" w:line="276" w:lineRule="auto"/>
-            </w:pPr>
-            <w:r>
-              <w:rPr>
-                <w:rFonts w:ascii="맑은 고딕" w:hAnsi="맑은 고딕" w:eastAsia="맑은 고딕" w:cs="맑은 고딕"/>
-                <w:b w:val="0"/>
-                <w:sz w:val="17"/>
-              </w:rPr>
-              <w:t>selection_validator</w:t>
-            </w:r>
-          </w:p>
-        </w:tc>
-        <w:tc>
-          <w:tcPr>
-            <w:tcW w:type="dxa" w:w="1701"/>
-            <w:tcMar>
-              <w:top w:w="70" w:type="dxa"/>
-              <w:left w:w="90" w:type="dxa"/>
-              <w:bottom w:w="70" w:type="dxa"/>
-              <w:right w:w="90" w:type="dxa"/>
-            </w:tcMar>
-          </w:tcPr>
-          <w:p>
-            <w:pPr>
-              <w:spacing w:after="0" w:line="276" w:lineRule="auto"/>
-            </w:pPr>
-            <w:r>
-              <w:rPr>
-                <w:rFonts w:ascii="맑은 고딕" w:hAnsi="맑은 고딕" w:eastAsia="맑은 고딕" w:cs="맑은 고딕"/>
-                <w:b w:val="0"/>
-                <w:sz w:val="17"/>
-              </w:rPr>
-              <w:t>human_review, report_writer</w:t>
+              <w:t>report_writer</w:t>
             </w:r>
           </w:p>
         </w:tc>
@@ -26634,7 +28718,7 @@
                 <w:color w:val="2B2F4A"/>
                 <w:sz w:val="15"/>
               </w:rPr>
-              <w:t xml:space="preserve">                     source_group(eTLD+1 or vendor group), attempt}</w:t>
+              <w:t xml:space="preserve">                     source_group(eTLD+1 or vendor group), origin_group(원 출처 계열), attempt}</w:t>
             </w:r>
           </w:p>
           <w:p>
@@ -26718,7 +28802,7 @@
                 <w:color w:val="2B2F4A"/>
                 <w:sz w:val="15"/>
               </w:rPr>
-              <w:t xml:space="preserve">                     unsupported_claim_ids, checks{max_group_share, pro_count, con_count, lexicon_hits}}</w:t>
+              <w:t xml:space="preserve">                     unsupported_claim_ids, checks{max_origin_share, pro_origins, con_origins, lexicon_hits}}</w:t>
             </w:r>
           </w:p>
         </w:tc>
@@ -26763,7 +28847,7 @@
           <w:color w:val="161A58"/>
           <w:sz w:val="20"/>
         </w:rPr>
-        <w:t>초기화 → 선정 검증 → 공통 RAG(Loop) → 기술 조사 → 4개 관점 병렬 평가(Fan-out) → 종합(Fan-in) → Judge → retry_router(Branch·선택적 재실행) → 보고서 생성·검수(Loop) → PDF</w:t>
+        <w:t>Human 선정(2안) → 초기화 → 선정 검증(기록만) → 공통 RAG(Loop) → 기술 조사 → 4개 관점 병렬 평가(Fan-out) → 종합(Fan-in) → Judge → retry_router(Branch·선택적 재실행) → 보고서 생성·검수(Loop) → PDF</w:t>
       </w:r>
       <w:r>
         <w:rPr>
@@ -26866,7 +28950,7 @@
       <w:r>
         <w:drawing>
           <wp:inline xmlns:a="http://schemas.openxmlformats.org/drawingml/2006/main" xmlns:pic="http://schemas.openxmlformats.org/drawingml/2006/picture">
-            <wp:extent cx="5688000" cy="9116233"/>
+            <wp:extent cx="5688000" cy="8238047"/>
             <wp:docPr id="3" name="Picture 3"/>
             <wp:cNvGraphicFramePr>
               <a:graphicFrameLocks noChangeAspect="1"/>
@@ -26887,7 +28971,7 @@
                   <pic:spPr>
                     <a:xfrm>
                       <a:off x="0" y="0"/>
-                      <a:ext cx="5688000" cy="9116233"/>
+                      <a:ext cx="5688000" cy="8238047"/>
                     </a:xfrm>
                     <a:prstGeom prst="rect"/>
                   </pic:spPr>
@@ -27003,15 +29087,15 @@
           <w:color w:val="161A58"/>
           <w:sz w:val="20"/>
         </w:rPr>
-        <w:t>선정 검증 분기:</w:t>
-      </w:r>
-      <w:r>
-        <w:rPr>
-          <w:rFonts w:ascii="맑은 고딕" w:hAnsi="맑은 고딕" w:eastAsia="맑은 고딕" w:cs="맑은 고딕"/>
-          <w:b w:val="0"/>
-          <w:sz w:val="20"/>
-        </w:rPr>
-        <w:t xml:space="preserve"> 세 항목이 모두 충족되면 </w:t>
+        <w:t>선정 검증(분기 없음):</w:t>
+      </w:r>
+      <w:r>
+        <w:rPr>
+          <w:rFonts w:ascii="맑은 고딕" w:hAnsi="맑은 고딕" w:eastAsia="맑은 고딕" w:cs="맑은 고딕"/>
+          <w:b w:val="0"/>
+          <w:sz w:val="20"/>
+        </w:rPr>
+        <w:t xml:space="preserve"> </w:t>
       </w:r>
       <w:r>
         <w:rPr>
@@ -27020,15 +29104,15 @@
           <w:color w:val="5B3FA0"/>
           <w:sz w:val="19"/>
         </w:rPr>
-        <w:t>index_builder</w:t>
-      </w:r>
-      <w:r>
-        <w:rPr>
-          <w:rFonts w:ascii="맑은 고딕" w:hAnsi="맑은 고딕" w:eastAsia="맑은 고딕" w:cs="맑은 고딕"/>
-          <w:b w:val="0"/>
-          <w:sz w:val="20"/>
-        </w:rPr>
-        <w:t xml:space="preserve">로 간다. 미충족이고 </w:t>
+        <w:t>selection_validator</w:t>
+      </w:r>
+      <w:r>
+        <w:rPr>
+          <w:rFonts w:ascii="맑은 고딕" w:hAnsi="맑은 고딕" w:eastAsia="맑은 고딕" w:cs="맑은 고딕"/>
+          <w:b w:val="0"/>
+          <w:sz w:val="20"/>
+        </w:rPr>
+        <w:t xml:space="preserve">는 검증 결과를 </w:t>
       </w:r>
       <w:r>
         <w:rPr>
@@ -27037,15 +29121,15 @@
           <w:color w:val="5B3FA0"/>
           <w:sz w:val="19"/>
         </w:rPr>
-        <w:t>selection_review_count &lt; 1</w:t>
-      </w:r>
-      <w:r>
-        <w:rPr>
-          <w:rFonts w:ascii="맑은 고딕" w:hAnsi="맑은 고딕" w:eastAsia="맑은 고딕" w:cs="맑은 고딕"/>
-          <w:b w:val="0"/>
-          <w:sz w:val="20"/>
-        </w:rPr>
-        <w:t xml:space="preserve">이면 </w:t>
+        <w:t>selection_validation</w:t>
+      </w:r>
+      <w:r>
+        <w:rPr>
+          <w:rFonts w:ascii="맑은 고딕" w:hAnsi="맑은 고딕" w:eastAsia="맑은 고딕" w:cs="맑은 고딕"/>
+          <w:b w:val="0"/>
+          <w:sz w:val="20"/>
+        </w:rPr>
+        <w:t xml:space="preserve">에 쓰고, 미충족 항목은 </w:t>
       </w:r>
       <w:r>
         <w:rPr>
@@ -27054,15 +29138,15 @@
           <w:color w:val="5B3FA0"/>
           <w:sz w:val="19"/>
         </w:rPr>
-        <w:t>human_review</w:t>
-      </w:r>
-      <w:r>
-        <w:rPr>
-          <w:rFonts w:ascii="맑은 고딕" w:hAnsi="맑은 고딕" w:eastAsia="맑은 고딕" w:cs="맑은 고딕"/>
-          <w:b w:val="0"/>
-          <w:sz w:val="20"/>
-        </w:rPr>
-        <w:t xml:space="preserve">로 간다. </w:t>
+        <w:t>warnings</w:t>
+      </w:r>
+      <w:r>
+        <w:rPr>
+          <w:rFonts w:ascii="맑은 고딕" w:hAnsi="맑은 고딕" w:eastAsia="맑은 고딕" w:cs="맑은 고딕"/>
+          <w:b w:val="0"/>
+          <w:sz w:val="20"/>
+        </w:rPr>
+        <w:t xml:space="preserve">에 기록한 뒤 항상 </w:t>
       </w:r>
       <w:r>
         <w:rPr>
@@ -27071,49 +29155,15 @@
           <w:color w:val="5B3FA0"/>
           <w:sz w:val="19"/>
         </w:rPr>
-        <w:t>--interactive</w:t>
-      </w:r>
-      <w:r>
-        <w:rPr>
-          <w:rFonts w:ascii="맑은 고딕" w:hAnsi="맑은 고딕" w:eastAsia="맑은 고딕" w:cs="맑은 고딕"/>
-          <w:b w:val="0"/>
-          <w:sz w:val="20"/>
-        </w:rPr>
-        <w:t xml:space="preserve">에서는 LangGraph </w:t>
-      </w:r>
-      <w:r>
-        <w:rPr>
-          <w:rFonts w:ascii="D2Coding" w:hAnsi="D2Coding" w:eastAsia="맑은 고딕" w:cs="D2Coding"/>
-          <w:b w:val="0"/>
-          <w:color w:val="5B3FA0"/>
-          <w:sz w:val="19"/>
-        </w:rPr>
-        <w:t>interrupt</w:t>
-      </w:r>
-      <w:r>
-        <w:rPr>
-          <w:rFonts w:ascii="맑은 고딕" w:hAnsi="맑은 고딕" w:eastAsia="맑은 고딕" w:cs="맑은 고딕"/>
-          <w:b w:val="0"/>
-          <w:sz w:val="20"/>
-        </w:rPr>
-        <w:t xml:space="preserve">로 사람이 확인한다. 사람이 기술을 바꾸면 </w:t>
-      </w:r>
-      <w:r>
-        <w:rPr>
-          <w:rFonts w:ascii="D2Coding" w:hAnsi="D2Coding" w:eastAsia="맑은 고딕" w:cs="D2Coding"/>
-          <w:b w:val="0"/>
-          <w:color w:val="5B3FA0"/>
-          <w:sz w:val="19"/>
-        </w:rPr>
-        <w:t>selection_override</w:t>
-      </w:r>
-      <w:r>
-        <w:rPr>
-          <w:rFonts w:ascii="맑은 고딕" w:hAnsi="맑은 고딕" w:eastAsia="맑은 고딕" w:cs="맑은 고딕"/>
-          <w:b w:val="0"/>
-          <w:sz w:val="20"/>
-        </w:rPr>
-        <w:t>를 쓰고 다시 검증하며, 이 재검증은 1회까지이다. 기본 실행에서는 기존 선정을 유지하고 경고를 기록한 뒤 진행한다(자동 재현성 확보). 어느 경우든 검증 결과는 보고서 2.4절에 실린다.</w:t>
+        <w:t>index_builder</w:t>
+      </w:r>
+      <w:r>
+        <w:rPr>
+          <w:rFonts w:ascii="맑은 고딕" w:hAnsi="맑은 고딕" w:eastAsia="맑은 고딕" w:cs="맑은 고딕"/>
+          <w:b w:val="0"/>
+          <w:sz w:val="20"/>
+        </w:rPr>
+        <w:t>로 진행한다. 2안(Human 선정)이므로 그래프 안에서 기술을 바꾸지 않는다(자동 재현성 확보). 검증 결과는 보고서 2.4절에 실린다.</w:t>
       </w:r>
     </w:p>
     <w:p>
@@ -27890,7 +29940,7 @@
           <w:b w:val="0"/>
           <w:sz w:val="20"/>
         </w:rPr>
-        <w:t xml:space="preserve"> 루프 5개 모두에 횟수 한도가 있다. 선정 재확인 1, 공통 검색 2, 관점 내부 2, 관점별 재실행 2, 보고서 수정 1이다. 최악의 경우에도 그래프가 반드시 끝난다.</w:t>
+        <w:t xml:space="preserve"> 루프 4개 모두에 횟수 한도가 있다. 공통 검색 2, 관점 내부 2, 관점별 재실행 2, 보고서 수정 1이다. 최악의 경우에도 그래프가 반드시 끝난다.</w:t>
       </w:r>
     </w:p>
     <w:p>
@@ -28002,7 +30052,7 @@
                 <w:color w:val="2B2F4A"/>
                 <w:sz w:val="15"/>
               </w:rPr>
-              <w:t xml:space="preserve">         and max_group_share &lt;= 0.50 and pro_count &gt;= 2 and con_count &gt;= 2 and lexicon_hits == 0</w:t>
+              <w:t xml:space="preserve">         and max_origin_share &lt;= 0.50 and pro_origins &gt;= 2 and con_origins &gt;= 2 and lexicon_hits == 0</w:t>
             </w:r>
           </w:p>
         </w:tc>
@@ -28339,7 +30389,7 @@
                 <w:b w:val="0"/>
                 <w:sz w:val="17"/>
               </w:rPr>
-              <w:t xml:space="preserve"> 코드 검사에서 벤더 출처군 비중 ≤ 50%</w:t>
+              <w:t xml:space="preserve"> 코드 검사에서 원 출처 계열 비중 ≤ 50%</w:t>
             </w:r>
           </w:p>
         </w:tc>
@@ -28510,7 +30560,7 @@
                 <w:b w:val="0"/>
                 <w:sz w:val="17"/>
               </w:rPr>
-              <w:t xml:space="preserve"> 근거 pro ≥ 2, con ≥ 2</w:t>
+              <w:t xml:space="preserve"> 근거의 독립 계열 수 pro ≥ 2, con ≥ 2</w:t>
             </w:r>
           </w:p>
         </w:tc>
@@ -29943,24 +31993,7 @@
                 <w:b w:val="0"/>
                 <w:sz w:val="17"/>
               </w:rPr>
-              <w:t xml:space="preserve">bge-m3: Hit@1 0.548 · Hit@5 0.905 · MRR 0.703 (후보 4종 중 최고, </w:t>
-            </w:r>
-            <w:r>
-              <w:rPr>
-                <w:rFonts w:ascii="D2Coding" w:hAnsi="D2Coding" w:eastAsia="맑은 고딕" w:cs="D2Coding"/>
-                <w:b w:val="0"/>
-                <w:color w:val="5B3FA0"/>
-                <w:sz w:val="16"/>
-              </w:rPr>
-              <w:t>max_seq_length</w:t>
-            </w:r>
-            <w:r>
-              <w:rPr>
-                <w:rFonts w:ascii="맑은 고딕" w:hAnsi="맑은 고딕" w:eastAsia="맑은 고딕" w:cs="맑은 고딕"/>
-                <w:b w:val="0"/>
-                <w:sz w:val="17"/>
-              </w:rPr>
-              <w:t xml:space="preserve"> 1,024 조건)</w:t>
+              <w:t>bge-m3(후보 4종 중 최고). v1(1,024): Hit@1 0.548 · Hit@5 0.905 · MRR 0.703 / v2(2,048): Hit@1 0.524 · MRR 0.691. 개발 지표</w:t>
             </w:r>
           </w:p>
         </w:tc>
@@ -30038,7 +32071,7 @@
                 <w:b w:val="0"/>
                 <w:sz w:val="17"/>
               </w:rPr>
-              <w:t>3중 하이브리드 + reranker: Hit@1 0.786 · Hit@5 0.976 · MRR 0.863</w:t>
+              <w:t>3중 하이브리드 + reranker. v1: Hit@1 0.786 · Hit@5 0.976 · MRR 0.863 / v2: Hit@1 0.786 · Hit@5 0.976 · MRR 0.863. 개발 지표(v2는 하한값)</w:t>
             </w:r>
           </w:p>
         </w:tc>
@@ -30063,7 +32096,24 @@
                 <w:color w:val="5B3FA0"/>
                 <w:sz w:val="16"/>
               </w:rPr>
-              <w:t>outputs/eval/retrieval_config_eval.csv</w:t>
+              <w:t>outputs/eval/</w:t>
+            </w:r>
+            <w:r>
+              <w:rPr>
+                <w:rFonts w:ascii="맑은 고딕" w:hAnsi="맑은 고딕" w:eastAsia="맑은 고딕" w:cs="맑은 고딕"/>
+                <w:b w:val="0"/>
+                <w:sz w:val="17"/>
+              </w:rPr>
+              <w:t xml:space="preserve">, </w:t>
+            </w:r>
+            <w:r>
+              <w:rPr>
+                <w:rFonts w:ascii="D2Coding" w:hAnsi="D2Coding" w:eastAsia="맑은 고딕" w:cs="D2Coding"/>
+                <w:b w:val="0"/>
+                <w:color w:val="5B3FA0"/>
+                <w:sz w:val="16"/>
+              </w:rPr>
+              <w:t>outputs/eval/v2_maxlen2048/</w:t>
             </w:r>
           </w:p>
         </w:tc>
@@ -30922,7 +32972,7 @@
                 <w:b w:val="0"/>
                 <w:sz w:val="17"/>
               </w:rPr>
-              <w:t>reranker 지연(질의당 약 4.7초)</w:t>
+              <w:t>reranker 지연(질의당 약 4.5초)</w:t>
             </w:r>
           </w:p>
         </w:tc>
@@ -31725,7 +33775,7 @@
                 <w:color w:val="2B2F4A"/>
                 <w:sz w:val="15"/>
               </w:rPr>
-              <w:t xml:space="preserve">    INIT["START → initialize"] --&gt; VAL["selection_validator&lt;br/&gt;① 선정 검증"]</w:t>
+              <w:t xml:space="preserve">    H0(["Human 선정 (2안)&lt;br/&gt;config · --tech"]) --&gt; INIT["initialize"]</w:t>
             </w:r>
           </w:p>
           <w:p>
@@ -31739,7 +33789,7 @@
                 <w:color w:val="2B2F4A"/>
                 <w:sz w:val="15"/>
               </w:rPr>
-              <w:t xml:space="preserve">    VAL --&gt; VQ{{"충족?"}}</w:t>
+              <w:t xml:space="preserve">    INIT --&gt; VAL["selection_validator&lt;br/&gt;① 선정 검증 · 결과 기록"]</w:t>
             </w:r>
           </w:p>
           <w:p>
@@ -31753,7 +33803,7 @@
                 <w:color w:val="2B2F4A"/>
                 <w:sz w:val="15"/>
               </w:rPr>
-              <w:t xml:space="preserve">    VQ --&gt;|"미충족"| HUM["human_review&lt;br/&gt;(최대 1회)"]</w:t>
+              <w:t xml:space="preserve">    VAL --&gt; CR["index_builder →&lt;br/&gt;공통 RAG Loop ≤2 (2b-a)"]</w:t>
             </w:r>
           </w:p>
           <w:p>
@@ -31767,7 +33817,7 @@
                 <w:color w:val="2B2F4A"/>
                 <w:sz w:val="15"/>
               </w:rPr>
-              <w:t xml:space="preserve">    HUM --&gt;|"변경"| VAL</w:t>
+              <w:t xml:space="preserve">    CR --&gt; TR["tech_research&lt;br/&gt;② 개요·한계"]</w:t>
             </w:r>
           </w:p>
           <w:p>
@@ -31781,7 +33831,7 @@
                 <w:color w:val="2B2F4A"/>
                 <w:sz w:val="15"/>
               </w:rPr>
-              <w:t xml:space="preserve">    HUM --&gt;|"유지·경고"| CR</w:t>
+              <w:t xml:space="preserve">    subgraph FAN[" "]</w:t>
             </w:r>
           </w:p>
           <w:p>
@@ -31795,7 +33845,7 @@
                 <w:color w:val="2B2F4A"/>
                 <w:sz w:val="15"/>
               </w:rPr>
-              <w:t xml:space="preserve">    VQ --&gt;|"충족"| CR["index_builder →&lt;br/&gt;공통 RAG Loop ≤2 (2b-a)"]</w:t>
+              <w:t xml:space="preserve">        direction LR</w:t>
             </w:r>
           </w:p>
           <w:p>
@@ -31809,7 +33859,7 @@
                 <w:color w:val="2B2F4A"/>
                 <w:sz w:val="15"/>
               </w:rPr>
-              <w:t xml:space="preserve">    CR --&gt; TR["tech_research&lt;br/&gt;② 개요·한계"]</w:t>
+              <w:t xml:space="preserve">        TRL["trl_assessor&lt;br/&gt;③ TRL"]</w:t>
             </w:r>
           </w:p>
           <w:p>
@@ -31823,7 +33873,7 @@
                 <w:color w:val="2B2F4A"/>
                 <w:sz w:val="15"/>
               </w:rPr>
-              <w:t xml:space="preserve">    subgraph FAN[" "]</w:t>
+              <w:t xml:space="preserve">        MK["market_&lt;br/&gt;evaluator"]</w:t>
             </w:r>
           </w:p>
           <w:p>
@@ -31837,7 +33887,7 @@
                 <w:color w:val="2B2F4A"/>
                 <w:sz w:val="15"/>
               </w:rPr>
-              <w:t xml:space="preserve">        direction LR</w:t>
+              <w:t xml:space="preserve">        SH["stakeholder_&lt;br/&gt;evaluator"]</w:t>
             </w:r>
           </w:p>
           <w:p>
@@ -31851,7 +33901,7 @@
                 <w:color w:val="2B2F4A"/>
                 <w:sz w:val="15"/>
               </w:rPr>
-              <w:t xml:space="preserve">        TRL["trl_assessor&lt;br/&gt;③ TRL"]</w:t>
+              <w:t xml:space="preserve">        DM["domain_&lt;br/&gt;evaluator"]</w:t>
             </w:r>
           </w:p>
           <w:p>
@@ -31865,7 +33915,7 @@
                 <w:color w:val="2B2F4A"/>
                 <w:sz w:val="15"/>
               </w:rPr>
-              <w:t xml:space="preserve">        MK["market_&lt;br/&gt;evaluator"]</w:t>
+              <w:t xml:space="preserve">    end</w:t>
             </w:r>
           </w:p>
           <w:p>
@@ -31879,7 +33929,7 @@
                 <w:color w:val="2B2F4A"/>
                 <w:sz w:val="15"/>
               </w:rPr>
-              <w:t xml:space="preserve">        SH["stakeholder_&lt;br/&gt;evaluator"]</w:t>
+              <w:t xml:space="preserve">    TR --&gt; TRL &amp; MK &amp; SH &amp; DM</w:t>
             </w:r>
           </w:p>
           <w:p>
@@ -31893,7 +33943,7 @@
                 <w:color w:val="2B2F4A"/>
                 <w:sz w:val="15"/>
               </w:rPr>
-              <w:t xml:space="preserve">        DM["domain_&lt;br/&gt;evaluator"]</w:t>
+              <w:t xml:space="preserve">    TRL &amp; MK &amp; SH &amp; DM --&gt; SY["synthesizer&lt;br/&gt;Fan-in (defer)"]</w:t>
             </w:r>
           </w:p>
           <w:p>
@@ -31907,7 +33957,7 @@
                 <w:color w:val="2B2F4A"/>
                 <w:sz w:val="15"/>
               </w:rPr>
-              <w:t xml:space="preserve">    end</w:t>
+              <w:t xml:space="preserve">    SY --&gt; JD["judge"]</w:t>
             </w:r>
           </w:p>
           <w:p>
@@ -31921,7 +33971,7 @@
                 <w:color w:val="2B2F4A"/>
                 <w:sz w:val="15"/>
               </w:rPr>
-              <w:t xml:space="preserve">    TR --&gt; TRL &amp; MK &amp; SH &amp; DM</w:t>
+              <w:t xml:space="preserve">    JD --&gt; RR{{"retry_router&lt;br/&gt;미달·retry&lt;2?"}}</w:t>
             </w:r>
           </w:p>
           <w:p>
@@ -31935,7 +33985,7 @@
                 <w:color w:val="2B2F4A"/>
                 <w:sz w:val="15"/>
               </w:rPr>
-              <w:t xml:space="preserve">    TRL &amp; MK &amp; SH &amp; DM --&gt; SY["synthesizer&lt;br/&gt;Fan-in (defer)"]</w:t>
+              <w:t xml:space="preserve">    subgraph RERUN[" "]</w:t>
             </w:r>
           </w:p>
           <w:p>
@@ -31949,7 +33999,7 @@
                 <w:color w:val="2B2F4A"/>
                 <w:sz w:val="15"/>
               </w:rPr>
-              <w:t xml:space="preserve">    SY --&gt; JD["judge"]</w:t>
+              <w:t xml:space="preserve">        direction LR</w:t>
             </w:r>
           </w:p>
           <w:p>
@@ -31963,7 +34013,7 @@
                 <w:color w:val="2B2F4A"/>
                 <w:sz w:val="15"/>
               </w:rPr>
-              <w:t xml:space="preserve">    JD --&gt; RR{{"retry_router&lt;br/&gt;미달·retry&lt;2?"}}</w:t>
+              <w:t xml:space="preserve">        R1["↺ TRL"]</w:t>
             </w:r>
           </w:p>
           <w:p>
@@ -31977,7 +34027,7 @@
                 <w:color w:val="2B2F4A"/>
                 <w:sz w:val="15"/>
               </w:rPr>
-              <w:t xml:space="preserve">    subgraph RERUN[" "]</w:t>
+              <w:t xml:space="preserve">        R2["↺ 시장"]</w:t>
             </w:r>
           </w:p>
           <w:p>
@@ -31991,7 +34041,7 @@
                 <w:color w:val="2B2F4A"/>
                 <w:sz w:val="15"/>
               </w:rPr>
-              <w:t xml:space="preserve">        direction LR</w:t>
+              <w:t xml:space="preserve">        R3["↺ 이해관계자"]</w:t>
             </w:r>
           </w:p>
           <w:p>
@@ -32005,7 +34055,7 @@
                 <w:color w:val="2B2F4A"/>
                 <w:sz w:val="15"/>
               </w:rPr>
-              <w:t xml:space="preserve">        R1["↺ TRL"]</w:t>
+              <w:t xml:space="preserve">        R4["↺ 도메인"]</w:t>
             </w:r>
           </w:p>
           <w:p>
@@ -32019,7 +34069,7 @@
                 <w:color w:val="2B2F4A"/>
                 <w:sz w:val="15"/>
               </w:rPr>
-              <w:t xml:space="preserve">        R2["↺ 시장"]</w:t>
+              <w:t xml:space="preserve">    end</w:t>
             </w:r>
           </w:p>
           <w:p>
@@ -32033,7 +34083,7 @@
                 <w:color w:val="2B2F4A"/>
                 <w:sz w:val="15"/>
               </w:rPr>
-              <w:t xml:space="preserve">        R3["↺ 이해관계자"]</w:t>
+              <w:t xml:space="preserve">    RR -.-&gt;|"Send·failed 포함 시"| R1</w:t>
             </w:r>
           </w:p>
           <w:p>
@@ -32047,7 +34097,7 @@
                 <w:color w:val="2B2F4A"/>
                 <w:sz w:val="15"/>
               </w:rPr>
-              <w:t xml:space="preserve">        R4["↺ 도메인"]</w:t>
+              <w:t xml:space="preserve">    RR -.-&gt;|"Send"| R2</w:t>
             </w:r>
           </w:p>
           <w:p>
@@ -32061,7 +34111,7 @@
                 <w:color w:val="2B2F4A"/>
                 <w:sz w:val="15"/>
               </w:rPr>
-              <w:t xml:space="preserve">    end</w:t>
+              <w:t xml:space="preserve">    RR -.-&gt;|"Send"| R3</w:t>
             </w:r>
           </w:p>
           <w:p>
@@ -32075,7 +34125,7 @@
                 <w:color w:val="2B2F4A"/>
                 <w:sz w:val="15"/>
               </w:rPr>
-              <w:t xml:space="preserve">    RR -.-&gt;|"Send·failed 포함 시"| R1</w:t>
+              <w:t xml:space="preserve">    RR -.-&gt;|"Send"| R4</w:t>
             </w:r>
           </w:p>
           <w:p>
@@ -32089,7 +34139,7 @@
                 <w:color w:val="2B2F4A"/>
                 <w:sz w:val="15"/>
               </w:rPr>
-              <w:t xml:space="preserve">    RR -.-&gt;|"Send"| R2</w:t>
+              <w:t xml:space="preserve">    RR --&gt;|"없음·한도→판정 불확실"| RWR["report_writer"]</w:t>
             </w:r>
           </w:p>
           <w:p>
@@ -32103,7 +34153,7 @@
                 <w:color w:val="2B2F4A"/>
                 <w:sz w:val="15"/>
               </w:rPr>
-              <w:t xml:space="preserve">    RR -.-&gt;|"Send"| R3</w:t>
+              <w:t xml:space="preserve">    RWR --&gt; FC{{"final_check"}}</w:t>
             </w:r>
           </w:p>
           <w:p>
@@ -32117,7 +34167,7 @@
                 <w:color w:val="2B2F4A"/>
                 <w:sz w:val="15"/>
               </w:rPr>
-              <w:t xml:space="preserve">    RR -.-&gt;|"Send"| R4</w:t>
+              <w:t xml:space="preserve">    FC --&gt;|"수정 ≤1"| RWR</w:t>
             </w:r>
           </w:p>
           <w:p>
@@ -32131,7 +34181,7 @@
                 <w:color w:val="2B2F4A"/>
                 <w:sz w:val="15"/>
               </w:rPr>
-              <w:t xml:space="preserve">    RR --&gt;|"없음·한도→판정 불확실"| RWR["report_writer"]</w:t>
+              <w:t xml:space="preserve">    FC --&gt;|"통과"| PDF["pdf_renderer → END"]</w:t>
             </w:r>
           </w:p>
           <w:p>
@@ -32145,7 +34195,7 @@
                 <w:color w:val="2B2F4A"/>
                 <w:sz w:val="15"/>
               </w:rPr>
-              <w:t xml:space="preserve">    RWR --&gt; FC{{"final_check"}}</w:t>
+              <w:t xml:space="preserve">    classDef agent fill:#EEE8FA,stroke:#7F4ACB,color:#161A58;</w:t>
             </w:r>
           </w:p>
           <w:p>
@@ -32159,7 +34209,7 @@
                 <w:color w:val="2B2F4A"/>
                 <w:sz w:val="15"/>
               </w:rPr>
-              <w:t xml:space="preserve">    FC --&gt;|"수정 ≤1"| RWR</w:t>
+              <w:t xml:space="preserve">    classDef util fill:#F2F3F8,stroke:#9AA0B8,color:#161A58;</w:t>
             </w:r>
           </w:p>
           <w:p>
@@ -32173,7 +34223,7 @@
                 <w:color w:val="2B2F4A"/>
                 <w:sz w:val="15"/>
               </w:rPr>
-              <w:t xml:space="preserve">    FC --&gt;|"통과"| PDF["pdf_renderer → END"]</w:t>
+              <w:t xml:space="preserve">    classDef human fill:#E8F4EC,stroke:#2E7D4F,color:#16381F;</w:t>
             </w:r>
           </w:p>
           <w:p>
@@ -32187,7 +34237,7 @@
                 <w:color w:val="2B2F4A"/>
                 <w:sz w:val="15"/>
               </w:rPr>
-              <w:t xml:space="preserve">    classDef agent fill:#EEE8FA,stroke:#7F4ACB,color:#161A58;</w:t>
+              <w:t xml:space="preserve">    classDef gate fill:#FFF6E5,stroke:#D08A00,color:#3A2A00;</w:t>
             </w:r>
           </w:p>
           <w:p>
@@ -32201,7 +34251,7 @@
                 <w:color w:val="2B2F4A"/>
                 <w:sz w:val="15"/>
               </w:rPr>
-              <w:t xml:space="preserve">    classDef util fill:#F2F3F8,stroke:#9AA0B8,color:#161A58;</w:t>
+              <w:t xml:space="preserve">    class VAL,TR,TRL,MK,SH,DM,SY,JD,RWR,R1,R2,R3,R4 agent;</w:t>
             </w:r>
           </w:p>
           <w:p>
@@ -32215,7 +34265,7 @@
                 <w:color w:val="2B2F4A"/>
                 <w:sz w:val="15"/>
               </w:rPr>
-              <w:t xml:space="preserve">    classDef gate fill:#FFF6E5,stroke:#D08A00,color:#3A2A00;</w:t>
+              <w:t xml:space="preserve">    class INIT,CR,PDF util;</w:t>
             </w:r>
           </w:p>
           <w:p>
@@ -32229,7 +34279,7 @@
                 <w:color w:val="2B2F4A"/>
                 <w:sz w:val="15"/>
               </w:rPr>
-              <w:t xml:space="preserve">    class VAL,TR,TRL,MK,SH,DM,SY,JD,RWR,R1,R2,R3,R4 agent;</w:t>
+              <w:t xml:space="preserve">    class H0 human;</w:t>
             </w:r>
           </w:p>
           <w:p>
@@ -32243,21 +34293,7 @@
                 <w:color w:val="2B2F4A"/>
                 <w:sz w:val="15"/>
               </w:rPr>
-              <w:t xml:space="preserve">    class INIT,HUM,CR,PDF util;</w:t>
-            </w:r>
-          </w:p>
-          <w:p>
-            <w:pPr>
-              <w:spacing w:after="0" w:line="240" w:lineRule="auto"/>
-            </w:pPr>
-            <w:r>
-              <w:rPr>
-                <w:rFonts w:ascii="D2Coding" w:hAnsi="D2Coding" w:eastAsia="맑은 고딕" w:cs="D2Coding"/>
-                <w:b w:val="0"/>
-                <w:color w:val="2B2F4A"/>
-                <w:sz w:val="15"/>
-              </w:rPr>
-              <w:t xml:space="preserve">    class VQ,RR,FC gate;</w:t>
+              <w:t xml:space="preserve">    class RR,FC gate;</w:t>
             </w:r>
           </w:p>
           <w:p>
@@ -32830,7 +34866,7 @@
           <w:color w:val="161A58"/>
           <w:sz w:val="30"/>
         </w:rPr>
-        <w:t>부록 B. 개정 이력 (v1.0 → v1.1)</w:t>
+        <w:t>부록 B. 개정 이력 (v1.0 → v1.1 → v1.2)</w:t>
       </w:r>
     </w:p>
     <w:tbl>
@@ -34425,6 +36461,674 @@
                 <w:sz w:val="17"/>
               </w:rPr>
               <w:t>측정 조건 점검 행, Lessons ④, 리스크 3행(개발/테스트 미분리, 같은 계열 Judge, 소속 편향) 추가</w:t>
+            </w:r>
+          </w:p>
+        </w:tc>
+      </w:tr>
+      <w:tr>
+        <w:trPr>
+          <w:cantSplit/>
+        </w:trPr>
+        <w:tc>
+          <w:tcPr>
+            <w:tcW w:type="dxa" w:w="1247"/>
+            <w:tcMar>
+              <w:top w:w="70" w:type="dxa"/>
+              <w:left w:w="90" w:type="dxa"/>
+              <w:bottom w:w="70" w:type="dxa"/>
+              <w:right w:w="90" w:type="dxa"/>
+            </w:tcMar>
+          </w:tcPr>
+          <w:p>
+            <w:pPr>
+              <w:spacing w:after="0" w:line="276" w:lineRule="auto"/>
+            </w:pPr>
+            <w:r>
+              <w:rPr>
+                <w:rFonts w:ascii="맑은 고딕" w:hAnsi="맑은 고딕" w:eastAsia="맑은 고딕" w:cs="맑은 고딕"/>
+                <w:b w:val="0"/>
+                <w:sz w:val="17"/>
+              </w:rPr>
+              <w:t>(v1.2) 요약·2.1.1</w:t>
+            </w:r>
+          </w:p>
+        </w:tc>
+        <w:tc>
+          <w:tcPr>
+            <w:tcW w:type="dxa" w:w="3061"/>
+            <w:tcMar>
+              <w:top w:w="70" w:type="dxa"/>
+              <w:left w:w="90" w:type="dxa"/>
+              <w:bottom w:w="70" w:type="dxa"/>
+              <w:right w:w="90" w:type="dxa"/>
+            </w:tcMar>
+          </w:tcPr>
+          <w:p>
+            <w:pPr>
+              <w:spacing w:after="0" w:line="276" w:lineRule="auto"/>
+            </w:pPr>
+            <w:r>
+              <w:rPr>
+                <w:rFonts w:ascii="맑은 고딕" w:hAnsi="맑은 고딕" w:eastAsia="맑은 고딕" w:cs="맑은 고딕"/>
+                <w:b w:val="0"/>
+                <w:sz w:val="17"/>
+              </w:rPr>
+              <w:t>비교 공정성 판단 질문 "(같은 적용 계층)"</w:t>
+            </w:r>
+          </w:p>
+        </w:tc>
+        <w:tc>
+          <w:tcPr>
+            <w:tcW w:type="dxa" w:w="4762"/>
+            <w:tcMar>
+              <w:top w:w="70" w:type="dxa"/>
+              <w:left w:w="90" w:type="dxa"/>
+              <w:bottom w:w="70" w:type="dxa"/>
+              <w:right w:w="90" w:type="dxa"/>
+            </w:tcMar>
+          </w:tcPr>
+          <w:p>
+            <w:pPr>
+              <w:spacing w:after="0" w:line="276" w:lineRule="auto"/>
+            </w:pPr>
+            <w:r>
+              <w:rPr>
+                <w:rFonts w:ascii="맑은 고딕" w:hAnsi="맑은 고딕" w:eastAsia="맑은 고딕" w:cs="맑은 고딕"/>
+                <w:b w:val="0"/>
+                <w:sz w:val="17"/>
+              </w:rPr>
+              <w:t>"</w:t>
+            </w:r>
+            <w:r>
+              <w:rPr>
+                <w:rFonts w:ascii="맑은 고딕" w:hAnsi="맑은 고딕" w:eastAsia="맑은 고딕" w:cs="맑은 고딕"/>
+                <w:b/>
+                <w:color w:val="161A58"/>
+                <w:sz w:val="17"/>
+              </w:rPr>
+              <w:t>동일한 적용 시점(추론·서빙 단계)</w:t>
+            </w:r>
+            <w:r>
+              <w:rPr>
+                <w:rFonts w:ascii="맑은 고딕" w:hAnsi="맑은 고딕" w:eastAsia="맑은 고딕" w:cs="맑은 고딕"/>
+                <w:b w:val="0"/>
+                <w:sz w:val="17"/>
+              </w:rPr>
+              <w:t>". 계층은 서로 다름(데이터 표현 vs 메모리)과 일관</w:t>
+            </w:r>
+          </w:p>
+        </w:tc>
+      </w:tr>
+      <w:tr>
+        <w:trPr>
+          <w:cantSplit/>
+        </w:trPr>
+        <w:tc>
+          <w:tcPr>
+            <w:tcW w:type="dxa" w:w="1247"/>
+            <w:tcMar>
+              <w:top w:w="70" w:type="dxa"/>
+              <w:left w:w="90" w:type="dxa"/>
+              <w:bottom w:w="70" w:type="dxa"/>
+              <w:right w:w="90" w:type="dxa"/>
+            </w:tcMar>
+          </w:tcPr>
+          <w:p>
+            <w:pPr>
+              <w:spacing w:after="0" w:line="276" w:lineRule="auto"/>
+            </w:pPr>
+            <w:r>
+              <w:rPr>
+                <w:rFonts w:ascii="맑은 고딕" w:hAnsi="맑은 고딕" w:eastAsia="맑은 고딕" w:cs="맑은 고딕"/>
+                <w:b w:val="0"/>
+                <w:sz w:val="17"/>
+              </w:rPr>
+              <w:t>(v1.2) 2.1.5·2.4</w:t>
+            </w:r>
+          </w:p>
+        </w:tc>
+        <w:tc>
+          <w:tcPr>
+            <w:tcW w:type="dxa" w:w="3061"/>
+            <w:tcMar>
+              <w:top w:w="70" w:type="dxa"/>
+              <w:left w:w="90" w:type="dxa"/>
+              <w:bottom w:w="70" w:type="dxa"/>
+              <w:right w:w="90" w:type="dxa"/>
+            </w:tcMar>
+          </w:tcPr>
+          <w:p>
+            <w:pPr>
+              <w:spacing w:after="0" w:line="276" w:lineRule="auto"/>
+            </w:pPr>
+            <w:r>
+              <w:rPr>
+                <w:rFonts w:ascii="D2Coding" w:hAnsi="D2Coding" w:eastAsia="맑은 고딕" w:cs="D2Coding"/>
+                <w:b w:val="0"/>
+                <w:color w:val="5B3FA0"/>
+                <w:sz w:val="16"/>
+              </w:rPr>
+              <w:t>human_review</w:t>
+            </w:r>
+            <w:r>
+              <w:rPr>
+                <w:rFonts w:ascii="맑은 고딕" w:hAnsi="맑은 고딕" w:eastAsia="맑은 고딕" w:cs="맑은 고딕"/>
+                <w:b w:val="0"/>
+                <w:sz w:val="17"/>
+              </w:rPr>
+              <w:t xml:space="preserve"> 재선정 분기(대화형, 최대 1회)</w:t>
+            </w:r>
+          </w:p>
+        </w:tc>
+        <w:tc>
+          <w:tcPr>
+            <w:tcW w:type="dxa" w:w="4762"/>
+            <w:tcMar>
+              <w:top w:w="70" w:type="dxa"/>
+              <w:left w:w="90" w:type="dxa"/>
+              <w:bottom w:w="70" w:type="dxa"/>
+              <w:right w:w="90" w:type="dxa"/>
+            </w:tcMar>
+          </w:tcPr>
+          <w:p>
+            <w:pPr>
+              <w:spacing w:after="0" w:line="276" w:lineRule="auto"/>
+            </w:pPr>
+            <w:r>
+              <w:rPr>
+                <w:rFonts w:ascii="맑은 고딕" w:hAnsi="맑은 고딕" w:eastAsia="맑은 고딕" w:cs="맑은 고딕"/>
+                <w:b/>
+                <w:color w:val="161A58"/>
+                <w:sz w:val="17"/>
+              </w:rPr>
+              <w:t>2안만 반영.</w:t>
+            </w:r>
+            <w:r>
+              <w:rPr>
+                <w:rFonts w:ascii="맑은 고딕" w:hAnsi="맑은 고딕" w:eastAsia="맑은 고딕" w:cs="맑은 고딕"/>
+                <w:b w:val="0"/>
+                <w:sz w:val="17"/>
+              </w:rPr>
+              <w:t xml:space="preserve"> 그래프 안에 재선정 분기 없음. 검증 결과는 기록만 하고 진행, 선정 변경은 팀이 </w:t>
+            </w:r>
+            <w:r>
+              <w:rPr>
+                <w:rFonts w:ascii="D2Coding" w:hAnsi="D2Coding" w:eastAsia="맑은 고딕" w:cs="D2Coding"/>
+                <w:b w:val="0"/>
+                <w:color w:val="5B3FA0"/>
+                <w:sz w:val="16"/>
+              </w:rPr>
+              <w:t>--tech</w:t>
+            </w:r>
+            <w:r>
+              <w:rPr>
+                <w:rFonts w:ascii="맑은 고딕" w:hAnsi="맑은 고딕" w:eastAsia="맑은 고딕" w:cs="맑은 고딕"/>
+                <w:b w:val="0"/>
+                <w:sz w:val="17"/>
+              </w:rPr>
+              <w:t xml:space="preserve">로 재실행. </w:t>
+            </w:r>
+            <w:r>
+              <w:rPr>
+                <w:rFonts w:ascii="D2Coding" w:hAnsi="D2Coding" w:eastAsia="맑은 고딕" w:cs="D2Coding"/>
+                <w:b w:val="0"/>
+                <w:color w:val="5B3FA0"/>
+                <w:sz w:val="16"/>
+              </w:rPr>
+              <w:t>selection_override</w:t>
+            </w:r>
+            <w:r>
+              <w:rPr>
+                <w:rFonts w:ascii="맑은 고딕" w:hAnsi="맑은 고딕" w:eastAsia="맑은 고딕" w:cs="맑은 고딕"/>
+                <w:b w:val="0"/>
+                <w:sz w:val="17"/>
+              </w:rPr>
+              <w:t>·</w:t>
+            </w:r>
+            <w:r>
+              <w:rPr>
+                <w:rFonts w:ascii="D2Coding" w:hAnsi="D2Coding" w:eastAsia="맑은 고딕" w:cs="D2Coding"/>
+                <w:b w:val="0"/>
+                <w:color w:val="5B3FA0"/>
+                <w:sz w:val="16"/>
+              </w:rPr>
+              <w:t>selection_review_count</w:t>
+            </w:r>
+            <w:r>
+              <w:rPr>
+                <w:rFonts w:ascii="맑은 고딕" w:hAnsi="맑은 고딕" w:eastAsia="맑은 고딕" w:cs="맑은 고딕"/>
+                <w:b w:val="0"/>
+                <w:sz w:val="17"/>
+              </w:rPr>
+              <w:t xml:space="preserve"> 삭제(키 29 → 27), 루프 5 → 4</w:t>
+            </w:r>
+          </w:p>
+        </w:tc>
+      </w:tr>
+      <w:tr>
+        <w:trPr>
+          <w:cantSplit/>
+        </w:trPr>
+        <w:tc>
+          <w:tcPr>
+            <w:tcW w:type="dxa" w:w="1247"/>
+            <w:tcMar>
+              <w:top w:w="70" w:type="dxa"/>
+              <w:left w:w="90" w:type="dxa"/>
+              <w:bottom w:w="70" w:type="dxa"/>
+              <w:right w:w="90" w:type="dxa"/>
+            </w:tcMar>
+          </w:tcPr>
+          <w:p>
+            <w:pPr>
+              <w:spacing w:after="0" w:line="276" w:lineRule="auto"/>
+            </w:pPr>
+            <w:r>
+              <w:rPr>
+                <w:rFonts w:ascii="맑은 고딕" w:hAnsi="맑은 고딕" w:eastAsia="맑은 고딕" w:cs="맑은 고딕"/>
+                <w:b w:val="0"/>
+                <w:sz w:val="17"/>
+              </w:rPr>
+              <w:t>(v1.2) 2.2.6</w:t>
+            </w:r>
+          </w:p>
+        </w:tc>
+        <w:tc>
+          <w:tcPr>
+            <w:tcW w:type="dxa" w:w="3061"/>
+            <w:tcMar>
+              <w:top w:w="70" w:type="dxa"/>
+              <w:left w:w="90" w:type="dxa"/>
+              <w:bottom w:w="70" w:type="dxa"/>
+              <w:right w:w="90" w:type="dxa"/>
+            </w:tcMar>
+          </w:tcPr>
+          <w:p>
+            <w:pPr>
+              <w:spacing w:after="0" w:line="276" w:lineRule="auto"/>
+            </w:pPr>
+            <w:r>
+              <w:rPr>
+                <w:rFonts w:ascii="맑은 고딕" w:hAnsi="맑은 고딕" w:eastAsia="맑은 고딕" w:cs="맑은 고딕"/>
+                <w:b w:val="0"/>
+                <w:sz w:val="17"/>
+              </w:rPr>
+              <w:t>수치의 성격 미표기, 구현 조건 미측정</w:t>
+            </w:r>
+          </w:p>
+        </w:tc>
+        <w:tc>
+          <w:tcPr>
+            <w:tcW w:type="dxa" w:w="4762"/>
+            <w:tcMar>
+              <w:top w:w="70" w:type="dxa"/>
+              <w:left w:w="90" w:type="dxa"/>
+              <w:bottom w:w="70" w:type="dxa"/>
+              <w:right w:w="90" w:type="dxa"/>
+            </w:tcMar>
+          </w:tcPr>
+          <w:p>
+            <w:pPr>
+              <w:spacing w:after="0" w:line="276" w:lineRule="auto"/>
+            </w:pPr>
+            <w:r>
+              <w:rPr>
+                <w:rFonts w:ascii="맑은 고딕" w:hAnsi="맑은 고딕" w:eastAsia="맑은 고딕" w:cs="맑은 고딕"/>
+                <w:b w:val="0"/>
+                <w:sz w:val="17"/>
+              </w:rPr>
+              <w:t xml:space="preserve">모든 수치를 </w:t>
+            </w:r>
+            <w:r>
+              <w:rPr>
+                <w:rFonts w:ascii="맑은 고딕" w:hAnsi="맑은 고딕" w:eastAsia="맑은 고딕" w:cs="맑은 고딕"/>
+                <w:b/>
+                <w:color w:val="161A58"/>
+                <w:sz w:val="17"/>
+              </w:rPr>
+              <w:t>개발 지표(구성 선택용 42문항)</w:t>
+            </w:r>
+            <w:r>
+              <w:rPr>
+                <w:rFonts w:ascii="맑은 고딕" w:hAnsi="맑은 고딕" w:eastAsia="맑은 고딕" w:cs="맑은 고딕"/>
+                <w:b w:val="0"/>
+                <w:sz w:val="17"/>
+              </w:rPr>
+              <w:t xml:space="preserve">로 명시. </w:t>
+            </w:r>
+            <w:r>
+              <w:rPr>
+                <w:rFonts w:ascii="맑은 고딕" w:hAnsi="맑은 고딕" w:eastAsia="맑은 고딕" w:cs="맑은 고딕"/>
+                <w:b/>
+                <w:color w:val="161A58"/>
+                <w:sz w:val="17"/>
+              </w:rPr>
+              <w:t>v2 재측정(2,048, 잘림 0건)</w:t>
+            </w:r>
+            <w:r>
+              <w:rPr>
+                <w:rFonts w:ascii="맑은 고딕" w:hAnsi="맑은 고딕" w:eastAsia="맑은 고딕" w:cs="맑은 고딕"/>
+                <w:b w:val="0"/>
+                <w:sz w:val="17"/>
+              </w:rPr>
+              <w:t xml:space="preserve"> 추가: bge-m3 MRR 0.703 → 0.691, 순위 불변, 채택 구성 Hit@5 0.976·MRR 0.863 동일(하한값)</w:t>
+            </w:r>
+          </w:p>
+        </w:tc>
+      </w:tr>
+      <w:tr>
+        <w:trPr>
+          <w:cantSplit/>
+        </w:trPr>
+        <w:tc>
+          <w:tcPr>
+            <w:tcW w:type="dxa" w:w="1247"/>
+            <w:tcMar>
+              <w:top w:w="70" w:type="dxa"/>
+              <w:left w:w="90" w:type="dxa"/>
+              <w:bottom w:w="70" w:type="dxa"/>
+              <w:right w:w="90" w:type="dxa"/>
+            </w:tcMar>
+          </w:tcPr>
+          <w:p>
+            <w:pPr>
+              <w:spacing w:after="0" w:line="276" w:lineRule="auto"/>
+            </w:pPr>
+            <w:r>
+              <w:rPr>
+                <w:rFonts w:ascii="맑은 고딕" w:hAnsi="맑은 고딕" w:eastAsia="맑은 고딕" w:cs="맑은 고딕"/>
+                <w:b w:val="0"/>
+                <w:sz w:val="17"/>
+              </w:rPr>
+              <w:t>(v1.2) 2.3.1</w:t>
+            </w:r>
+          </w:p>
+        </w:tc>
+        <w:tc>
+          <w:tcPr>
+            <w:tcW w:type="dxa" w:w="3061"/>
+            <w:tcMar>
+              <w:top w:w="70" w:type="dxa"/>
+              <w:left w:w="90" w:type="dxa"/>
+              <w:bottom w:w="70" w:type="dxa"/>
+              <w:right w:w="90" w:type="dxa"/>
+            </w:tcMar>
+          </w:tcPr>
+          <w:p>
+            <w:pPr>
+              <w:spacing w:after="0" w:line="276" w:lineRule="auto"/>
+            </w:pPr>
+            <w:r>
+              <w:rPr>
+                <w:rFonts w:ascii="맑은 고딕" w:hAnsi="맑은 고딕" w:eastAsia="맑은 고딕" w:cs="맑은 고딕"/>
+                <w:b w:val="0"/>
+                <w:sz w:val="17"/>
+              </w:rPr>
+              <w:t>출처 다양성: 도메인·벤더 출처군</w:t>
+            </w:r>
+          </w:p>
+        </w:tc>
+        <w:tc>
+          <w:tcPr>
+            <w:tcW w:type="dxa" w:w="4762"/>
+            <w:tcMar>
+              <w:top w:w="70" w:type="dxa"/>
+              <w:left w:w="90" w:type="dxa"/>
+              <w:bottom w:w="70" w:type="dxa"/>
+              <w:right w:w="90" w:type="dxa"/>
+            </w:tcMar>
+          </w:tcPr>
+          <w:p>
+            <w:pPr>
+              <w:spacing w:after="0" w:line="276" w:lineRule="auto"/>
+            </w:pPr>
+            <w:r>
+              <w:rPr>
+                <w:rFonts w:ascii="D2Coding" w:hAnsi="D2Coding" w:eastAsia="맑은 고딕" w:cs="D2Coding"/>
+                <w:b w:val="0"/>
+                <w:color w:val="5B3FA0"/>
+                <w:sz w:val="16"/>
+              </w:rPr>
+              <w:t>origin_group</w:t>
+            </w:r>
+            <w:r>
+              <w:rPr>
+                <w:rFonts w:ascii="맑은 고딕" w:hAnsi="맑은 고딕" w:eastAsia="맑은 고딕" w:cs="맑은 고딕"/>
+                <w:b w:val="0"/>
+                <w:sz w:val="17"/>
+              </w:rPr>
+              <w:t>(원 출처 계열) 추가. 재인용 기사는 원 출처와 같은 계열, 50%·찬반 할당량은 독립 계열 수 기준</w:t>
+            </w:r>
+          </w:p>
+        </w:tc>
+      </w:tr>
+      <w:tr>
+        <w:trPr>
+          <w:cantSplit/>
+        </w:trPr>
+        <w:tc>
+          <w:tcPr>
+            <w:tcW w:type="dxa" w:w="1247"/>
+            <w:tcMar>
+              <w:top w:w="70" w:type="dxa"/>
+              <w:left w:w="90" w:type="dxa"/>
+              <w:bottom w:w="70" w:type="dxa"/>
+              <w:right w:w="90" w:type="dxa"/>
+            </w:tcMar>
+          </w:tcPr>
+          <w:p>
+            <w:pPr>
+              <w:spacing w:after="0" w:line="276" w:lineRule="auto"/>
+            </w:pPr>
+            <w:r>
+              <w:rPr>
+                <w:rFonts w:ascii="맑은 고딕" w:hAnsi="맑은 고딕" w:eastAsia="맑은 고딕" w:cs="맑은 고딕"/>
+                <w:b w:val="0"/>
+                <w:sz w:val="17"/>
+              </w:rPr>
+              <w:t>(v1.2) 2.3.5</w:t>
+            </w:r>
+          </w:p>
+        </w:tc>
+        <w:tc>
+          <w:tcPr>
+            <w:tcW w:type="dxa" w:w="3061"/>
+            <w:tcMar>
+              <w:top w:w="70" w:type="dxa"/>
+              <w:left w:w="90" w:type="dxa"/>
+              <w:bottom w:w="70" w:type="dxa"/>
+              <w:right w:w="90" w:type="dxa"/>
+            </w:tcMar>
+          </w:tcPr>
+          <w:p>
+            <w:pPr>
+              <w:spacing w:after="0" w:line="276" w:lineRule="auto"/>
+            </w:pPr>
+            <w:r>
+              <w:rPr>
+                <w:rFonts w:ascii="맑은 고딕" w:hAnsi="맑은 고딕" w:eastAsia="맑은 고딕" w:cs="맑은 고딕"/>
+                <w:b w:val="0"/>
+                <w:sz w:val="17"/>
+              </w:rPr>
+              <w:t>임계값 근거 미기재</w:t>
+            </w:r>
+          </w:p>
+        </w:tc>
+        <w:tc>
+          <w:tcPr>
+            <w:tcW w:type="dxa" w:w="4762"/>
+            <w:tcMar>
+              <w:top w:w="70" w:type="dxa"/>
+              <w:left w:w="90" w:type="dxa"/>
+              <w:bottom w:w="70" w:type="dxa"/>
+              <w:right w:w="90" w:type="dxa"/>
+            </w:tcMar>
+          </w:tcPr>
+          <w:p>
+            <w:pPr>
+              <w:spacing w:after="0" w:line="276" w:lineRule="auto"/>
+            </w:pPr>
+            <w:r>
+              <w:rPr>
+                <w:rFonts w:ascii="맑은 고딕" w:hAnsi="맑은 고딕" w:eastAsia="맑은 고딕" w:cs="맑은 고딕"/>
+                <w:b w:val="0"/>
+                <w:sz w:val="17"/>
+              </w:rPr>
+              <w:t>"분석 전 고정한 운영 규칙(heuristic)" 명시, 보고서에 ±0.5 민감도 점검</w:t>
+            </w:r>
+          </w:p>
+        </w:tc>
+      </w:tr>
+      <w:tr>
+        <w:trPr>
+          <w:cantSplit/>
+        </w:trPr>
+        <w:tc>
+          <w:tcPr>
+            <w:tcW w:type="dxa" w:w="1247"/>
+            <w:tcMar>
+              <w:top w:w="70" w:type="dxa"/>
+              <w:left w:w="90" w:type="dxa"/>
+              <w:bottom w:w="70" w:type="dxa"/>
+              <w:right w:w="90" w:type="dxa"/>
+            </w:tcMar>
+          </w:tcPr>
+          <w:p>
+            <w:pPr>
+              <w:spacing w:after="0" w:line="276" w:lineRule="auto"/>
+            </w:pPr>
+            <w:r>
+              <w:rPr>
+                <w:rFonts w:ascii="맑은 고딕" w:hAnsi="맑은 고딕" w:eastAsia="맑은 고딕" w:cs="맑은 고딕"/>
+                <w:b w:val="0"/>
+                <w:sz w:val="17"/>
+              </w:rPr>
+              <w:t>(v1.2) 2.4.1</w:t>
+            </w:r>
+          </w:p>
+        </w:tc>
+        <w:tc>
+          <w:tcPr>
+            <w:tcW w:type="dxa" w:w="3061"/>
+            <w:tcMar>
+              <w:top w:w="70" w:type="dxa"/>
+              <w:left w:w="90" w:type="dxa"/>
+              <w:bottom w:w="70" w:type="dxa"/>
+              <w:right w:w="90" w:type="dxa"/>
+            </w:tcMar>
+          </w:tcPr>
+          <w:p>
+            <w:pPr>
+              <w:spacing w:after="0" w:line="276" w:lineRule="auto"/>
+            </w:pPr>
+            <w:r>
+              <w:rPr>
+                <w:rFonts w:ascii="맑은 고딕" w:hAnsi="맑은 고딕" w:eastAsia="맑은 고딕" w:cs="맑은 고딕"/>
+                <w:b w:val="0"/>
+                <w:sz w:val="17"/>
+              </w:rPr>
+              <w:t>Agent와 Node 구분 없음</w:t>
+            </w:r>
+          </w:p>
+        </w:tc>
+        <w:tc>
+          <w:tcPr>
+            <w:tcW w:type="dxa" w:w="4762"/>
+            <w:tcMar>
+              <w:top w:w="70" w:type="dxa"/>
+              <w:left w:w="90" w:type="dxa"/>
+              <w:bottom w:w="70" w:type="dxa"/>
+              <w:right w:w="90" w:type="dxa"/>
+            </w:tcMar>
+          </w:tcPr>
+          <w:p>
+            <w:pPr>
+              <w:spacing w:after="0" w:line="276" w:lineRule="auto"/>
+            </w:pPr>
+            <w:r>
+              <w:rPr>
+                <w:rFonts w:ascii="맑은 고딕" w:hAnsi="맑은 고딕" w:eastAsia="맑은 고딕" w:cs="맑은 고딕"/>
+                <w:b w:val="0"/>
+                <w:sz w:val="17"/>
+              </w:rPr>
+              <w:t>"Agent = 판단 책임 단위, Node = 실행 단위" 정의(에이전트 7, 노드 18)</w:t>
+            </w:r>
+          </w:p>
+        </w:tc>
+      </w:tr>
+      <w:tr>
+        <w:trPr>
+          <w:cantSplit/>
+        </w:trPr>
+        <w:tc>
+          <w:tcPr>
+            <w:tcW w:type="dxa" w:w="1247"/>
+            <w:tcMar>
+              <w:top w:w="70" w:type="dxa"/>
+              <w:left w:w="90" w:type="dxa"/>
+              <w:bottom w:w="70" w:type="dxa"/>
+              <w:right w:w="90" w:type="dxa"/>
+            </w:tcMar>
+          </w:tcPr>
+          <w:p>
+            <w:pPr>
+              <w:spacing w:after="0" w:line="276" w:lineRule="auto"/>
+            </w:pPr>
+            <w:r>
+              <w:rPr>
+                <w:rFonts w:ascii="맑은 고딕" w:hAnsi="맑은 고딕" w:eastAsia="맑은 고딕" w:cs="맑은 고딕"/>
+                <w:b w:val="0"/>
+                <w:sz w:val="17"/>
+              </w:rPr>
+              <w:t>(v1.2) 그림 2a</w:t>
+            </w:r>
+          </w:p>
+        </w:tc>
+        <w:tc>
+          <w:tcPr>
+            <w:tcW w:type="dxa" w:w="3061"/>
+            <w:tcMar>
+              <w:top w:w="70" w:type="dxa"/>
+              <w:left w:w="90" w:type="dxa"/>
+              <w:bottom w:w="70" w:type="dxa"/>
+              <w:right w:w="90" w:type="dxa"/>
+            </w:tcMar>
+          </w:tcPr>
+          <w:p>
+            <w:pPr>
+              <w:spacing w:after="0" w:line="276" w:lineRule="auto"/>
+            </w:pPr>
+            <w:r>
+              <w:rPr>
+                <w:rFonts w:ascii="맑은 고딕" w:hAnsi="맑은 고딕" w:eastAsia="맑은 고딕" w:cs="맑은 고딕"/>
+                <w:b w:val="0"/>
+                <w:sz w:val="17"/>
+              </w:rPr>
+              <w:t>선정 검증 → 충족? → human_review 분기</w:t>
+            </w:r>
+          </w:p>
+        </w:tc>
+        <w:tc>
+          <w:tcPr>
+            <w:tcW w:type="dxa" w:w="4762"/>
+            <w:tcMar>
+              <w:top w:w="70" w:type="dxa"/>
+              <w:left w:w="90" w:type="dxa"/>
+              <w:bottom w:w="70" w:type="dxa"/>
+              <w:right w:w="90" w:type="dxa"/>
+            </w:tcMar>
+          </w:tcPr>
+          <w:p>
+            <w:pPr>
+              <w:spacing w:after="0" w:line="276" w:lineRule="auto"/>
+            </w:pPr>
+            <w:r>
+              <w:rPr>
+                <w:rFonts w:ascii="맑은 고딕" w:hAnsi="맑은 고딕" w:eastAsia="맑은 고딕" w:cs="맑은 고딕"/>
+                <w:b w:val="0"/>
+                <w:sz w:val="17"/>
+              </w:rPr>
+              <w:t>Human 선정(2안) → initialize → selection_validator(기록) → 공통 RAG</w:t>
             </w:r>
           </w:p>
         </w:tc>

</xml_diff>

<commit_message>
Figure 2: stack stages without overlap, keep titles and edge labels clear
Longer inter-stage edges so dagre stacks the four stage boxes. The local
renderer now moves subgraph titles off edges and nodes, draws them above
edges with a halo, slides colliding edge labels along their edge, and
pushes a cluster edge below an outside node that straddles it. Nodes,
edges and labels are unchanged.
</commit_message>
<xml_diff>
--- a/deliverables/RAG-Design_판교-9반_김정인+김지수+김진수+전진만+정원준.docx
+++ b/deliverables/RAG-Design_판교-9반_김정인+김지수+김진수+전진만+정원준.docx
@@ -23099,7 +23099,7 @@
       <w:r>
         <w:drawing>
           <wp:inline xmlns:a="http://schemas.openxmlformats.org/drawingml/2006/main" xmlns:pic="http://schemas.openxmlformats.org/drawingml/2006/picture">
-            <wp:extent cx="4031999" cy="6497149"/>
+            <wp:extent cx="2592000" cy="7063709"/>
             <wp:docPr id="3" name="Picture 3"/>
             <wp:cNvGraphicFramePr>
               <a:graphicFrameLocks noChangeAspect="1"/>
@@ -23120,7 +23120,7 @@
                   <pic:spPr>
                     <a:xfrm>
                       <a:off x="0" y="0"/>
-                      <a:ext cx="4031999" cy="6497149"/>
+                      <a:ext cx="2592000" cy="7063709"/>
                     </a:xfrm>
                     <a:prstGeom prst="rect"/>
                   </pic:spPr>
@@ -23449,7 +23449,7 @@
                 <w:color w:val="2B2F4A"/>
                 <w:sz w:val="15"/>
               </w:rPr>
-              <w:t xml:space="preserve">        TR --&gt; TRL &amp; MK &amp; SH &amp; DM</w:t>
+              <w:t xml:space="preserve">        TR ---&gt; TRL &amp; MK &amp; SH &amp; DM</w:t>
             </w:r>
           </w:p>
           <w:p>
@@ -23603,7 +23603,7 @@
                 <w:color w:val="2B2F4A"/>
                 <w:sz w:val="15"/>
               </w:rPr>
-              <w:t xml:space="preserve">    GR -.-&gt;|"충족 · 한도 소진"| TR</w:t>
+              <w:t xml:space="preserve">    GR -...-&gt;|"충족 · 한도 소진"| TR</w:t>
             </w:r>
           </w:p>
           <w:p>
@@ -23645,7 +23645,7 @@
                 <w:color w:val="2B2F4A"/>
                 <w:sz w:val="15"/>
               </w:rPr>
-              <w:t xml:space="preserve">    SY --&gt; JD</w:t>
+              <w:t xml:space="preserve">    SY ---&gt; JD</w:t>
             </w:r>
           </w:p>
           <w:p>
@@ -23673,7 +23673,7 @@
                 <w:color w:val="2B2F4A"/>
                 <w:sz w:val="15"/>
               </w:rPr>
-              <w:t xml:space="preserve">    RR -.-&gt;|"모두 통과 · 한도 소진"| RWR</w:t>
+              <w:t xml:space="preserve">    RR -..-&gt;|"모두 통과 · 한도 소진"| RWR</w:t>
             </w:r>
           </w:p>
           <w:p>

</xml_diff>

<commit_message>
Design B.6: source the min(SW, HW) values per measurement condition
Table B.6-1 shows SW/HW MRR for the implementation condition only, so
the 0.659 in the text had no visible source. Add the evaluation-condition
values under the table (filled from outputs/eval/embedding_eval.csv) and
name the condition of each bge-m3 value in the text.
</commit_message>
<xml_diff>
--- a/deliverables/RAG-Design_판교-9반_김정인+김지수+김진수+전진만+정원준.docx
+++ b/deliverables/RAG-Design_판교-9반_김정인+김지수+김진수+전진만+정원준.docx
@@ -8337,6 +8337,19 @@
     </w:p>
     <w:p>
       <w:pPr>
+        <w:spacing w:after="80" w:line="324" w:lineRule="auto"/>
+      </w:pPr>
+      <w:r>
+        <w:rPr>
+          <w:rFonts w:ascii="맑은 고딕" w:hAnsi="맑은 고딕" w:eastAsia="맑은 고딕" w:cs="맑은 고딕"/>
+          <w:b w:val="0"/>
+          <w:sz w:val="20"/>
+        </w:rPr>
+        <w:t>SW / HW MRR은 구현 조건 값이고, 평가 조건에서는 bge-m3 0.748 / 0.659, Qwen3 0.770 / 0.493이다(outputs/eval/embedding_eval.csv).</w:t>
+      </w:r>
+    </w:p>
+    <w:p>
+      <w:pPr>
         <w:keepNext/>
         <w:spacing w:after="80" w:line="324" w:lineRule="auto"/>
       </w:pPr>
@@ -9844,7 +9857,7 @@
       <w:r>
         <w:drawing>
           <wp:inline xmlns:a="http://schemas.openxmlformats.org/drawingml/2006/main" xmlns:pic="http://schemas.openxmlformats.org/drawingml/2006/picture">
-            <wp:extent cx="5688000" cy="2085600"/>
+            <wp:extent cx="5400000" cy="1980000"/>
             <wp:docPr id="2" name="Picture 2"/>
             <wp:cNvGraphicFramePr>
               <a:graphicFrameLocks noChangeAspect="1"/>
@@ -9865,7 +9878,7 @@
                   <pic:spPr>
                     <a:xfrm>
                       <a:off x="0" y="0"/>
-                      <a:ext cx="5688000" cy="2085600"/>
+                      <a:ext cx="5400000" cy="1980000"/>
                     </a:xfrm>
                     <a:prstGeom prst="rect"/>
                   </pic:spPr>
@@ -9901,7 +9914,7 @@
           <w:b w:val="0"/>
           <w:sz w:val="20"/>
         </w:rPr>
-        <w:t>두 진영 문서를 같은 비중으로 찾아야 하는 과제라서, 약한 쪽의 성능을 보는 min(SW, HW) 기준을 먼저 확인했다. Qwen3는 SW 질문 MRR(0.770)이 bge-m3(0.748)보다 조금 높았지만 HW 질문에서 0.493으로 떨어져, 이 기준에서 bge-m3(0.635~0.659)보다 낮았다. 진영 간 균형 조건을 충족하지 못한 것이다. 이어서 전체 지표를 비교한 결과, 두 측정 조건 모두에서 bge-m3의 Hit@1, Hit@5, MRR이 가장 높아 이 기준을 충족한다는 점을 다시 확인했다. 설계 초안에서는 Qwen3를 가정했지만 이 결과에 따라 bge-m3로 바꿨다.</w:t>
+        <w:t>두 진영 문서를 같은 비중으로 찾아야 하는 과제라서, 약한 쪽의 성능을 보는 min(SW, HW) 기준을 먼저 확인했다. Qwen3는 SW 질문 MRR(0.770)이 bge-m3(0.748)보다 조금 높았지만 HW 질문에서 0.493으로 떨어져(두 조건 같음), 이 기준에서 bge-m3(평가 0.659, 구현 0.635)보다 낮았다. 진영 간 균형 조건을 충족하지 못한 것이다. 이어서 전체 지표를 비교한 결과, 두 측정 조건 모두에서 bge-m3의 Hit@1, Hit@5, MRR이 가장 높아 이 기준을 충족한다는 점을 다시 확인했다. 설계 초안에서는 Qwen3를 가정했지만 이 결과에 따라 bge-m3로 바꿨다.</w:t>
       </w:r>
     </w:p>
     <w:p>

</xml_diff>

<commit_message>
docs(design): 측정 조건별 min(SW,HW) 출처 명시
</commit_message>
<xml_diff>
--- a/deliverables/RAG-Design_판교-9반_김정인+김지수+김진수+전진만+정원준.docx
+++ b/deliverables/RAG-Design_판교-9반_김정인+김지수+김진수+전진만+정원준.docx
@@ -8337,6 +8337,19 @@
     </w:p>
     <w:p>
       <w:pPr>
+        <w:spacing w:after="80" w:line="324" w:lineRule="auto"/>
+      </w:pPr>
+      <w:r>
+        <w:rPr>
+          <w:rFonts w:ascii="맑은 고딕" w:hAnsi="맑은 고딕" w:eastAsia="맑은 고딕" w:cs="맑은 고딕"/>
+          <w:b w:val="0"/>
+          <w:sz w:val="20"/>
+        </w:rPr>
+        <w:t>SW / HW MRR은 구현 조건 값이고, 평가 조건에서는 bge-m3 0.748 / 0.659, Qwen3 0.770 / 0.493이다(outputs/eval/embedding_eval.csv).</w:t>
+      </w:r>
+    </w:p>
+    <w:p>
+      <w:pPr>
         <w:keepNext/>
         <w:spacing w:after="80" w:line="324" w:lineRule="auto"/>
       </w:pPr>
@@ -9844,7 +9857,7 @@
       <w:r>
         <w:drawing>
           <wp:inline xmlns:a="http://schemas.openxmlformats.org/drawingml/2006/main" xmlns:pic="http://schemas.openxmlformats.org/drawingml/2006/picture">
-            <wp:extent cx="5688000" cy="2085600"/>
+            <wp:extent cx="5400000" cy="1980000"/>
             <wp:docPr id="2" name="Picture 2"/>
             <wp:cNvGraphicFramePr>
               <a:graphicFrameLocks noChangeAspect="1"/>
@@ -9865,7 +9878,7 @@
                   <pic:spPr>
                     <a:xfrm>
                       <a:off x="0" y="0"/>
-                      <a:ext cx="5688000" cy="2085600"/>
+                      <a:ext cx="5400000" cy="1980000"/>
                     </a:xfrm>
                     <a:prstGeom prst="rect"/>
                   </pic:spPr>
@@ -9901,7 +9914,7 @@
           <w:b w:val="0"/>
           <w:sz w:val="20"/>
         </w:rPr>
-        <w:t>두 진영 문서를 같은 비중으로 찾아야 하는 과제라서, 약한 쪽의 성능을 보는 min(SW, HW) 기준을 먼저 확인했다. Qwen3는 SW 질문 MRR(0.770)이 bge-m3(0.748)보다 조금 높았지만 HW 질문에서 0.493으로 떨어져, 이 기준에서 bge-m3(0.635~0.659)보다 낮았다. 진영 간 균형 조건을 충족하지 못한 것이다. 이어서 전체 지표를 비교한 결과, 두 측정 조건 모두에서 bge-m3의 Hit@1, Hit@5, MRR이 가장 높아 이 기준을 충족한다는 점을 다시 확인했다. 설계 초안에서는 Qwen3를 가정했지만 이 결과에 따라 bge-m3로 바꿨다.</w:t>
+        <w:t>두 진영 문서를 같은 비중으로 찾아야 하는 과제라서, 약한 쪽의 성능을 보는 min(SW, HW) 기준을 먼저 확인했다. Qwen3는 SW 질문 MRR(0.770)이 bge-m3(0.748)보다 조금 높았지만 HW 질문에서 0.493으로 떨어져(두 조건 같음), 이 기준에서 bge-m3(평가 0.659, 구현 0.635)보다 낮았다. 진영 간 균형 조건을 충족하지 못한 것이다. 이어서 전체 지표를 비교한 결과, 두 측정 조건 모두에서 bge-m3의 Hit@1, Hit@5, MRR이 가장 높아 이 기준을 충족한다는 점을 다시 확인했다. 설계 초안에서는 Qwen3를 가정했지만 이 결과에 따라 bge-m3로 바꿨다.</w:t>
       </w:r>
     </w:p>
     <w:p>

</xml_diff>